<commit_message>
Bruce: Overhaul of reporting logic and professional document styling
</commit_message>
<xml_diff>
--- a/dashboard/static/audit-reports/report_Benowa_ELC_2026-05-09.docx
+++ b/dashboard/static/audit-reports/report_Benowa_ELC_2026-05-09.docx
@@ -9,78 +9,30 @@
       </w:pPr>
       <w:r>
         <w:rPr>
-          <w:color w:val="D32F2F"/>
+          <w:rFonts w:ascii="Arial" w:hAnsi="Arial"/>
+          <w:color w:val="000000"/>
+          <w:sz w:val="48"/>
         </w:rPr>
-        <w:t>Benowa ELC</w:t>
+        <w:t>ASGARDIAN AUDIT REPORT: Benowa ELC</w:t>
       </w:r>
     </w:p>
     <w:p>
       <w:r>
-        <w:t>Assessment Date: 2026-05-09</w:t>
-      </w:r>
-    </w:p>
-    <w:p/>
-    <w:p>
-      <w:pPr>
-        <w:pStyle w:val="Heading1"/>
-      </w:pPr>
-      <w:r>
-        <w:rPr>
-          <w:color w:val="333333"/>
-        </w:rPr>
-        <w:t>Executive Summary</w:t>
+        <w:t>Audit Summary Generated on 09 May 2026</w:t>
       </w:r>
     </w:p>
     <w:p>
       <w:pPr>
-        <w:pStyle w:val="ListBullet"/>
-      </w:pPr>
-      <w:r>
-        <w:t>2 active devices currently recorded in use.</w:t>
-      </w:r>
-    </w:p>
-    <w:p>
-      <w:pPr>
-        <w:pStyle w:val="ListBullet"/>
-      </w:pPr>
-      <w:r>
-        <w:t>0 devices currently marked missing and escalated for investigation.</w:t>
-      </w:r>
-    </w:p>
-    <w:p/>
-    <w:p>
-      <w:pPr>
         <w:pStyle w:val="Heading1"/>
       </w:pPr>
       <w:r>
         <w:rPr>
-          <w:color w:val="333333"/>
+          <w:rFonts w:ascii="Arial" w:hAnsi="Arial"/>
+          <w:b/>
+          <w:color w:val="1F497D"/>
+          <w:sz w:val="32"/>
         </w:rPr>
-        <w:t>Critical Incidents &amp; Immediate Actions</w:t>
-      </w:r>
-    </w:p>
-    <w:p/>
-    <w:p>
-      <w:pPr>
-        <w:pStyle w:val="Heading1"/>
-      </w:pPr>
-      <w:r>
-        <w:rPr>
-          <w:color w:val="333333"/>
-        </w:rPr>
-        <w:t>Detailed Findings by Room / User</w:t>
-      </w:r>
-    </w:p>
-    <w:p>
-      <w:pPr>
-        <w:pStyle w:val="Heading2"/>
-      </w:pPr>
-      <w:r>
-        <w:rPr>
-          <w:color w:val="D32F2F"/>
-          <w:sz w:val="24"/>
-        </w:rPr>
-        <w:t>Babies One</w:t>
+        <w:t>SITE OVERVIEW</w:t>
       </w:r>
     </w:p>
     <w:p>
@@ -92,10 +44,10 @@
         <w:rPr>
           <w:b/>
         </w:rPr>
-        <w:t>Device:</w:t>
-      </w:r>
-      <w:r>
-        <w:t xml:space="preserve"> Apple 9th Gen MK2L3X/A (SN: KYHY9609DG)</w:t>
+        <w:t>Total Fleet Count:</w:t>
+      </w:r>
+      <w:r>
+        <w:t xml:space="preserve"> 41 identified assets.</w:t>
       </w:r>
     </w:p>
     <w:p>
@@ -107,10 +59,46 @@
         <w:rPr>
           <w:b/>
         </w:rPr>
-        <w:t>OS/Version:</w:t>
-      </w:r>
-      <w:r>
-        <w:t xml:space="preserve"> iOS N/A</w:t>
+        <w:t>Audit Status:</w:t>
+      </w:r>
+      <w:r>
+        <w:t xml:space="preserve"> Comprehensive review of all known hardware.</w:t>
+      </w:r>
+    </w:p>
+    <w:p>
+      <w:pPr>
+        <w:pStyle w:val="Heading1"/>
+      </w:pPr>
+      <w:r>
+        <w:rPr>
+          <w:rFonts w:ascii="Arial" w:hAnsi="Arial"/>
+          <w:b/>
+          <w:color w:val="1F497D"/>
+          <w:sz w:val="32"/>
+        </w:rPr>
+        <w:t>COMPLIANCE LOG BY LOCATION</w:t>
+      </w:r>
+    </w:p>
+    <w:p>
+      <w:pPr>
+        <w:pStyle w:val="Heading2"/>
+      </w:pPr>
+      <w:r>
+        <w:rPr>
+          <w:rFonts w:ascii="Arial" w:hAnsi="Arial"/>
+          <w:color w:val="000000"/>
+          <w:sz w:val="28"/>
+        </w:rPr>
+        <w:t>Room: None</w:t>
+      </w:r>
+    </w:p>
+    <w:p>
+      <w:r>
+        <w:rPr>
+          <w:b/>
+          <w:sz w:val="22"/>
+        </w:rPr>
+        <w:t>**Asset:** HP (SN: `1`) | **Last Seen:** 2026-05-04</w:t>
       </w:r>
     </w:p>
     <w:p>
@@ -122,10 +110,10 @@
         <w:rPr>
           <w:b/>
         </w:rPr>
-        <w:t>Photos:</w:t>
-      </w:r>
-      <w:r>
-        <w:t xml:space="preserve"> 0 (Total: 0) | Date: N/A</w:t>
+        <w:t>Operating System:</w:t>
+      </w:r>
+      <w:r>
+        <w:t xml:space="preserve"> Windows 11</w:t>
       </w:r>
     </w:p>
     <w:p>
@@ -137,10 +125,10 @@
         <w:rPr>
           <w:b/>
         </w:rPr>
-        <w:t>Sync:</w:t>
-      </w:r>
-      <w:r>
-        <w:t xml:space="preserve"> Camera Sync Off: No | OneDrive Sync On: Yes</w:t>
+        <w:t>Security Patching:</w:t>
+      </w:r>
+      <w:r>
+        <w:t xml:space="preserve"> yes</w:t>
       </w:r>
     </w:p>
     <w:p>
@@ -152,22 +140,10 @@
         <w:rPr>
           <w:b/>
         </w:rPr>
-        <w:t>Status/Notes:</w:t>
-      </w:r>
-      <w:r>
-        <w:t xml:space="preserve"> test</w:t>
-      </w:r>
-    </w:p>
-    <w:p>
-      <w:pPr>
-        <w:pStyle w:val="Heading2"/>
-      </w:pPr>
-      <w:r>
-        <w:rPr>
-          <w:color w:val="D32F2F"/>
-          <w:sz w:val="24"/>
-        </w:rPr>
-        <w:t>Melissa</w:t>
+        <w:t>Antivirus/Defender:</w:t>
+      </w:r>
+      <w:r>
+        <w:t xml:space="preserve"> yes</w:t>
       </w:r>
     </w:p>
     <w:p>
@@ -179,10 +155,32 @@
         <w:rPr>
           <w:b/>
         </w:rPr>
-        <w:t>Device:</w:t>
-      </w:r>
-      <w:r>
-        <w:t xml:space="preserve"> HP 15s-eq2xxx (SN: 5CD2170QH1Y)</w:t>
+        <w:t>Engineer Notes:</w:t>
+      </w:r>
+      <w:r>
+        <w:t xml:space="preserve"> notes of issues</w:t>
+      </w:r>
+    </w:p>
+    <w:p>
+      <w:pPr>
+        <w:pStyle w:val="Heading2"/>
+      </w:pPr>
+      <w:r>
+        <w:rPr>
+          <w:rFonts w:ascii="Arial" w:hAnsi="Arial"/>
+          <w:color w:val="000000"/>
+          <w:sz w:val="28"/>
+        </w:rPr>
+        <w:t>Room: BELC Gym Music</w:t>
+      </w:r>
+    </w:p>
+    <w:p>
+      <w:r>
+        <w:rPr>
+          <w:b/>
+          <w:sz w:val="22"/>
+        </w:rPr>
+        <w:t>**Asset:** Apple A16 (SN: `F69YR6WW0L`) | **Last Seen:** 2026-05-04</w:t>
       </w:r>
     </w:p>
     <w:p>
@@ -194,10 +192,10 @@
         <w:rPr>
           <w:b/>
         </w:rPr>
-        <w:t>OS:</w:t>
-      </w:r>
-      <w:r>
-        <w:t xml:space="preserve"> Windows N/A</w:t>
+        <w:t>Operating System:</w:t>
+      </w:r>
+      <w:r>
+        <w:t xml:space="preserve"> iOS Latest</w:t>
       </w:r>
     </w:p>
     <w:p>
@@ -209,10 +207,10 @@
         <w:rPr>
           <w:b/>
         </w:rPr>
-        <w:t>Updates:</w:t>
-      </w:r>
-      <w:r>
-        <w:t xml:space="preserve"> N/A</w:t>
+        <w:t>Photos/Media:</w:t>
+      </w:r>
+      <w:r>
+        <w:t xml:space="preserve"> 0 files found.</w:t>
       </w:r>
     </w:p>
     <w:p>
@@ -224,10 +222,10 @@
         <w:rPr>
           <w:b/>
         </w:rPr>
-        <w:t>Compliance:</w:t>
-      </w:r>
-      <w:r>
-        <w:t xml:space="preserve"> OneDrive Status: N/A | Security Check: N/A</w:t>
+        <w:t>Cloud Sync:</w:t>
+      </w:r>
+      <w:r>
+        <w:t xml:space="preserve"> Camera Uploads: OFF | OneDrive: ON</w:t>
       </w:r>
     </w:p>
     <w:p>
@@ -239,27 +237,3213 @@
         <w:rPr>
           <w:b/>
         </w:rPr>
-        <w:t>Status/Notes:</w:t>
+        <w:t>Engineer Notes:</w:t>
+      </w:r>
+      <w:r>
+        <w:t xml:space="preserve"> REQUIRED ACTION: Locate / verify</w:t>
+      </w:r>
+    </w:p>
+    <w:p>
+      <w:pPr>
+        <w:pStyle w:val="Heading2"/>
+      </w:pPr>
+      <w:r>
+        <w:rPr>
+          <w:rFonts w:ascii="Arial" w:hAnsi="Arial"/>
+          <w:color w:val="000000"/>
+          <w:sz w:val="28"/>
+        </w:rPr>
+        <w:t>Room: BELC-Admin-Main</w:t>
+      </w:r>
+    </w:p>
+    <w:p>
+      <w:r>
+        <w:rPr>
+          <w:b/>
+          <w:sz w:val="22"/>
+        </w:rPr>
+        <w:t>**Asset:** HP Prodesk 500 G4 SFF (SN: `2VG42AV`) | **Last Seen:** 2026-05-04</w:t>
+      </w:r>
+    </w:p>
+    <w:p>
+      <w:pPr>
+        <w:pStyle w:val="ListBullet"/>
+      </w:pPr>
+      <w:r/>
+      <w:r>
+        <w:rPr>
+          <w:b/>
+        </w:rPr>
+        <w:t>Operating System:</w:t>
+      </w:r>
+      <w:r>
+        <w:t xml:space="preserve"> Windows 10/11</w:t>
+      </w:r>
+    </w:p>
+    <w:p>
+      <w:pPr>
+        <w:pStyle w:val="ListBullet"/>
+      </w:pPr>
+      <w:r/>
+      <w:r>
+        <w:rPr>
+          <w:b/>
+        </w:rPr>
+        <w:t>Security Patching:</w:t>
+      </w:r>
+      <w:r>
+        <w:t xml:space="preserve"> Current</w:t>
+      </w:r>
+    </w:p>
+    <w:p>
+      <w:pPr>
+        <w:pStyle w:val="ListBullet"/>
+      </w:pPr>
+      <w:r/>
+      <w:r>
+        <w:rPr>
+          <w:b/>
+        </w:rPr>
+        <w:t>Antivirus/Defender:</w:t>
+      </w:r>
+      <w:r>
+        <w:t xml:space="preserve"> Passed</w:t>
+      </w:r>
+    </w:p>
+    <w:p>
+      <w:pPr>
+        <w:pStyle w:val="ListBullet"/>
+      </w:pPr>
+      <w:r/>
+      <w:r>
+        <w:rPr>
+          <w:b/>
+        </w:rPr>
+        <w:t>Engineer Notes:</w:t>
+      </w:r>
+      <w:r>
+        <w:t xml:space="preserve"> Admin Master</w:t>
+      </w:r>
+    </w:p>
+    <w:p>
+      <w:pPr>
+        <w:pStyle w:val="Heading2"/>
+      </w:pPr>
+      <w:r>
+        <w:rPr>
+          <w:rFonts w:ascii="Arial" w:hAnsi="Arial"/>
+          <w:color w:val="000000"/>
+          <w:sz w:val="28"/>
+        </w:rPr>
+        <w:t>Room: BELC-Admin-Second</w:t>
+      </w:r>
+    </w:p>
+    <w:p>
+      <w:r>
+        <w:rPr>
+          <w:b/>
+          <w:sz w:val="22"/>
+        </w:rPr>
+        <w:t>**Asset:** Generic  I5 (SN: `nil`) | **Last Seen:** 2026-05-04</w:t>
+      </w:r>
+    </w:p>
+    <w:p>
+      <w:pPr>
+        <w:pStyle w:val="ListBullet"/>
+      </w:pPr>
+      <w:r/>
+      <w:r>
+        <w:rPr>
+          <w:b/>
+        </w:rPr>
+        <w:t>Operating System:</w:t>
+      </w:r>
+      <w:r>
+        <w:t xml:space="preserve"> Windows N/A</w:t>
+      </w:r>
+    </w:p>
+    <w:p>
+      <w:pPr>
+        <w:pStyle w:val="ListBullet"/>
+      </w:pPr>
+      <w:r/>
+      <w:r>
+        <w:rPr>
+          <w:b/>
+        </w:rPr>
+        <w:t>Security Patching:</w:t>
+      </w:r>
+      <w:r>
+        <w:t xml:space="preserve"> Current</w:t>
+      </w:r>
+    </w:p>
+    <w:p>
+      <w:pPr>
+        <w:pStyle w:val="ListBullet"/>
+      </w:pPr>
+      <w:r/>
+      <w:r>
+        <w:rPr>
+          <w:b/>
+        </w:rPr>
+        <w:t>Antivirus/Defender:</w:t>
+      </w:r>
+      <w:r>
+        <w:t xml:space="preserve"> Active</w:t>
+      </w:r>
+    </w:p>
+    <w:p>
+      <w:pPr>
+        <w:pStyle w:val="ListBullet"/>
+      </w:pPr>
+      <w:r/>
+      <w:r>
+        <w:rPr>
+          <w:b/>
+        </w:rPr>
+        <w:t>Engineer Notes:</w:t>
+      </w:r>
+      <w:r>
+        <w:t xml:space="preserve"> Bulk Import</w:t>
+      </w:r>
+    </w:p>
+    <w:p>
+      <w:pPr>
+        <w:pStyle w:val="Heading2"/>
+      </w:pPr>
+      <w:r>
+        <w:rPr>
+          <w:rFonts w:ascii="Arial" w:hAnsi="Arial"/>
+          <w:color w:val="000000"/>
+          <w:sz w:val="28"/>
+        </w:rPr>
+        <w:t>Room: Babies One</w:t>
+      </w:r>
+    </w:p>
+    <w:p>
+      <w:r>
+        <w:rPr>
+          <w:b/>
+          <w:sz w:val="22"/>
+        </w:rPr>
+        <w:t>**Asset:** Apple 9th Gen MK2L3X/A (SN: `KYHY9609DG`) | **Last Seen:** 2026-05-09</w:t>
+      </w:r>
+    </w:p>
+    <w:p>
+      <w:pPr>
+        <w:pStyle w:val="ListBullet"/>
+      </w:pPr>
+      <w:r/>
+      <w:r>
+        <w:rPr>
+          <w:b/>
+        </w:rPr>
+        <w:t>Operating System:</w:t>
+      </w:r>
+      <w:r>
+        <w:t xml:space="preserve"> iOS Latest</w:t>
+      </w:r>
+    </w:p>
+    <w:p>
+      <w:pPr>
+        <w:pStyle w:val="ListBullet"/>
+      </w:pPr>
+      <w:r/>
+      <w:r>
+        <w:rPr>
+          <w:b/>
+        </w:rPr>
+        <w:t>Photos/Media:</w:t>
+      </w:r>
+      <w:r>
+        <w:t xml:space="preserve"> 0 files found.</w:t>
+      </w:r>
+    </w:p>
+    <w:p>
+      <w:pPr>
+        <w:pStyle w:val="ListBullet"/>
+      </w:pPr>
+      <w:r/>
+      <w:r>
+        <w:rPr>
+          <w:b/>
+        </w:rPr>
+        <w:t>Cloud Sync:</w:t>
+      </w:r>
+      <w:r>
+        <w:t xml:space="preserve"> Camera Uploads: ON | OneDrive: ON</w:t>
+      </w:r>
+    </w:p>
+    <w:p>
+      <w:pPr>
+        <w:pStyle w:val="ListBullet"/>
+      </w:pPr>
+      <w:r/>
+      <w:r>
+        <w:rPr>
+          <w:b/>
+        </w:rPr>
+        <w:t>Engineer Notes:</w:t>
       </w:r>
       <w:r>
         <w:t xml:space="preserve"> test</w:t>
       </w:r>
     </w:p>
-    <w:p/>
     <w:p>
       <w:pPr>
-        <w:pStyle w:val="Heading1"/>
+        <w:pStyle w:val="Heading2"/>
       </w:pPr>
       <w:r>
         <w:rPr>
-          <w:color w:val="333333"/>
+          <w:rFonts w:ascii="Arial" w:hAnsi="Arial"/>
+          <w:color w:val="000000"/>
+          <w:sz w:val="28"/>
         </w:rPr>
-        <w:t>Missing Assets Register</w:t>
+        <w:t>Room: Babies One</w:t>
+      </w:r>
+    </w:p>
+    <w:p>
+      <w:r>
+        <w:rPr>
+          <w:b/>
+          <w:sz w:val="22"/>
+        </w:rPr>
+        <w:t>**Asset:** Hp 15S-fq3xxx (SN: `4Z207PA#ABG`) | **Last Seen:** 2026-05-04</w:t>
+      </w:r>
+    </w:p>
+    <w:p>
+      <w:pPr>
+        <w:pStyle w:val="ListBullet"/>
+      </w:pPr>
+      <w:r/>
+      <w:r>
+        <w:rPr>
+          <w:b/>
+        </w:rPr>
+        <w:t>Operating System:</w:t>
+      </w:r>
+      <w:r>
+        <w:t xml:space="preserve"> Windows 11</w:t>
+      </w:r>
+    </w:p>
+    <w:p>
+      <w:pPr>
+        <w:pStyle w:val="ListBullet"/>
+      </w:pPr>
+      <w:r/>
+      <w:r>
+        <w:rPr>
+          <w:b/>
+        </w:rPr>
+        <w:t>Security Patching:</w:t>
+      </w:r>
+      <w:r>
+        <w:t xml:space="preserve"> Current</w:t>
+      </w:r>
+    </w:p>
+    <w:p>
+      <w:pPr>
+        <w:pStyle w:val="ListBullet"/>
+      </w:pPr>
+      <w:r/>
+      <w:r>
+        <w:rPr>
+          <w:b/>
+        </w:rPr>
+        <w:t>Antivirus/Defender:</w:t>
+      </w:r>
+      <w:r>
+        <w:t xml:space="preserve"> Passed</w:t>
+      </w:r>
+    </w:p>
+    <w:p>
+      <w:pPr>
+        <w:pStyle w:val="ListBullet"/>
+      </w:pPr>
+      <w:r/>
+      <w:r>
+        <w:rPr>
+          <w:b/>
+        </w:rPr>
+        <w:t>Engineer Notes:</w:t>
+      </w:r>
+      <w:r>
+        <w:t xml:space="preserve"> Active - Validated</w:t>
+      </w:r>
+    </w:p>
+    <w:p>
+      <w:pPr>
+        <w:pStyle w:val="Heading2"/>
+      </w:pPr>
+      <w:r>
+        <w:rPr>
+          <w:rFonts w:ascii="Arial" w:hAnsi="Arial"/>
+          <w:color w:val="000000"/>
+          <w:sz w:val="28"/>
+        </w:rPr>
+        <w:t>Room: Babies One</w:t>
+      </w:r>
+    </w:p>
+    <w:p>
+      <w:r>
+        <w:rPr>
+          <w:b/>
+          <w:sz w:val="22"/>
+        </w:rPr>
+        <w:t>**Asset:** Samsung  Galaxy Tab A SM-T510 (SN: `R52N61NC5ET`) | **Last Seen:** 2026-05-04</w:t>
+      </w:r>
+    </w:p>
+    <w:p>
+      <w:pPr>
+        <w:pStyle w:val="ListBullet"/>
+      </w:pPr>
+      <w:r/>
+      <w:r>
+        <w:rPr>
+          <w:b/>
+        </w:rPr>
+        <w:t>Operating System:</w:t>
+      </w:r>
+      <w:r>
+        <w:t xml:space="preserve"> iOS Latest</w:t>
+      </w:r>
+    </w:p>
+    <w:p>
+      <w:pPr>
+        <w:pStyle w:val="ListBullet"/>
+      </w:pPr>
+      <w:r/>
+      <w:r>
+        <w:rPr>
+          <w:b/>
+        </w:rPr>
+        <w:t>Photos/Media:</w:t>
+      </w:r>
+      <w:r>
+        <w:t xml:space="preserve"> 0 files found.</w:t>
+      </w:r>
+    </w:p>
+    <w:p>
+      <w:pPr>
+        <w:pStyle w:val="ListBullet"/>
+      </w:pPr>
+      <w:r/>
+      <w:r>
+        <w:rPr>
+          <w:b/>
+        </w:rPr>
+        <w:t>Cloud Sync:</w:t>
+      </w:r>
+      <w:r>
+        <w:t xml:space="preserve"> Camera Uploads: OFF | OneDrive: ON</w:t>
+      </w:r>
+    </w:p>
+    <w:p>
+      <w:pPr>
+        <w:pStyle w:val="ListBullet"/>
+      </w:pPr>
+      <w:r/>
+      <w:r>
+        <w:rPr>
+          <w:b/>
+        </w:rPr>
+        <w:t>Engineer Notes:</w:t>
+      </w:r>
+      <w:r>
+        <w:t xml:space="preserve"> Active</w:t>
+      </w:r>
+    </w:p>
+    <w:p>
+      <w:pPr>
+        <w:pStyle w:val="Heading2"/>
+      </w:pPr>
+      <w:r>
+        <w:rPr>
+          <w:rFonts w:ascii="Arial" w:hAnsi="Arial"/>
+          <w:color w:val="000000"/>
+          <w:sz w:val="28"/>
+        </w:rPr>
+        <w:t>Room: Babies Two</w:t>
+      </w:r>
+    </w:p>
+    <w:p>
+      <w:r>
+        <w:rPr>
+          <w:b/>
+          <w:sz w:val="22"/>
+        </w:rPr>
+        <w:t>**Asset:** Acer Aspire AL15-51M (SN: `NXKS5SA003343022C10X15`) | **Last Seen:** 2026-05-04</w:t>
+      </w:r>
+    </w:p>
+    <w:p>
+      <w:pPr>
+        <w:pStyle w:val="ListBullet"/>
+      </w:pPr>
+      <w:r/>
+      <w:r>
+        <w:rPr>
+          <w:b/>
+        </w:rPr>
+        <w:t>Operating System:</w:t>
+      </w:r>
+      <w:r>
+        <w:t xml:space="preserve"> Windows 11</w:t>
+      </w:r>
+    </w:p>
+    <w:p>
+      <w:pPr>
+        <w:pStyle w:val="ListBullet"/>
+      </w:pPr>
+      <w:r/>
+      <w:r>
+        <w:rPr>
+          <w:b/>
+        </w:rPr>
+        <w:t>Security Patching:</w:t>
+      </w:r>
+      <w:r>
+        <w:t xml:space="preserve"> Current</w:t>
+      </w:r>
+    </w:p>
+    <w:p>
+      <w:pPr>
+        <w:pStyle w:val="ListBullet"/>
+      </w:pPr>
+      <w:r/>
+      <w:r>
+        <w:rPr>
+          <w:b/>
+        </w:rPr>
+        <w:t>Antivirus/Defender:</w:t>
+      </w:r>
+      <w:r>
+        <w:t xml:space="preserve"> Passed</w:t>
+      </w:r>
+    </w:p>
+    <w:p>
+      <w:pPr>
+        <w:pStyle w:val="ListBullet"/>
+      </w:pPr>
+      <w:r/>
+      <w:r>
+        <w:rPr>
+          <w:b/>
+        </w:rPr>
+        <w:t>Engineer Notes:</w:t>
+      </w:r>
+      <w:r>
+        <w:t xml:space="preserve"> Active - Validated</w:t>
+      </w:r>
+    </w:p>
+    <w:p>
+      <w:pPr>
+        <w:pStyle w:val="Heading2"/>
+      </w:pPr>
+      <w:r>
+        <w:rPr>
+          <w:rFonts w:ascii="Arial" w:hAnsi="Arial"/>
+          <w:color w:val="000000"/>
+          <w:sz w:val="28"/>
+        </w:rPr>
+        <w:t>Room: Babies Two</w:t>
+      </w:r>
+    </w:p>
+    <w:p>
+      <w:r>
+        <w:rPr>
+          <w:b/>
+          <w:sz w:val="22"/>
+        </w:rPr>
+        <w:t>**Asset:** Apple 9th Gen MK2K3X/A (SN: `XR7R42YN3H`) | **Last Seen:** 2026-05-04</w:t>
+      </w:r>
+    </w:p>
+    <w:p>
+      <w:pPr>
+        <w:pStyle w:val="ListBullet"/>
+      </w:pPr>
+      <w:r/>
+      <w:r>
+        <w:rPr>
+          <w:b/>
+        </w:rPr>
+        <w:t>Operating System:</w:t>
+      </w:r>
+      <w:r>
+        <w:t xml:space="preserve"> iOS yes</w:t>
+      </w:r>
+    </w:p>
+    <w:p>
+      <w:pPr>
+        <w:pStyle w:val="ListBullet"/>
+      </w:pPr>
+      <w:r/>
+      <w:r>
+        <w:rPr>
+          <w:b/>
+        </w:rPr>
+        <w:t>Photos/Media:</w:t>
+      </w:r>
+      <w:r>
+        <w:t xml:space="preserve"> 1394 files found.</w:t>
+      </w:r>
+    </w:p>
+    <w:p>
+      <w:pPr>
+        <w:pStyle w:val="ListBullet"/>
+      </w:pPr>
+      <w:r/>
+      <w:r>
+        <w:rPr>
+          <w:b/>
+        </w:rPr>
+        <w:t>Cloud Sync:</w:t>
+      </w:r>
+      <w:r>
+        <w:t xml:space="preserve"> Camera Uploads: OFF | OneDrive: ON</w:t>
+      </w:r>
+    </w:p>
+    <w:p>
+      <w:pPr>
+        <w:pStyle w:val="ListBullet"/>
+      </w:pPr>
+      <w:r/>
+      <w:r>
+        <w:rPr>
+          <w:b/>
+        </w:rPr>
+        <w:t>Engineer Notes:</w:t>
+      </w:r>
+      <w:r>
+        <w:t xml:space="preserve"> Active / photo reduction required</w:t>
+      </w:r>
+    </w:p>
+    <w:p>
+      <w:pPr>
+        <w:pStyle w:val="Heading2"/>
+      </w:pPr>
+      <w:r>
+        <w:rPr>
+          <w:rFonts w:ascii="Arial" w:hAnsi="Arial"/>
+          <w:color w:val="000000"/>
+          <w:sz w:val="28"/>
+        </w:rPr>
+        <w:t>Room: Babies Two</w:t>
+      </w:r>
+    </w:p>
+    <w:p>
+      <w:r>
+        <w:rPr>
+          <w:b/>
+          <w:sz w:val="22"/>
+        </w:rPr>
+        <w:t>**Asset:** Samsung  Galaxy Tab A7 SM-T500 (SN: `R9TR80A8TBB`) | **Last Seen:** 2026-05-04</w:t>
+      </w:r>
+    </w:p>
+    <w:p>
+      <w:pPr>
+        <w:pStyle w:val="ListBullet"/>
+      </w:pPr>
+      <w:r/>
+      <w:r>
+        <w:rPr>
+          <w:b/>
+        </w:rPr>
+        <w:t>Operating System:</w:t>
+      </w:r>
+      <w:r>
+        <w:t xml:space="preserve"> iOS Latest</w:t>
+      </w:r>
+    </w:p>
+    <w:p>
+      <w:pPr>
+        <w:pStyle w:val="ListBullet"/>
+      </w:pPr>
+      <w:r/>
+      <w:r>
+        <w:rPr>
+          <w:b/>
+        </w:rPr>
+        <w:t>Photos/Media:</w:t>
+      </w:r>
+      <w:r>
+        <w:t xml:space="preserve"> 0 files found.</w:t>
+      </w:r>
+    </w:p>
+    <w:p>
+      <w:pPr>
+        <w:pStyle w:val="ListBullet"/>
+      </w:pPr>
+      <w:r/>
+      <w:r>
+        <w:rPr>
+          <w:b/>
+        </w:rPr>
+        <w:t>Cloud Sync:</w:t>
+      </w:r>
+      <w:r>
+        <w:t xml:space="preserve"> Camera Uploads: OFF | OneDrive: ON</w:t>
+      </w:r>
+    </w:p>
+    <w:p>
+      <w:pPr>
+        <w:pStyle w:val="ListBullet"/>
+      </w:pPr>
+      <w:r/>
+      <w:r>
+        <w:rPr>
+          <w:b/>
+        </w:rPr>
+        <w:t>Engineer Notes:</w:t>
+      </w:r>
+      <w:r>
+        <w:t xml:space="preserve"> REQUIRED ACTION: Locate / verify</w:t>
+      </w:r>
+    </w:p>
+    <w:p>
+      <w:pPr>
+        <w:pStyle w:val="Heading2"/>
+      </w:pPr>
+      <w:r>
+        <w:rPr>
+          <w:rFonts w:ascii="Arial" w:hAnsi="Arial"/>
+          <w:color w:val="000000"/>
+          <w:sz w:val="28"/>
+        </w:rPr>
+        <w:t>Room: Kate</w:t>
+      </w:r>
+    </w:p>
+    <w:p>
+      <w:r>
+        <w:rPr>
+          <w:b/>
+          <w:sz w:val="22"/>
+        </w:rPr>
+        <w:t>**Asset:** Inspiron 16 5640 (SN: `C428GB4`) | **Last Seen:** 2026-05-04</w:t>
+      </w:r>
+    </w:p>
+    <w:p>
+      <w:pPr>
+        <w:pStyle w:val="ListBullet"/>
+      </w:pPr>
+      <w:r/>
+      <w:r>
+        <w:rPr>
+          <w:b/>
+        </w:rPr>
+        <w:t>Operating System:</w:t>
+      </w:r>
+      <w:r>
+        <w:t xml:space="preserve"> Windows 11</w:t>
+      </w:r>
+    </w:p>
+    <w:p>
+      <w:pPr>
+        <w:pStyle w:val="ListBullet"/>
+      </w:pPr>
+      <w:r/>
+      <w:r>
+        <w:rPr>
+          <w:b/>
+        </w:rPr>
+        <w:t>Security Patching:</w:t>
+      </w:r>
+      <w:r>
+        <w:t xml:space="preserve"> Current</w:t>
+      </w:r>
+    </w:p>
+    <w:p>
+      <w:pPr>
+        <w:pStyle w:val="ListBullet"/>
+      </w:pPr>
+      <w:r/>
+      <w:r>
+        <w:rPr>
+          <w:b/>
+        </w:rPr>
+        <w:t>Antivirus/Defender:</w:t>
+      </w:r>
+      <w:r>
+        <w:t xml:space="preserve"> Passed</w:t>
+      </w:r>
+    </w:p>
+    <w:p>
+      <w:pPr>
+        <w:pStyle w:val="ListBullet"/>
+      </w:pPr>
+      <w:r/>
+      <w:r>
+        <w:rPr>
+          <w:b/>
+        </w:rPr>
+        <w:t>Engineer Notes:</w:t>
+      </w:r>
+      <w:r>
+        <w:t xml:space="preserve"> Active - Validated</w:t>
+      </w:r>
+    </w:p>
+    <w:p>
+      <w:pPr>
+        <w:pStyle w:val="Heading2"/>
+      </w:pPr>
+      <w:r>
+        <w:rPr>
+          <w:rFonts w:ascii="Arial" w:hAnsi="Arial"/>
+          <w:color w:val="000000"/>
+          <w:sz w:val="28"/>
+        </w:rPr>
+        <w:t>Room: Kate</w:t>
+      </w:r>
+    </w:p>
+    <w:p>
+      <w:r>
+        <w:rPr>
+          <w:b/>
+          <w:sz w:val="22"/>
+        </w:rPr>
+        <w:t>**Asset:** Iphone 13 MLPF3X/A (SN: `LF2LRW53QW`) | **Last Seen:** 2026-05-04</w:t>
+      </w:r>
+    </w:p>
+    <w:p>
+      <w:pPr>
+        <w:pStyle w:val="ListBullet"/>
+      </w:pPr>
+      <w:r/>
+      <w:r>
+        <w:rPr>
+          <w:b/>
+        </w:rPr>
+        <w:t>Operating System:</w:t>
+      </w:r>
+      <w:r>
+        <w:t xml:space="preserve"> iOS Latest</w:t>
+      </w:r>
+    </w:p>
+    <w:p>
+      <w:pPr>
+        <w:pStyle w:val="ListBullet"/>
+      </w:pPr>
+      <w:r/>
+      <w:r>
+        <w:rPr>
+          <w:b/>
+        </w:rPr>
+        <w:t>Photos/Media:</w:t>
+      </w:r>
+      <w:r>
+        <w:t xml:space="preserve"> 0 files found.</w:t>
+      </w:r>
+    </w:p>
+    <w:p>
+      <w:pPr>
+        <w:pStyle w:val="ListBullet"/>
+      </w:pPr>
+      <w:r/>
+      <w:r>
+        <w:rPr>
+          <w:b/>
+        </w:rPr>
+        <w:t>Cloud Sync:</w:t>
+      </w:r>
+      <w:r>
+        <w:t xml:space="preserve"> Camera Uploads: OFF | OneDrive: ON</w:t>
+      </w:r>
+    </w:p>
+    <w:p>
+      <w:pPr>
+        <w:pStyle w:val="ListBullet"/>
+      </w:pPr>
+      <w:r/>
+      <w:r>
+        <w:rPr>
+          <w:b/>
+        </w:rPr>
+        <w:t>Engineer Notes:</w:t>
+      </w:r>
+      <w:r>
+        <w:t xml:space="preserve"> REQUIRED ACTION: Locate / verify</w:t>
+      </w:r>
+    </w:p>
+    <w:p>
+      <w:pPr>
+        <w:pStyle w:val="Heading2"/>
+      </w:pPr>
+      <w:r>
+        <w:rPr>
+          <w:rFonts w:ascii="Arial" w:hAnsi="Arial"/>
+          <w:color w:val="000000"/>
+          <w:sz w:val="28"/>
+        </w:rPr>
+        <w:t>Room: Kindy On e</w:t>
+      </w:r>
+    </w:p>
+    <w:p>
+      <w:r>
+        <w:rPr>
+          <w:b/>
+          <w:sz w:val="22"/>
+        </w:rPr>
+        <w:t>**Asset:** Dell 15 DC1520 (SN: `9DVJ4C4`) | **Last Seen:** 2026-05-04</w:t>
+      </w:r>
+    </w:p>
+    <w:p>
+      <w:pPr>
+        <w:pStyle w:val="ListBullet"/>
+      </w:pPr>
+      <w:r/>
+      <w:r>
+        <w:rPr>
+          <w:b/>
+        </w:rPr>
+        <w:t>Operating System:</w:t>
+      </w:r>
+      <w:r>
+        <w:t xml:space="preserve"> Windows 11</w:t>
+      </w:r>
+    </w:p>
+    <w:p>
+      <w:pPr>
+        <w:pStyle w:val="ListBullet"/>
+      </w:pPr>
+      <w:r/>
+      <w:r>
+        <w:rPr>
+          <w:b/>
+        </w:rPr>
+        <w:t>Security Patching:</w:t>
+      </w:r>
+      <w:r>
+        <w:t xml:space="preserve"> Current</w:t>
+      </w:r>
+    </w:p>
+    <w:p>
+      <w:pPr>
+        <w:pStyle w:val="ListBullet"/>
+      </w:pPr>
+      <w:r/>
+      <w:r>
+        <w:rPr>
+          <w:b/>
+        </w:rPr>
+        <w:t>Antivirus/Defender:</w:t>
+      </w:r>
+      <w:r>
+        <w:t xml:space="preserve"> Passed</w:t>
+      </w:r>
+    </w:p>
+    <w:p>
+      <w:pPr>
+        <w:pStyle w:val="ListBullet"/>
+      </w:pPr>
+      <w:r/>
+      <w:r>
+        <w:rPr>
+          <w:b/>
+        </w:rPr>
+        <w:t>Engineer Notes:</w:t>
+      </w:r>
+      <w:r>
+        <w:t xml:space="preserve"> Active - Validated</w:t>
+      </w:r>
+    </w:p>
+    <w:p>
+      <w:pPr>
+        <w:pStyle w:val="Heading2"/>
+      </w:pPr>
+      <w:r>
+        <w:rPr>
+          <w:rFonts w:ascii="Arial" w:hAnsi="Arial"/>
+          <w:color w:val="000000"/>
+          <w:sz w:val="28"/>
+        </w:rPr>
+        <w:t>Room: Kindy One</w:t>
+      </w:r>
+    </w:p>
+    <w:p>
+      <w:r>
+        <w:rPr>
+          <w:b/>
+          <w:sz w:val="22"/>
+        </w:rPr>
+        <w:t>**Asset:** Apple 9th Gen MK2K3X/A (SN: `X9RQGD1QWM`) | **Last Seen:** 2026-05-04</w:t>
+      </w:r>
+    </w:p>
+    <w:p>
+      <w:pPr>
+        <w:pStyle w:val="ListBullet"/>
+      </w:pPr>
+      <w:r/>
+      <w:r>
+        <w:rPr>
+          <w:b/>
+        </w:rPr>
+        <w:t>Operating System:</w:t>
+      </w:r>
+      <w:r>
+        <w:t xml:space="preserve"> iOS yes</w:t>
+      </w:r>
+    </w:p>
+    <w:p>
+      <w:pPr>
+        <w:pStyle w:val="ListBullet"/>
+      </w:pPr>
+      <w:r/>
+      <w:r>
+        <w:rPr>
+          <w:b/>
+        </w:rPr>
+        <w:t>Photos/Media:</w:t>
+      </w:r>
+      <w:r>
+        <w:t xml:space="preserve"> 924 files found.</w:t>
+      </w:r>
+    </w:p>
+    <w:p>
+      <w:pPr>
+        <w:pStyle w:val="ListBullet"/>
+      </w:pPr>
+      <w:r/>
+      <w:r>
+        <w:rPr>
+          <w:b/>
+        </w:rPr>
+        <w:t>Cloud Sync:</w:t>
+      </w:r>
+      <w:r>
+        <w:t xml:space="preserve"> Camera Uploads: OFF | OneDrive: ON</w:t>
+      </w:r>
+    </w:p>
+    <w:p>
+      <w:pPr>
+        <w:pStyle w:val="ListBullet"/>
+      </w:pPr>
+      <w:r/>
+      <w:r>
+        <w:rPr>
+          <w:b/>
+        </w:rPr>
+        <w:t>Engineer Notes:</w:t>
+      </w:r>
+      <w:r>
+        <w:t xml:space="preserve"> Active / photo reduction required</w:t>
+      </w:r>
+    </w:p>
+    <w:p>
+      <w:pPr>
+        <w:pStyle w:val="Heading2"/>
+      </w:pPr>
+      <w:r>
+        <w:rPr>
+          <w:rFonts w:ascii="Arial" w:hAnsi="Arial"/>
+          <w:color w:val="000000"/>
+          <w:sz w:val="28"/>
+        </w:rPr>
+        <w:t>Room: Kindy One</w:t>
+      </w:r>
+    </w:p>
+    <w:p>
+      <w:r>
+        <w:rPr>
+          <w:b/>
+          <w:sz w:val="22"/>
+        </w:rPr>
+        <w:t>**Asset:** Commbox Classic 65 (SN: `2204C6503010022`) | **Last Seen:** 2026-05-04</w:t>
+      </w:r>
+    </w:p>
+    <w:p>
+      <w:pPr>
+        <w:pStyle w:val="ListBullet"/>
+      </w:pPr>
+      <w:r/>
+      <w:r>
+        <w:rPr>
+          <w:b/>
+        </w:rPr>
+        <w:t>Operating System:</w:t>
+      </w:r>
+      <w:r>
+        <w:t xml:space="preserve"> Windows N/A</w:t>
+      </w:r>
+    </w:p>
+    <w:p>
+      <w:pPr>
+        <w:pStyle w:val="ListBullet"/>
+      </w:pPr>
+      <w:r/>
+      <w:r>
+        <w:rPr>
+          <w:b/>
+        </w:rPr>
+        <w:t>Security Patching:</w:t>
+      </w:r>
+      <w:r>
+        <w:t xml:space="preserve"> Current</w:t>
+      </w:r>
+    </w:p>
+    <w:p>
+      <w:pPr>
+        <w:pStyle w:val="ListBullet"/>
+      </w:pPr>
+      <w:r/>
+      <w:r>
+        <w:rPr>
+          <w:b/>
+        </w:rPr>
+        <w:t>Antivirus/Defender:</w:t>
+      </w:r>
+      <w:r>
+        <w:t xml:space="preserve"> Active</w:t>
+      </w:r>
+    </w:p>
+    <w:p>
+      <w:pPr>
+        <w:pStyle w:val="ListBullet"/>
+      </w:pPr>
+      <w:r/>
+      <w:r>
+        <w:rPr>
+          <w:b/>
+        </w:rPr>
+        <w:t>Engineer Notes:</w:t>
+      </w:r>
+      <w:r>
+        <w:t xml:space="preserve"> Bulk Import</w:t>
+      </w:r>
+    </w:p>
+    <w:p>
+      <w:pPr>
+        <w:pStyle w:val="Heading2"/>
+      </w:pPr>
+      <w:r>
+        <w:rPr>
+          <w:rFonts w:ascii="Arial" w:hAnsi="Arial"/>
+          <w:color w:val="000000"/>
+          <w:sz w:val="28"/>
+        </w:rPr>
+        <w:t>Room: Kindy Two</w:t>
+      </w:r>
+    </w:p>
+    <w:p>
+      <w:r>
+        <w:rPr>
+          <w:b/>
+          <w:sz w:val="22"/>
+        </w:rPr>
+        <w:t>**Asset:** Apple 9th Gen MK2K3X/A (SN: `MCPF3X11J9`) | **Last Seen:** 2026-05-04</w:t>
+      </w:r>
+    </w:p>
+    <w:p>
+      <w:pPr>
+        <w:pStyle w:val="ListBullet"/>
+      </w:pPr>
+      <w:r/>
+      <w:r>
+        <w:rPr>
+          <w:b/>
+        </w:rPr>
+        <w:t>Operating System:</w:t>
+      </w:r>
+      <w:r>
+        <w:t xml:space="preserve"> iOS Latest</w:t>
+      </w:r>
+    </w:p>
+    <w:p>
+      <w:pPr>
+        <w:pStyle w:val="ListBullet"/>
+      </w:pPr>
+      <w:r/>
+      <w:r>
+        <w:rPr>
+          <w:b/>
+        </w:rPr>
+        <w:t>Photos/Media:</w:t>
+      </w:r>
+      <w:r>
+        <w:t xml:space="preserve"> 670 files found.</w:t>
+      </w:r>
+    </w:p>
+    <w:p>
+      <w:pPr>
+        <w:pStyle w:val="ListBullet"/>
+      </w:pPr>
+      <w:r/>
+      <w:r>
+        <w:rPr>
+          <w:b/>
+        </w:rPr>
+        <w:t>Cloud Sync:</w:t>
+      </w:r>
+      <w:r>
+        <w:t xml:space="preserve"> Camera Uploads: OFF | OneDrive: ON</w:t>
+      </w:r>
+    </w:p>
+    <w:p>
+      <w:pPr>
+        <w:pStyle w:val="ListBullet"/>
+      </w:pPr>
+      <w:r/>
+      <w:r>
+        <w:rPr>
+          <w:b/>
+        </w:rPr>
+        <w:t>Engineer Notes:</w:t>
+      </w:r>
+      <w:r>
+        <w:t xml:space="preserve"> Active / photo reduction required</w:t>
+      </w:r>
+    </w:p>
+    <w:p>
+      <w:pPr>
+        <w:pStyle w:val="Heading2"/>
+      </w:pPr>
+      <w:r>
+        <w:rPr>
+          <w:rFonts w:ascii="Arial" w:hAnsi="Arial"/>
+          <w:color w:val="000000"/>
+          <w:sz w:val="28"/>
+        </w:rPr>
+        <w:t>Room: Kindy Two</w:t>
+      </w:r>
+    </w:p>
+    <w:p>
+      <w:r>
+        <w:rPr>
+          <w:b/>
+          <w:sz w:val="22"/>
+        </w:rPr>
+        <w:t>**Asset:** Commbox Classic 65 (SN: `2204C6503010020`) | **Last Seen:** 2026-05-04</w:t>
+      </w:r>
+    </w:p>
+    <w:p>
+      <w:pPr>
+        <w:pStyle w:val="ListBullet"/>
+      </w:pPr>
+      <w:r/>
+      <w:r>
+        <w:rPr>
+          <w:b/>
+        </w:rPr>
+        <w:t>Operating System:</w:t>
+      </w:r>
+      <w:r>
+        <w:t xml:space="preserve"> Windows N/A</w:t>
+      </w:r>
+    </w:p>
+    <w:p>
+      <w:pPr>
+        <w:pStyle w:val="ListBullet"/>
+      </w:pPr>
+      <w:r/>
+      <w:r>
+        <w:rPr>
+          <w:b/>
+        </w:rPr>
+        <w:t>Security Patching:</w:t>
+      </w:r>
+      <w:r>
+        <w:t xml:space="preserve"> Current</w:t>
+      </w:r>
+    </w:p>
+    <w:p>
+      <w:pPr>
+        <w:pStyle w:val="ListBullet"/>
+      </w:pPr>
+      <w:r/>
+      <w:r>
+        <w:rPr>
+          <w:b/>
+        </w:rPr>
+        <w:t>Antivirus/Defender:</w:t>
+      </w:r>
+      <w:r>
+        <w:t xml:space="preserve"> Active</w:t>
+      </w:r>
+    </w:p>
+    <w:p>
+      <w:pPr>
+        <w:pStyle w:val="ListBullet"/>
+      </w:pPr>
+      <w:r/>
+      <w:r>
+        <w:rPr>
+          <w:b/>
+        </w:rPr>
+        <w:t>Engineer Notes:</w:t>
+      </w:r>
+      <w:r>
+        <w:t xml:space="preserve"> Bulk Import</w:t>
+      </w:r>
+    </w:p>
+    <w:p>
+      <w:pPr>
+        <w:pStyle w:val="Heading2"/>
+      </w:pPr>
+      <w:r>
+        <w:rPr>
+          <w:rFonts w:ascii="Arial" w:hAnsi="Arial"/>
+          <w:color w:val="000000"/>
+          <w:sz w:val="28"/>
+        </w:rPr>
+        <w:t>Room: Kindy Two</w:t>
+      </w:r>
+    </w:p>
+    <w:p>
+      <w:r>
+        <w:rPr>
+          <w:b/>
+          <w:sz w:val="22"/>
+        </w:rPr>
+        <w:t>**Asset:** Dell 15 DC1520 (SN: `hbvDPC4`) | **Last Seen:** 2026-05-04</w:t>
+      </w:r>
+    </w:p>
+    <w:p>
+      <w:pPr>
+        <w:pStyle w:val="ListBullet"/>
+      </w:pPr>
+      <w:r/>
+      <w:r>
+        <w:rPr>
+          <w:b/>
+        </w:rPr>
+        <w:t>Operating System:</w:t>
+      </w:r>
+      <w:r>
+        <w:t xml:space="preserve"> Windows 11</w:t>
+      </w:r>
+    </w:p>
+    <w:p>
+      <w:pPr>
+        <w:pStyle w:val="ListBullet"/>
+      </w:pPr>
+      <w:r/>
+      <w:r>
+        <w:rPr>
+          <w:b/>
+        </w:rPr>
+        <w:t>Security Patching:</w:t>
+      </w:r>
+      <w:r>
+        <w:t xml:space="preserve"> Current</w:t>
+      </w:r>
+    </w:p>
+    <w:p>
+      <w:pPr>
+        <w:pStyle w:val="ListBullet"/>
+      </w:pPr>
+      <w:r/>
+      <w:r>
+        <w:rPr>
+          <w:b/>
+        </w:rPr>
+        <w:t>Antivirus/Defender:</w:t>
+      </w:r>
+      <w:r>
+        <w:t xml:space="preserve"> Passed</w:t>
+      </w:r>
+    </w:p>
+    <w:p>
+      <w:pPr>
+        <w:pStyle w:val="ListBullet"/>
+      </w:pPr>
+      <w:r/>
+      <w:r>
+        <w:rPr>
+          <w:b/>
+        </w:rPr>
+        <w:t>Engineer Notes:</w:t>
+      </w:r>
+      <w:r>
+        <w:t xml:space="preserve"> Active - Validated</w:t>
+      </w:r>
+    </w:p>
+    <w:p>
+      <w:pPr>
+        <w:pStyle w:val="Heading2"/>
+      </w:pPr>
+      <w:r>
+        <w:rPr>
+          <w:rFonts w:ascii="Arial" w:hAnsi="Arial"/>
+          <w:color w:val="000000"/>
+          <w:sz w:val="28"/>
+        </w:rPr>
+        <w:t>Room: Kindy Two</w:t>
+      </w:r>
+    </w:p>
+    <w:p>
+      <w:r>
+        <w:rPr>
+          <w:b/>
+          <w:sz w:val="22"/>
+        </w:rPr>
+        <w:t>**Asset:** Samsung  Galaxy Tab A7 SM-T500 (SN: `R9TR70W810E`) | **Last Seen:** 2026-05-04</w:t>
+      </w:r>
+    </w:p>
+    <w:p>
+      <w:pPr>
+        <w:pStyle w:val="ListBullet"/>
+      </w:pPr>
+      <w:r/>
+      <w:r>
+        <w:rPr>
+          <w:b/>
+        </w:rPr>
+        <w:t>Operating System:</w:t>
+      </w:r>
+      <w:r>
+        <w:t xml:space="preserve"> iOS Latest</w:t>
+      </w:r>
+    </w:p>
+    <w:p>
+      <w:pPr>
+        <w:pStyle w:val="ListBullet"/>
+      </w:pPr>
+      <w:r/>
+      <w:r>
+        <w:rPr>
+          <w:b/>
+        </w:rPr>
+        <w:t>Photos/Media:</w:t>
+      </w:r>
+      <w:r>
+        <w:t xml:space="preserve"> 0 files found.</w:t>
+      </w:r>
+    </w:p>
+    <w:p>
+      <w:pPr>
+        <w:pStyle w:val="ListBullet"/>
+      </w:pPr>
+      <w:r/>
+      <w:r>
+        <w:rPr>
+          <w:b/>
+        </w:rPr>
+        <w:t>Cloud Sync:</w:t>
+      </w:r>
+      <w:r>
+        <w:t xml:space="preserve"> Camera Uploads: OFF | OneDrive: ON</w:t>
+      </w:r>
+    </w:p>
+    <w:p>
+      <w:pPr>
+        <w:pStyle w:val="ListBullet"/>
+      </w:pPr>
+      <w:r/>
+      <w:r>
+        <w:rPr>
+          <w:b/>
+        </w:rPr>
+        <w:t>Engineer Notes:</w:t>
+      </w:r>
+      <w:r>
+        <w:t xml:space="preserve"> REQUIRED ACTION: Locate / verify</w:t>
+      </w:r>
+    </w:p>
+    <w:p>
+      <w:pPr>
+        <w:pStyle w:val="Heading2"/>
+      </w:pPr>
+      <w:r>
+        <w:rPr>
+          <w:rFonts w:ascii="Arial" w:hAnsi="Arial"/>
+          <w:color w:val="000000"/>
+          <w:sz w:val="28"/>
+        </w:rPr>
+        <w:t>Room: Kitchen</w:t>
+      </w:r>
+    </w:p>
+    <w:p>
+      <w:r>
+        <w:rPr>
+          <w:b/>
+          <w:sz w:val="22"/>
+        </w:rPr>
+        <w:t>**Asset:** Samsung  Galaxy Tab A8 SM-X200 (SN: `R9YT10FE&lt;VJ`) | **Last Seen:** 2026-05-04</w:t>
+      </w:r>
+    </w:p>
+    <w:p>
+      <w:pPr>
+        <w:pStyle w:val="ListBullet"/>
+      </w:pPr>
+      <w:r/>
+      <w:r>
+        <w:rPr>
+          <w:b/>
+        </w:rPr>
+        <w:t>Operating System:</w:t>
+      </w:r>
+      <w:r>
+        <w:t xml:space="preserve"> iOS Latest</w:t>
+      </w:r>
+    </w:p>
+    <w:p>
+      <w:pPr>
+        <w:pStyle w:val="ListBullet"/>
+      </w:pPr>
+      <w:r/>
+      <w:r>
+        <w:rPr>
+          <w:b/>
+        </w:rPr>
+        <w:t>Photos/Media:</w:t>
+      </w:r>
+      <w:r>
+        <w:t xml:space="preserve"> 0 files found.</w:t>
+      </w:r>
+    </w:p>
+    <w:p>
+      <w:pPr>
+        <w:pStyle w:val="ListBullet"/>
+      </w:pPr>
+      <w:r/>
+      <w:r>
+        <w:rPr>
+          <w:b/>
+        </w:rPr>
+        <w:t>Cloud Sync:</w:t>
+      </w:r>
+      <w:r>
+        <w:t xml:space="preserve"> Camera Uploads: OFF | OneDrive: ON</w:t>
+      </w:r>
+    </w:p>
+    <w:p>
+      <w:pPr>
+        <w:pStyle w:val="ListBullet"/>
+      </w:pPr>
+      <w:r/>
+      <w:r>
+        <w:rPr>
+          <w:b/>
+        </w:rPr>
+        <w:t>Engineer Notes:</w:t>
+      </w:r>
+      <w:r>
+        <w:t xml:space="preserve"> REQUIRED ACTION: Locate / verify</w:t>
+      </w:r>
+    </w:p>
+    <w:p>
+      <w:pPr>
+        <w:pStyle w:val="Heading2"/>
+      </w:pPr>
+      <w:r>
+        <w:rPr>
+          <w:rFonts w:ascii="Arial" w:hAnsi="Arial"/>
+          <w:color w:val="000000"/>
+          <w:sz w:val="28"/>
+        </w:rPr>
+        <w:t>Room: Kylie</w:t>
+      </w:r>
+    </w:p>
+    <w:p>
+      <w:r>
+        <w:rPr>
+          <w:b/>
+          <w:sz w:val="22"/>
+        </w:rPr>
+        <w:t>**Asset:** Dell Inspiron 16 7640 2 in 1 (SN: `CMTF044`) | **Last Seen:** 2026-05-04</w:t>
+      </w:r>
+    </w:p>
+    <w:p>
+      <w:pPr>
+        <w:pStyle w:val="ListBullet"/>
+      </w:pPr>
+      <w:r/>
+      <w:r>
+        <w:rPr>
+          <w:b/>
+        </w:rPr>
+        <w:t>Operating System:</w:t>
+      </w:r>
+      <w:r>
+        <w:t xml:space="preserve"> Windows 11</w:t>
+      </w:r>
+    </w:p>
+    <w:p>
+      <w:pPr>
+        <w:pStyle w:val="ListBullet"/>
+      </w:pPr>
+      <w:r/>
+      <w:r>
+        <w:rPr>
+          <w:b/>
+        </w:rPr>
+        <w:t>Security Patching:</w:t>
+      </w:r>
+      <w:r>
+        <w:t xml:space="preserve"> Current</w:t>
+      </w:r>
+    </w:p>
+    <w:p>
+      <w:pPr>
+        <w:pStyle w:val="ListBullet"/>
+      </w:pPr>
+      <w:r/>
+      <w:r>
+        <w:rPr>
+          <w:b/>
+        </w:rPr>
+        <w:t>Antivirus/Defender:</w:t>
+      </w:r>
+      <w:r>
+        <w:t xml:space="preserve"> Passed</w:t>
+      </w:r>
+    </w:p>
+    <w:p>
+      <w:pPr>
+        <w:pStyle w:val="ListBullet"/>
+      </w:pPr>
+      <w:r/>
+      <w:r>
+        <w:rPr>
+          <w:b/>
+        </w:rPr>
+        <w:t>Engineer Notes:</w:t>
+      </w:r>
+      <w:r>
+        <w:t xml:space="preserve"> Active - Validated</w:t>
+      </w:r>
+    </w:p>
+    <w:p>
+      <w:pPr>
+        <w:pStyle w:val="Heading2"/>
+      </w:pPr>
+      <w:r>
+        <w:rPr>
+          <w:rFonts w:ascii="Arial" w:hAnsi="Arial"/>
+          <w:color w:val="000000"/>
+          <w:sz w:val="28"/>
+        </w:rPr>
+        <w:t>Room: Kylie</w:t>
+      </w:r>
+    </w:p>
+    <w:p>
+      <w:r>
+        <w:rPr>
+          <w:b/>
+          <w:sz w:val="22"/>
+        </w:rPr>
+        <w:t>**Asset:** IPhone 14 Pro Max (SN: `TV39PR9WI9`) | **Last Seen:** 2026-05-04</w:t>
+      </w:r>
+    </w:p>
+    <w:p>
+      <w:pPr>
+        <w:pStyle w:val="ListBullet"/>
+      </w:pPr>
+      <w:r/>
+      <w:r>
+        <w:rPr>
+          <w:b/>
+        </w:rPr>
+        <w:t>Operating System:</w:t>
+      </w:r>
+      <w:r>
+        <w:t xml:space="preserve"> iOS Latest</w:t>
+      </w:r>
+    </w:p>
+    <w:p>
+      <w:pPr>
+        <w:pStyle w:val="ListBullet"/>
+      </w:pPr>
+      <w:r/>
+      <w:r>
+        <w:rPr>
+          <w:b/>
+        </w:rPr>
+        <w:t>Photos/Media:</w:t>
+      </w:r>
+      <w:r>
+        <w:t xml:space="preserve"> 0 files found.</w:t>
+      </w:r>
+    </w:p>
+    <w:p>
+      <w:pPr>
+        <w:pStyle w:val="ListBullet"/>
+      </w:pPr>
+      <w:r/>
+      <w:r>
+        <w:rPr>
+          <w:b/>
+        </w:rPr>
+        <w:t>Cloud Sync:</w:t>
+      </w:r>
+      <w:r>
+        <w:t xml:space="preserve"> Camera Uploads: OFF | OneDrive: ON</w:t>
+      </w:r>
+    </w:p>
+    <w:p>
+      <w:pPr>
+        <w:pStyle w:val="ListBullet"/>
+      </w:pPr>
+      <w:r/>
+      <w:r>
+        <w:rPr>
+          <w:b/>
+        </w:rPr>
+        <w:t>Engineer Notes:</w:t>
+      </w:r>
+      <w:r>
+        <w:t xml:space="preserve"> REQUIRED ACTION: Locate / verify</w:t>
+      </w:r>
+    </w:p>
+    <w:p>
+      <w:pPr>
+        <w:pStyle w:val="Heading2"/>
+      </w:pPr>
+      <w:r>
+        <w:rPr>
+          <w:rFonts w:ascii="Arial" w:hAnsi="Arial"/>
+          <w:color w:val="000000"/>
+          <w:sz w:val="28"/>
+        </w:rPr>
+        <w:t>Room: Melissa</w:t>
+      </w:r>
+    </w:p>
+    <w:p>
+      <w:r>
+        <w:rPr>
+          <w:b/>
+          <w:sz w:val="22"/>
+        </w:rPr>
+        <w:t>**Asset:** HP 15s-eq2xxx (SN: `5CD2170QH1Y`) | **Last Seen:** 2026-05-09</w:t>
+      </w:r>
+    </w:p>
+    <w:p>
+      <w:pPr>
+        <w:pStyle w:val="ListBullet"/>
+      </w:pPr>
+      <w:r/>
+      <w:r>
+        <w:rPr>
+          <w:b/>
+        </w:rPr>
+        <w:t>Operating System:</w:t>
+      </w:r>
+      <w:r>
+        <w:t xml:space="preserve"> Windows N/A</w:t>
+      </w:r>
+    </w:p>
+    <w:p>
+      <w:pPr>
+        <w:pStyle w:val="ListBullet"/>
+      </w:pPr>
+      <w:r/>
+      <w:r>
+        <w:rPr>
+          <w:b/>
+        </w:rPr>
+        <w:t>Security Patching:</w:t>
+      </w:r>
+      <w:r>
+        <w:t xml:space="preserve"> Current</w:t>
+      </w:r>
+    </w:p>
+    <w:p>
+      <w:pPr>
+        <w:pStyle w:val="ListBullet"/>
+      </w:pPr>
+      <w:r/>
+      <w:r>
+        <w:rPr>
+          <w:b/>
+        </w:rPr>
+        <w:t>Antivirus/Defender:</w:t>
+      </w:r>
+      <w:r>
+        <w:t xml:space="preserve"> Active</w:t>
+      </w:r>
+    </w:p>
+    <w:p>
+      <w:pPr>
+        <w:pStyle w:val="ListBullet"/>
+      </w:pPr>
+      <w:r/>
+      <w:r>
+        <w:rPr>
+          <w:b/>
+        </w:rPr>
+        <w:t>Engineer Notes:</w:t>
+      </w:r>
+      <w:r>
+        <w:t xml:space="preserve"> test</w:t>
+      </w:r>
+    </w:p>
+    <w:p>
+      <w:pPr>
+        <w:pStyle w:val="Heading2"/>
+      </w:pPr>
+      <w:r>
+        <w:rPr>
+          <w:rFonts w:ascii="Arial" w:hAnsi="Arial"/>
+          <w:color w:val="000000"/>
+          <w:sz w:val="28"/>
+        </w:rPr>
+        <w:t>Room: OSHC</w:t>
+      </w:r>
+    </w:p>
+    <w:p>
+      <w:r>
+        <w:rPr>
+          <w:b/>
+          <w:sz w:val="22"/>
+        </w:rPr>
+        <w:t>**Asset:** Apple 9th Gen MK2K3X/A (SN: `KN2Y3Q2RTY`) | **Last Seen:** 2026-05-04</w:t>
+      </w:r>
+    </w:p>
+    <w:p>
+      <w:pPr>
+        <w:pStyle w:val="ListBullet"/>
+      </w:pPr>
+      <w:r/>
+      <w:r>
+        <w:rPr>
+          <w:b/>
+        </w:rPr>
+        <w:t>Operating System:</w:t>
+      </w:r>
+      <w:r>
+        <w:t xml:space="preserve"> iOS yes</w:t>
+      </w:r>
+    </w:p>
+    <w:p>
+      <w:pPr>
+        <w:pStyle w:val="ListBullet"/>
+      </w:pPr>
+      <w:r/>
+      <w:r>
+        <w:rPr>
+          <w:b/>
+        </w:rPr>
+        <w:t>Photos/Media:</w:t>
+      </w:r>
+      <w:r>
+        <w:t xml:space="preserve"> 256 files found.</w:t>
+      </w:r>
+    </w:p>
+    <w:p>
+      <w:pPr>
+        <w:pStyle w:val="ListBullet"/>
+      </w:pPr>
+      <w:r/>
+      <w:r>
+        <w:rPr>
+          <w:b/>
+        </w:rPr>
+        <w:t>Cloud Sync:</w:t>
+      </w:r>
+      <w:r>
+        <w:t xml:space="preserve"> Camera Uploads: OFF | OneDrive: ON</w:t>
+      </w:r>
+    </w:p>
+    <w:p>
+      <w:pPr>
+        <w:pStyle w:val="ListBullet"/>
+      </w:pPr>
+      <w:r/>
+      <w:r>
+        <w:rPr>
+          <w:b/>
+        </w:rPr>
+        <w:t>Engineer Notes:</w:t>
+      </w:r>
+      <w:r>
+        <w:t xml:space="preserve"> Active / photo reduction required</w:t>
+      </w:r>
+    </w:p>
+    <w:p>
+      <w:pPr>
+        <w:pStyle w:val="Heading2"/>
+      </w:pPr>
+      <w:r>
+        <w:rPr>
+          <w:rFonts w:ascii="Arial" w:hAnsi="Arial"/>
+          <w:color w:val="000000"/>
+          <w:sz w:val="28"/>
+        </w:rPr>
+        <w:t>Room: OSHC</w:t>
+      </w:r>
+    </w:p>
+    <w:p>
+      <w:r>
+        <w:rPr>
+          <w:b/>
+          <w:sz w:val="22"/>
+        </w:rPr>
+        <w:t>**Asset:** HP 15S-fq3xxx (SN: `4z2007pa#ABG`) | **Last Seen:** 2026-05-04</w:t>
+      </w:r>
+    </w:p>
+    <w:p>
+      <w:pPr>
+        <w:pStyle w:val="ListBullet"/>
+      </w:pPr>
+      <w:r/>
+      <w:r>
+        <w:rPr>
+          <w:b/>
+        </w:rPr>
+        <w:t>Operating System:</w:t>
+      </w:r>
+      <w:r>
+        <w:t xml:space="preserve"> Windows N/A</w:t>
+      </w:r>
+    </w:p>
+    <w:p>
+      <w:pPr>
+        <w:pStyle w:val="ListBullet"/>
+      </w:pPr>
+      <w:r/>
+      <w:r>
+        <w:rPr>
+          <w:b/>
+        </w:rPr>
+        <w:t>Security Patching:</w:t>
+      </w:r>
+      <w:r>
+        <w:t xml:space="preserve"> Current</w:t>
+      </w:r>
+    </w:p>
+    <w:p>
+      <w:pPr>
+        <w:pStyle w:val="ListBullet"/>
+      </w:pPr>
+      <w:r/>
+      <w:r>
+        <w:rPr>
+          <w:b/>
+        </w:rPr>
+        <w:t>Antivirus/Defender:</w:t>
+      </w:r>
+      <w:r>
+        <w:t xml:space="preserve"> Active</w:t>
+      </w:r>
+    </w:p>
+    <w:p>
+      <w:pPr>
+        <w:pStyle w:val="ListBullet"/>
+      </w:pPr>
+      <w:r/>
+      <w:r>
+        <w:rPr>
+          <w:b/>
+        </w:rPr>
+        <w:t>Engineer Notes:</w:t>
+      </w:r>
+      <w:r>
+        <w:t xml:space="preserve"> Bulk Import</w:t>
+      </w:r>
+    </w:p>
+    <w:p>
+      <w:pPr>
+        <w:pStyle w:val="Heading2"/>
+      </w:pPr>
+      <w:r>
+        <w:rPr>
+          <w:rFonts w:ascii="Arial" w:hAnsi="Arial"/>
+          <w:color w:val="000000"/>
+          <w:sz w:val="28"/>
+        </w:rPr>
+        <w:t>Room: Pre Kindy</w:t>
+      </w:r>
+    </w:p>
+    <w:p>
+      <w:r>
+        <w:rPr>
+          <w:b/>
+          <w:sz w:val="22"/>
+        </w:rPr>
+        <w:t>**Asset:** Apple 9th Gen MK2K3X/A (SN: `YH4VWHXJ2N`) | **Last Seen:** 2026-05-04</w:t>
+      </w:r>
+    </w:p>
+    <w:p>
+      <w:pPr>
+        <w:pStyle w:val="ListBullet"/>
+      </w:pPr>
+      <w:r/>
+      <w:r>
+        <w:rPr>
+          <w:b/>
+        </w:rPr>
+        <w:t>Operating System:</w:t>
+      </w:r>
+      <w:r>
+        <w:t xml:space="preserve"> iOS yes</w:t>
+      </w:r>
+    </w:p>
+    <w:p>
+      <w:pPr>
+        <w:pStyle w:val="ListBullet"/>
+      </w:pPr>
+      <w:r/>
+      <w:r>
+        <w:rPr>
+          <w:b/>
+        </w:rPr>
+        <w:t>Photos/Media:</w:t>
+      </w:r>
+      <w:r>
+        <w:t xml:space="preserve"> 477 files found.</w:t>
+      </w:r>
+    </w:p>
+    <w:p>
+      <w:pPr>
+        <w:pStyle w:val="ListBullet"/>
+      </w:pPr>
+      <w:r/>
+      <w:r>
+        <w:rPr>
+          <w:b/>
+        </w:rPr>
+        <w:t>Cloud Sync:</w:t>
+      </w:r>
+      <w:r>
+        <w:t xml:space="preserve"> Camera Uploads: OFF | OneDrive: ON</w:t>
+      </w:r>
+    </w:p>
+    <w:p>
+      <w:pPr>
+        <w:pStyle w:val="ListBullet"/>
+      </w:pPr>
+      <w:r/>
+      <w:r>
+        <w:rPr>
+          <w:b/>
+        </w:rPr>
+        <w:t>Engineer Notes:</w:t>
+      </w:r>
+      <w:r>
+        <w:t xml:space="preserve"> Active / photo reduction required</w:t>
+      </w:r>
+    </w:p>
+    <w:p>
+      <w:pPr>
+        <w:pStyle w:val="Heading2"/>
+      </w:pPr>
+      <w:r>
+        <w:rPr>
+          <w:rFonts w:ascii="Arial" w:hAnsi="Arial"/>
+          <w:color w:val="000000"/>
+          <w:sz w:val="28"/>
+        </w:rPr>
+        <w:t>Room: Pre Kindy</w:t>
+      </w:r>
+    </w:p>
+    <w:p>
+      <w:r>
+        <w:rPr>
+          <w:b/>
+          <w:sz w:val="22"/>
+        </w:rPr>
+        <w:t>**Asset:** Samsung  Galaxy Tab A SM-T510 (SN: `R52N813V92R`) | **Last Seen:** 2026-05-04</w:t>
+      </w:r>
+    </w:p>
+    <w:p>
+      <w:pPr>
+        <w:pStyle w:val="ListBullet"/>
+      </w:pPr>
+      <w:r/>
+      <w:r>
+        <w:rPr>
+          <w:b/>
+        </w:rPr>
+        <w:t>Operating System:</w:t>
+      </w:r>
+      <w:r>
+        <w:t xml:space="preserve"> iOS Latest</w:t>
+      </w:r>
+    </w:p>
+    <w:p>
+      <w:pPr>
+        <w:pStyle w:val="ListBullet"/>
+      </w:pPr>
+      <w:r/>
+      <w:r>
+        <w:rPr>
+          <w:b/>
+        </w:rPr>
+        <w:t>Photos/Media:</w:t>
+      </w:r>
+      <w:r>
+        <w:t xml:space="preserve"> 0 files found.</w:t>
+      </w:r>
+    </w:p>
+    <w:p>
+      <w:pPr>
+        <w:pStyle w:val="ListBullet"/>
+      </w:pPr>
+      <w:r/>
+      <w:r>
+        <w:rPr>
+          <w:b/>
+        </w:rPr>
+        <w:t>Cloud Sync:</w:t>
+      </w:r>
+      <w:r>
+        <w:t xml:space="preserve"> Camera Uploads: OFF | OneDrive: ON</w:t>
+      </w:r>
+    </w:p>
+    <w:p>
+      <w:pPr>
+        <w:pStyle w:val="ListBullet"/>
+      </w:pPr>
+      <w:r/>
+      <w:r>
+        <w:rPr>
+          <w:b/>
+        </w:rPr>
+        <w:t>Engineer Notes:</w:t>
+      </w:r>
+      <w:r>
+        <w:t xml:space="preserve"> Active</w:t>
+      </w:r>
+    </w:p>
+    <w:p>
+      <w:pPr>
+        <w:pStyle w:val="Heading2"/>
+      </w:pPr>
+      <w:r>
+        <w:rPr>
+          <w:rFonts w:ascii="Arial" w:hAnsi="Arial"/>
+          <w:color w:val="000000"/>
+          <w:sz w:val="28"/>
+        </w:rPr>
+        <w:t>Room: Russell</w:t>
+      </w:r>
+    </w:p>
+    <w:p>
+      <w:r>
+        <w:rPr>
+          <w:b/>
+          <w:sz w:val="22"/>
+        </w:rPr>
+        <w:t>**Asset:** Iphone 15 MTP03ZP/A (SN: `JD9JqDPX4L`) | **Last Seen:** 2026-05-04</w:t>
+      </w:r>
+    </w:p>
+    <w:p>
+      <w:pPr>
+        <w:pStyle w:val="ListBullet"/>
+      </w:pPr>
+      <w:r/>
+      <w:r>
+        <w:rPr>
+          <w:b/>
+        </w:rPr>
+        <w:t>Operating System:</w:t>
+      </w:r>
+      <w:r>
+        <w:t xml:space="preserve"> iOS Latest</w:t>
+      </w:r>
+    </w:p>
+    <w:p>
+      <w:pPr>
+        <w:pStyle w:val="ListBullet"/>
+      </w:pPr>
+      <w:r/>
+      <w:r>
+        <w:rPr>
+          <w:b/>
+        </w:rPr>
+        <w:t>Photos/Media:</w:t>
+      </w:r>
+      <w:r>
+        <w:t xml:space="preserve"> 0 files found.</w:t>
+      </w:r>
+    </w:p>
+    <w:p>
+      <w:pPr>
+        <w:pStyle w:val="ListBullet"/>
+      </w:pPr>
+      <w:r/>
+      <w:r>
+        <w:rPr>
+          <w:b/>
+        </w:rPr>
+        <w:t>Cloud Sync:</w:t>
+      </w:r>
+      <w:r>
+        <w:t xml:space="preserve"> Camera Uploads: OFF | OneDrive: ON</w:t>
+      </w:r>
+    </w:p>
+    <w:p>
+      <w:pPr>
+        <w:pStyle w:val="ListBullet"/>
+      </w:pPr>
+      <w:r/>
+      <w:r>
+        <w:rPr>
+          <w:b/>
+        </w:rPr>
+        <w:t>Engineer Notes:</w:t>
+      </w:r>
+      <w:r>
+        <w:t xml:space="preserve"> REQUIRED ACTION: Locate / verify</w:t>
+      </w:r>
+    </w:p>
+    <w:p>
+      <w:pPr>
+        <w:pStyle w:val="Heading2"/>
+      </w:pPr>
+      <w:r>
+        <w:rPr>
+          <w:rFonts w:ascii="Arial" w:hAnsi="Arial"/>
+          <w:color w:val="000000"/>
+          <w:sz w:val="28"/>
+        </w:rPr>
+        <w:t>Room: Senior Kindy</w:t>
+      </w:r>
+    </w:p>
+    <w:p>
+      <w:r>
+        <w:rPr>
+          <w:b/>
+          <w:sz w:val="22"/>
+        </w:rPr>
+        <w:t>**Asset:** Apple 9th Gen MK2K3X/A (SN: `W5VJ6EJF4M`) | **Last Seen:** 2026-05-04</w:t>
+      </w:r>
+    </w:p>
+    <w:p>
+      <w:pPr>
+        <w:pStyle w:val="ListBullet"/>
+      </w:pPr>
+      <w:r/>
+      <w:r>
+        <w:rPr>
+          <w:b/>
+        </w:rPr>
+        <w:t>Operating System:</w:t>
+      </w:r>
+      <w:r>
+        <w:t xml:space="preserve"> iOS yes</w:t>
+      </w:r>
+    </w:p>
+    <w:p>
+      <w:pPr>
+        <w:pStyle w:val="ListBullet"/>
+      </w:pPr>
+      <w:r/>
+      <w:r>
+        <w:rPr>
+          <w:b/>
+        </w:rPr>
+        <w:t>Photos/Media:</w:t>
+      </w:r>
+      <w:r>
+        <w:t xml:space="preserve"> 872 files found.</w:t>
+      </w:r>
+    </w:p>
+    <w:p>
+      <w:pPr>
+        <w:pStyle w:val="ListBullet"/>
+      </w:pPr>
+      <w:r/>
+      <w:r>
+        <w:rPr>
+          <w:b/>
+        </w:rPr>
+        <w:t>Cloud Sync:</w:t>
+      </w:r>
+      <w:r>
+        <w:t xml:space="preserve"> Camera Uploads: OFF | OneDrive: OFF</w:t>
+      </w:r>
+    </w:p>
+    <w:p>
+      <w:pPr>
+        <w:pStyle w:val="ListBullet"/>
+      </w:pPr>
+      <w:r/>
+      <w:r>
+        <w:rPr>
+          <w:b/>
+        </w:rPr>
+        <w:t>Engineer Notes:</w:t>
+      </w:r>
+      <w:r>
+        <w:t xml:space="preserve"> Active / remediation required - password fail</w:t>
+      </w:r>
+    </w:p>
+    <w:p>
+      <w:pPr>
+        <w:pStyle w:val="Heading2"/>
+      </w:pPr>
+      <w:r>
+        <w:rPr>
+          <w:rFonts w:ascii="Arial" w:hAnsi="Arial"/>
+          <w:color w:val="000000"/>
+          <w:sz w:val="28"/>
+        </w:rPr>
+        <w:t>Room: Senior Kindy</w:t>
+      </w:r>
+    </w:p>
+    <w:p>
+      <w:r>
+        <w:rPr>
+          <w:b/>
+          <w:sz w:val="22"/>
+        </w:rPr>
+        <w:t>**Asset:** HP 15-FD0xxx (SN: `B69K9PA#ABG`) | **Last Seen:** 2026-05-04</w:t>
+      </w:r>
+    </w:p>
+    <w:p>
+      <w:pPr>
+        <w:pStyle w:val="ListBullet"/>
+      </w:pPr>
+      <w:r/>
+      <w:r>
+        <w:rPr>
+          <w:b/>
+        </w:rPr>
+        <w:t>Operating System:</w:t>
+      </w:r>
+      <w:r>
+        <w:t xml:space="preserve"> Windows 11</w:t>
+      </w:r>
+    </w:p>
+    <w:p>
+      <w:pPr>
+        <w:pStyle w:val="ListBullet"/>
+      </w:pPr>
+      <w:r/>
+      <w:r>
+        <w:rPr>
+          <w:b/>
+        </w:rPr>
+        <w:t>Security Patching:</w:t>
+      </w:r>
+      <w:r>
+        <w:t xml:space="preserve"> Current</w:t>
+      </w:r>
+    </w:p>
+    <w:p>
+      <w:pPr>
+        <w:pStyle w:val="ListBullet"/>
+      </w:pPr>
+      <w:r/>
+      <w:r>
+        <w:rPr>
+          <w:b/>
+        </w:rPr>
+        <w:t>Antivirus/Defender:</w:t>
+      </w:r>
+      <w:r>
+        <w:t xml:space="preserve"> Passed</w:t>
+      </w:r>
+    </w:p>
+    <w:p>
+      <w:pPr>
+        <w:pStyle w:val="ListBullet"/>
+      </w:pPr>
+      <w:r/>
+      <w:r>
+        <w:rPr>
+          <w:b/>
+        </w:rPr>
+        <w:t>Engineer Notes:</w:t>
+      </w:r>
+      <w:r>
+        <w:t xml:space="preserve"> Active - Validated</w:t>
+      </w:r>
+    </w:p>
+    <w:p>
+      <w:pPr>
+        <w:pStyle w:val="Heading2"/>
+      </w:pPr>
+      <w:r>
+        <w:rPr>
+          <w:rFonts w:ascii="Arial" w:hAnsi="Arial"/>
+          <w:color w:val="000000"/>
+          <w:sz w:val="28"/>
+        </w:rPr>
+        <w:t>Room: Senior Kindy</w:t>
+      </w:r>
+    </w:p>
+    <w:p>
+      <w:r>
+        <w:rPr>
+          <w:b/>
+          <w:sz w:val="22"/>
+        </w:rPr>
+        <w:t>**Asset:** Samsung  Galaxy Tab A7 SM-T500 (SN: `R9Tr70w8q1y`) | **Last Seen:** 2026-05-04</w:t>
+      </w:r>
+    </w:p>
+    <w:p>
+      <w:pPr>
+        <w:pStyle w:val="ListBullet"/>
+      </w:pPr>
+      <w:r/>
+      <w:r>
+        <w:rPr>
+          <w:b/>
+        </w:rPr>
+        <w:t>Operating System:</w:t>
+      </w:r>
+      <w:r>
+        <w:t xml:space="preserve"> iOS Latest</w:t>
+      </w:r>
+    </w:p>
+    <w:p>
+      <w:pPr>
+        <w:pStyle w:val="ListBullet"/>
+      </w:pPr>
+      <w:r/>
+      <w:r>
+        <w:rPr>
+          <w:b/>
+        </w:rPr>
+        <w:t>Photos/Media:</w:t>
+      </w:r>
+      <w:r>
+        <w:t xml:space="preserve"> 0 files found.</w:t>
+      </w:r>
+    </w:p>
+    <w:p>
+      <w:pPr>
+        <w:pStyle w:val="ListBullet"/>
+      </w:pPr>
+      <w:r/>
+      <w:r>
+        <w:rPr>
+          <w:b/>
+        </w:rPr>
+        <w:t>Cloud Sync:</w:t>
+      </w:r>
+      <w:r>
+        <w:t xml:space="preserve"> Camera Uploads: OFF | OneDrive: ON</w:t>
+      </w:r>
+    </w:p>
+    <w:p>
+      <w:pPr>
+        <w:pStyle w:val="ListBullet"/>
+      </w:pPr>
+      <w:r/>
+      <w:r>
+        <w:rPr>
+          <w:b/>
+        </w:rPr>
+        <w:t>Engineer Notes:</w:t>
+      </w:r>
+      <w:r>
+        <w:t xml:space="preserve"> Active</w:t>
+      </w:r>
+    </w:p>
+    <w:p>
+      <w:pPr>
+        <w:pStyle w:val="Heading2"/>
+      </w:pPr>
+      <w:r>
+        <w:rPr>
+          <w:rFonts w:ascii="Arial" w:hAnsi="Arial"/>
+          <w:color w:val="000000"/>
+          <w:sz w:val="28"/>
+        </w:rPr>
+        <w:t>Room: Simona</w:t>
+      </w:r>
+    </w:p>
+    <w:p>
+      <w:r>
+        <w:rPr>
+          <w:b/>
+          <w:sz w:val="22"/>
+        </w:rPr>
+        <w:t>**Asset:** Dell Inspiron 16 7640 2 in 1 (SN: `JHWW444`) | **Last Seen:** 2026-05-04</w:t>
+      </w:r>
+    </w:p>
+    <w:p>
+      <w:pPr>
+        <w:pStyle w:val="ListBullet"/>
+      </w:pPr>
+      <w:r/>
+      <w:r>
+        <w:rPr>
+          <w:b/>
+        </w:rPr>
+        <w:t>Operating System:</w:t>
+      </w:r>
+      <w:r>
+        <w:t xml:space="preserve"> Windows 11</w:t>
+      </w:r>
+    </w:p>
+    <w:p>
+      <w:pPr>
+        <w:pStyle w:val="ListBullet"/>
+      </w:pPr>
+      <w:r/>
+      <w:r>
+        <w:rPr>
+          <w:b/>
+        </w:rPr>
+        <w:t>Security Patching:</w:t>
+      </w:r>
+      <w:r>
+        <w:t xml:space="preserve"> Current</w:t>
+      </w:r>
+    </w:p>
+    <w:p>
+      <w:pPr>
+        <w:pStyle w:val="ListBullet"/>
+      </w:pPr>
+      <w:r/>
+      <w:r>
+        <w:rPr>
+          <w:b/>
+        </w:rPr>
+        <w:t>Antivirus/Defender:</w:t>
+      </w:r>
+      <w:r>
+        <w:t xml:space="preserve"> Passed</w:t>
+      </w:r>
+    </w:p>
+    <w:p>
+      <w:pPr>
+        <w:pStyle w:val="ListBullet"/>
+      </w:pPr>
+      <w:r/>
+      <w:r>
+        <w:rPr>
+          <w:b/>
+        </w:rPr>
+        <w:t>Engineer Notes:</w:t>
+      </w:r>
+      <w:r>
+        <w:t xml:space="preserve"> Active - Validated</w:t>
+      </w:r>
+    </w:p>
+    <w:p>
+      <w:pPr>
+        <w:pStyle w:val="Heading2"/>
+      </w:pPr>
+      <w:r>
+        <w:rPr>
+          <w:rFonts w:ascii="Arial" w:hAnsi="Arial"/>
+          <w:color w:val="000000"/>
+          <w:sz w:val="28"/>
+        </w:rPr>
+        <w:t>Room: Simona</w:t>
+      </w:r>
+    </w:p>
+    <w:p>
+      <w:r>
+        <w:rPr>
+          <w:b/>
+          <w:sz w:val="22"/>
+        </w:rPr>
+        <w:t>**Asset:** Iphone 14 Pro Max (SN: `DDP2QXF6H9`) | **Last Seen:** 2026-05-04</w:t>
+      </w:r>
+    </w:p>
+    <w:p>
+      <w:pPr>
+        <w:pStyle w:val="ListBullet"/>
+      </w:pPr>
+      <w:r/>
+      <w:r>
+        <w:rPr>
+          <w:b/>
+        </w:rPr>
+        <w:t>Operating System:</w:t>
+      </w:r>
+      <w:r>
+        <w:t xml:space="preserve"> iOS Latest</w:t>
+      </w:r>
+    </w:p>
+    <w:p>
+      <w:pPr>
+        <w:pStyle w:val="ListBullet"/>
+      </w:pPr>
+      <w:r/>
+      <w:r>
+        <w:rPr>
+          <w:b/>
+        </w:rPr>
+        <w:t>Photos/Media:</w:t>
+      </w:r>
+      <w:r>
+        <w:t xml:space="preserve"> 0 files found.</w:t>
+      </w:r>
+    </w:p>
+    <w:p>
+      <w:pPr>
+        <w:pStyle w:val="ListBullet"/>
+      </w:pPr>
+      <w:r/>
+      <w:r>
+        <w:rPr>
+          <w:b/>
+        </w:rPr>
+        <w:t>Cloud Sync:</w:t>
+      </w:r>
+      <w:r>
+        <w:t xml:space="preserve"> Camera Uploads: OFF | OneDrive: ON</w:t>
+      </w:r>
+    </w:p>
+    <w:p>
+      <w:pPr>
+        <w:pStyle w:val="ListBullet"/>
+      </w:pPr>
+      <w:r/>
+      <w:r>
+        <w:rPr>
+          <w:b/>
+        </w:rPr>
+        <w:t>Engineer Notes:</w:t>
+      </w:r>
+      <w:r>
+        <w:t xml:space="preserve"> REQUIRED ACTION: Locate / verify</w:t>
+      </w:r>
+    </w:p>
+    <w:p>
+      <w:pPr>
+        <w:pStyle w:val="Heading2"/>
+      </w:pPr>
+      <w:r>
+        <w:rPr>
+          <w:rFonts w:ascii="Arial" w:hAnsi="Arial"/>
+          <w:color w:val="000000"/>
+          <w:sz w:val="28"/>
+        </w:rPr>
+        <w:t>Room: Toddlers One</w:t>
+      </w:r>
+    </w:p>
+    <w:p>
+      <w:r>
+        <w:rPr>
+          <w:b/>
+          <w:sz w:val="22"/>
+        </w:rPr>
+        <w:t>**Asset:** Acer Aspire AL15-51M (SN: `NXXRSSA00134300fb50x15`) | **Last Seen:** 2026-05-04</w:t>
+      </w:r>
+    </w:p>
+    <w:p>
+      <w:pPr>
+        <w:pStyle w:val="ListBullet"/>
+      </w:pPr>
+      <w:r/>
+      <w:r>
+        <w:rPr>
+          <w:b/>
+        </w:rPr>
+        <w:t>Operating System:</w:t>
+      </w:r>
+      <w:r>
+        <w:t xml:space="preserve"> Windows 11</w:t>
+      </w:r>
+    </w:p>
+    <w:p>
+      <w:pPr>
+        <w:pStyle w:val="ListBullet"/>
+      </w:pPr>
+      <w:r/>
+      <w:r>
+        <w:rPr>
+          <w:b/>
+        </w:rPr>
+        <w:t>Security Patching:</w:t>
+      </w:r>
+      <w:r>
+        <w:t xml:space="preserve"> Current</w:t>
+      </w:r>
+    </w:p>
+    <w:p>
+      <w:pPr>
+        <w:pStyle w:val="ListBullet"/>
+      </w:pPr>
+      <w:r/>
+      <w:r>
+        <w:rPr>
+          <w:b/>
+        </w:rPr>
+        <w:t>Antivirus/Defender:</w:t>
+      </w:r>
+      <w:r>
+        <w:t xml:space="preserve"> Passed</w:t>
+      </w:r>
+    </w:p>
+    <w:p>
+      <w:pPr>
+        <w:pStyle w:val="ListBullet"/>
+      </w:pPr>
+      <w:r/>
+      <w:r>
+        <w:rPr>
+          <w:b/>
+        </w:rPr>
+        <w:t>Engineer Notes:</w:t>
+      </w:r>
+      <w:r>
+        <w:t xml:space="preserve"> Active - Validated</w:t>
+      </w:r>
+    </w:p>
+    <w:p>
+      <w:pPr>
+        <w:pStyle w:val="Heading2"/>
+      </w:pPr>
+      <w:r>
+        <w:rPr>
+          <w:rFonts w:ascii="Arial" w:hAnsi="Arial"/>
+          <w:color w:val="000000"/>
+          <w:sz w:val="28"/>
+        </w:rPr>
+        <w:t>Room: Toddlers One</w:t>
+      </w:r>
+    </w:p>
+    <w:p>
+      <w:r>
+        <w:rPr>
+          <w:b/>
+          <w:sz w:val="22"/>
+        </w:rPr>
+        <w:t>**Asset:** Apple 9th Gen MK2K3X/A (SN: `GV3XHHC4CH`) | **Last Seen:** 2026-05-04</w:t>
+      </w:r>
+    </w:p>
+    <w:p>
+      <w:pPr>
+        <w:pStyle w:val="ListBullet"/>
+      </w:pPr>
+      <w:r/>
+      <w:r>
+        <w:rPr>
+          <w:b/>
+        </w:rPr>
+        <w:t>Operating System:</w:t>
+      </w:r>
+      <w:r>
+        <w:t xml:space="preserve"> iOS Latest</w:t>
+      </w:r>
+    </w:p>
+    <w:p>
+      <w:pPr>
+        <w:pStyle w:val="ListBullet"/>
+      </w:pPr>
+      <w:r/>
+      <w:r>
+        <w:rPr>
+          <w:b/>
+        </w:rPr>
+        <w:t>Photos/Media:</w:t>
+      </w:r>
+      <w:r>
+        <w:t xml:space="preserve"> 0 files found.</w:t>
+      </w:r>
+    </w:p>
+    <w:p>
+      <w:pPr>
+        <w:pStyle w:val="ListBullet"/>
+      </w:pPr>
+      <w:r/>
+      <w:r>
+        <w:rPr>
+          <w:b/>
+        </w:rPr>
+        <w:t>Cloud Sync:</w:t>
+      </w:r>
+      <w:r>
+        <w:t xml:space="preserve"> Camera Uploads: OFF | OneDrive: ON</w:t>
+      </w:r>
+    </w:p>
+    <w:p>
+      <w:pPr>
+        <w:pStyle w:val="ListBullet"/>
+      </w:pPr>
+      <w:r/>
+      <w:r>
+        <w:rPr>
+          <w:b/>
+        </w:rPr>
+        <w:t>Engineer Notes:</w:t>
+      </w:r>
+      <w:r>
+        <w:t xml:space="preserve"> REQUIRED ACTION: Locate / verify / privacy review</w:t>
+      </w:r>
+    </w:p>
+    <w:p>
+      <w:pPr>
+        <w:pStyle w:val="Heading2"/>
+      </w:pPr>
+      <w:r>
+        <w:rPr>
+          <w:rFonts w:ascii="Arial" w:hAnsi="Arial"/>
+          <w:color w:val="000000"/>
+          <w:sz w:val="28"/>
+        </w:rPr>
+        <w:t>Room: Toddlers Two</w:t>
+      </w:r>
+    </w:p>
+    <w:p>
+      <w:r>
+        <w:rPr>
+          <w:b/>
+          <w:sz w:val="22"/>
+        </w:rPr>
+        <w:t>**Asset:** Apple 9th Gen MK2K3X/A (SN: `LJ95R2P759`) | **Last Seen:** 2026-05-04</w:t>
+      </w:r>
+    </w:p>
+    <w:p>
+      <w:pPr>
+        <w:pStyle w:val="ListBullet"/>
+      </w:pPr>
+      <w:r/>
+      <w:r>
+        <w:rPr>
+          <w:b/>
+        </w:rPr>
+        <w:t>Operating System:</w:t>
+      </w:r>
+      <w:r>
+        <w:t xml:space="preserve"> iOS yes</w:t>
+      </w:r>
+    </w:p>
+    <w:p>
+      <w:pPr>
+        <w:pStyle w:val="ListBullet"/>
+      </w:pPr>
+      <w:r/>
+      <w:r>
+        <w:rPr>
+          <w:b/>
+        </w:rPr>
+        <w:t>Photos/Media:</w:t>
+      </w:r>
+      <w:r>
+        <w:t xml:space="preserve"> 237 files found.</w:t>
+      </w:r>
+    </w:p>
+    <w:p>
+      <w:pPr>
+        <w:pStyle w:val="ListBullet"/>
+      </w:pPr>
+      <w:r/>
+      <w:r>
+        <w:rPr>
+          <w:b/>
+        </w:rPr>
+        <w:t>Cloud Sync:</w:t>
+      </w:r>
+      <w:r>
+        <w:t xml:space="preserve"> Camera Uploads: OFF | OneDrive: ON</w:t>
+      </w:r>
+    </w:p>
+    <w:p>
+      <w:pPr>
+        <w:pStyle w:val="ListBullet"/>
+      </w:pPr>
+      <w:r/>
+      <w:r>
+        <w:rPr>
+          <w:b/>
+        </w:rPr>
+        <w:t>Engineer Notes:</w:t>
+      </w:r>
+      <w:r>
+        <w:t xml:space="preserve"> Active / photo reduction required</w:t>
+      </w:r>
+    </w:p>
+    <w:p>
+      <w:pPr>
+        <w:pStyle w:val="Heading2"/>
+      </w:pPr>
+      <w:r>
+        <w:rPr>
+          <w:rFonts w:ascii="Arial" w:hAnsi="Arial"/>
+          <w:color w:val="000000"/>
+          <w:sz w:val="28"/>
+        </w:rPr>
+        <w:t>Room: Toddlers Two</w:t>
+      </w:r>
+    </w:p>
+    <w:p>
+      <w:r>
+        <w:rPr>
+          <w:b/>
+          <w:sz w:val="22"/>
+        </w:rPr>
+        <w:t>**Asset:** Dell Inspiron 14 5440 (SN: `1NWK494`) | **Last Seen:** 2026-05-04</w:t>
+      </w:r>
+    </w:p>
+    <w:p>
+      <w:pPr>
+        <w:pStyle w:val="ListBullet"/>
+      </w:pPr>
+      <w:r/>
+      <w:r>
+        <w:rPr>
+          <w:b/>
+        </w:rPr>
+        <w:t>Operating System:</w:t>
+      </w:r>
+      <w:r>
+        <w:t xml:space="preserve"> Windows 11</w:t>
+      </w:r>
+    </w:p>
+    <w:p>
+      <w:pPr>
+        <w:pStyle w:val="ListBullet"/>
+      </w:pPr>
+      <w:r/>
+      <w:r>
+        <w:rPr>
+          <w:b/>
+        </w:rPr>
+        <w:t>Security Patching:</w:t>
+      </w:r>
+      <w:r>
+        <w:t xml:space="preserve"> Current</w:t>
+      </w:r>
+    </w:p>
+    <w:p>
+      <w:pPr>
+        <w:pStyle w:val="ListBullet"/>
+      </w:pPr>
+      <w:r/>
+      <w:r>
+        <w:rPr>
+          <w:b/>
+        </w:rPr>
+        <w:t>Antivirus/Defender:</w:t>
+      </w:r>
+      <w:r>
+        <w:t xml:space="preserve"> Passed</w:t>
+      </w:r>
+    </w:p>
+    <w:p>
+      <w:pPr>
+        <w:pStyle w:val="ListBullet"/>
+      </w:pPr>
+      <w:r/>
+      <w:r>
+        <w:rPr>
+          <w:b/>
+        </w:rPr>
+        <w:t>Engineer Notes:</w:t>
+      </w:r>
+      <w:r>
+        <w:t xml:space="preserve"> Active - Validated</w:t>
+      </w:r>
+    </w:p>
+    <w:p>
+      <w:pPr>
+        <w:pStyle w:val="Heading2"/>
+      </w:pPr>
+      <w:r>
+        <w:rPr>
+          <w:rFonts w:ascii="Arial" w:hAnsi="Arial"/>
+          <w:color w:val="000000"/>
+          <w:sz w:val="28"/>
+        </w:rPr>
+        <w:t>Room: Toddlers Two</w:t>
+      </w:r>
+    </w:p>
+    <w:p>
+      <w:r>
+        <w:rPr>
+          <w:b/>
+          <w:sz w:val="22"/>
+        </w:rPr>
+        <w:t>**Asset:** Samsung  Galaxy Tab A7 SM-T500 (SN: `R9TR70w88cr`) | **Last Seen:** 2026-05-04</w:t>
+      </w:r>
+    </w:p>
+    <w:p>
+      <w:pPr>
+        <w:pStyle w:val="ListBullet"/>
+      </w:pPr>
+      <w:r/>
+      <w:r>
+        <w:rPr>
+          <w:b/>
+        </w:rPr>
+        <w:t>Operating System:</w:t>
+      </w:r>
+      <w:r>
+        <w:t xml:space="preserve"> iOS Latest</w:t>
+      </w:r>
+    </w:p>
+    <w:p>
+      <w:pPr>
+        <w:pStyle w:val="ListBullet"/>
+      </w:pPr>
+      <w:r/>
+      <w:r>
+        <w:rPr>
+          <w:b/>
+        </w:rPr>
+        <w:t>Photos/Media:</w:t>
+      </w:r>
+      <w:r>
+        <w:t xml:space="preserve"> 0 files found.</w:t>
+      </w:r>
+    </w:p>
+    <w:p>
+      <w:pPr>
+        <w:pStyle w:val="ListBullet"/>
+      </w:pPr>
+      <w:r/>
+      <w:r>
+        <w:rPr>
+          <w:b/>
+        </w:rPr>
+        <w:t>Cloud Sync:</w:t>
+      </w:r>
+      <w:r>
+        <w:t xml:space="preserve"> Camera Uploads: OFF | OneDrive: ON</w:t>
+      </w:r>
+    </w:p>
+    <w:p>
+      <w:pPr>
+        <w:pStyle w:val="ListBullet"/>
+      </w:pPr>
+      <w:r/>
+      <w:r>
+        <w:rPr>
+          <w:b/>
+        </w:rPr>
+        <w:t>Engineer Notes:</w:t>
+      </w:r>
+      <w:r>
+        <w:t xml:space="preserve"> REQUIRED ACTION: Locate / verify</w:t>
+      </w:r>
+    </w:p>
+    <w:p>
+      <w:pPr>
+        <w:pStyle w:val="Heading2"/>
+      </w:pPr>
+      <w:r>
+        <w:rPr>
+          <w:rFonts w:ascii="Arial" w:hAnsi="Arial"/>
+          <w:color w:val="000000"/>
+          <w:sz w:val="28"/>
+        </w:rPr>
+        <w:t>Room: Xplor Reception Signin Two</w:t>
+      </w:r>
+    </w:p>
+    <w:p>
+      <w:r>
+        <w:rPr>
+          <w:b/>
+          <w:sz w:val="22"/>
+        </w:rPr>
+        <w:t>**Asset:** Apple 10th Gen MPQ03X/A (SN: `LY6CH9K1V7`) | **Last Seen:** 2026-05-04</w:t>
+      </w:r>
+    </w:p>
+    <w:p>
+      <w:pPr>
+        <w:pStyle w:val="ListBullet"/>
+      </w:pPr>
+      <w:r/>
+      <w:r>
+        <w:rPr>
+          <w:b/>
+        </w:rPr>
+        <w:t>Operating System:</w:t>
+      </w:r>
+      <w:r>
+        <w:t xml:space="preserve"> iOS Latest</w:t>
+      </w:r>
+    </w:p>
+    <w:p>
+      <w:pPr>
+        <w:pStyle w:val="ListBullet"/>
+      </w:pPr>
+      <w:r/>
+      <w:r>
+        <w:rPr>
+          <w:b/>
+        </w:rPr>
+        <w:t>Photos/Media:</w:t>
+      </w:r>
+      <w:r>
+        <w:t xml:space="preserve"> 0 files found.</w:t>
+      </w:r>
+    </w:p>
+    <w:p>
+      <w:pPr>
+        <w:pStyle w:val="ListBullet"/>
+      </w:pPr>
+      <w:r/>
+      <w:r>
+        <w:rPr>
+          <w:b/>
+        </w:rPr>
+        <w:t>Cloud Sync:</w:t>
+      </w:r>
+      <w:r>
+        <w:t xml:space="preserve"> Camera Uploads: OFF | OneDrive: ON</w:t>
+      </w:r>
+    </w:p>
+    <w:p>
+      <w:pPr>
+        <w:pStyle w:val="ListBullet"/>
+      </w:pPr>
+      <w:r/>
+      <w:r>
+        <w:rPr>
+          <w:b/>
+        </w:rPr>
+        <w:t>Engineer Notes:</w:t>
+      </w:r>
+      <w:r>
+        <w:t xml:space="preserve"> Active</w:t>
+      </w:r>
+    </w:p>
+    <w:p>
+      <w:pPr>
+        <w:pStyle w:val="Heading2"/>
+      </w:pPr>
+      <w:r>
+        <w:rPr>
+          <w:rFonts w:ascii="Arial" w:hAnsi="Arial"/>
+          <w:color w:val="000000"/>
+          <w:sz w:val="28"/>
+        </w:rPr>
+        <w:t>Room: Xplor Reception Signin one</w:t>
+      </w:r>
+    </w:p>
+    <w:p>
+      <w:r>
+        <w:rPr>
+          <w:b/>
+          <w:sz w:val="22"/>
+        </w:rPr>
+        <w:t>**Asset:** Apple 10th Gen MPQ03X/A (SN: `LVCPMG6H9J`) | **Last Seen:** 2026-05-04</w:t>
+      </w:r>
+    </w:p>
+    <w:p>
+      <w:pPr>
+        <w:pStyle w:val="ListBullet"/>
+      </w:pPr>
+      <w:r/>
+      <w:r>
+        <w:rPr>
+          <w:b/>
+        </w:rPr>
+        <w:t>Operating System:</w:t>
+      </w:r>
+      <w:r>
+        <w:t xml:space="preserve"> iOS Latest</w:t>
+      </w:r>
+    </w:p>
+    <w:p>
+      <w:pPr>
+        <w:pStyle w:val="ListBullet"/>
+      </w:pPr>
+      <w:r/>
+      <w:r>
+        <w:rPr>
+          <w:b/>
+        </w:rPr>
+        <w:t>Photos/Media:</w:t>
+      </w:r>
+      <w:r>
+        <w:t xml:space="preserve"> 0 files found.</w:t>
+      </w:r>
+    </w:p>
+    <w:p>
+      <w:pPr>
+        <w:pStyle w:val="ListBullet"/>
+      </w:pPr>
+      <w:r/>
+      <w:r>
+        <w:rPr>
+          <w:b/>
+        </w:rPr>
+        <w:t>Cloud Sync:</w:t>
+      </w:r>
+      <w:r>
+        <w:t xml:space="preserve"> Camera Uploads: OFF | OneDrive: ON</w:t>
+      </w:r>
+    </w:p>
+    <w:p>
+      <w:pPr>
+        <w:pStyle w:val="ListBullet"/>
+      </w:pPr>
+      <w:r/>
+      <w:r>
+        <w:rPr>
+          <w:b/>
+        </w:rPr>
+        <w:t>Engineer Notes:</w:t>
+      </w:r>
+      <w:r>
+        <w:t xml:space="preserve"> Active</w:t>
+      </w:r>
+    </w:p>
+    <w:p>
+      <w:pPr>
+        <w:pStyle w:val="Heading2"/>
+      </w:pPr>
+      <w:r>
+        <w:rPr>
+          <w:rFonts w:ascii="Arial" w:hAnsi="Arial"/>
+          <w:color w:val="000000"/>
+          <w:sz w:val="28"/>
+        </w:rPr>
+        <w:t>Room: Xplor Signin OSHC</w:t>
+      </w:r>
+    </w:p>
+    <w:p>
+      <w:r>
+        <w:rPr>
+          <w:b/>
+          <w:sz w:val="22"/>
+        </w:rPr>
+        <w:t>**Asset:** Apple 9th Gen MK2K3X/A (SN: `MW454V2HDH`) | **Last Seen:** 2026-05-04</w:t>
+      </w:r>
+    </w:p>
+    <w:p>
+      <w:pPr>
+        <w:pStyle w:val="ListBullet"/>
+      </w:pPr>
+      <w:r/>
+      <w:r>
+        <w:rPr>
+          <w:b/>
+        </w:rPr>
+        <w:t>Operating System:</w:t>
+      </w:r>
+      <w:r>
+        <w:t xml:space="preserve"> iOS Latest</w:t>
+      </w:r>
+    </w:p>
+    <w:p>
+      <w:pPr>
+        <w:pStyle w:val="ListBullet"/>
+      </w:pPr>
+      <w:r/>
+      <w:r>
+        <w:rPr>
+          <w:b/>
+        </w:rPr>
+        <w:t>Photos/Media:</w:t>
+      </w:r>
+      <w:r>
+        <w:t xml:space="preserve"> 0 files found.</w:t>
+      </w:r>
+    </w:p>
+    <w:p>
+      <w:pPr>
+        <w:pStyle w:val="ListBullet"/>
+      </w:pPr>
+      <w:r/>
+      <w:r>
+        <w:rPr>
+          <w:b/>
+        </w:rPr>
+        <w:t>Cloud Sync:</w:t>
+      </w:r>
+      <w:r>
+        <w:t xml:space="preserve"> Camera Uploads: OFF | OneDrive: ON</w:t>
+      </w:r>
+    </w:p>
+    <w:p>
+      <w:pPr>
+        <w:pStyle w:val="ListBullet"/>
+      </w:pPr>
+      <w:r/>
+      <w:r>
+        <w:rPr>
+          <w:b/>
+        </w:rPr>
+        <w:t>Engineer Notes:</w:t>
+      </w:r>
+      <w:r>
+        <w:t xml:space="preserve"> REQUIRED ACTION: Locate / verify / disable access</w:t>
       </w:r>
     </w:p>
     <w:sectPr>
       <w:pgSz w:w="12240" w:h="15840"/>
-      <w:pgMar w:top="1440" w:right="1800" w:bottom="1440" w:left="1800" w:header="720" w:footer="720" w:gutter="0"/>
+      <w:pgMar w:top="720" w:right="1008" w:bottom="720" w:left="1008" w:header="720" w:footer="720" w:gutter="0"/>
       <w:cols w:space="720"/>
       <w:docGrid w:linePitch="360"/>
     </w:sectPr>
@@ -630,10 +3814,6 @@
     <w:name w:val="Normal"/>
     <w:qFormat/>
     <w:rsid w:val="00FC693F"/>
-    <w:rPr>
-      <w:rFonts w:ascii="Calibri" w:hAnsi="Calibri"/>
-      <w:sz w:val="22"/>
-    </w:rPr>
   </w:style>
   <w:style w:type="paragraph" w:styleId="Header">
     <w:name w:val="header"/>

</xml_diff>

<commit_message>
Bruce: Pushing V7.4 - Site History Selection & Professional Navy Blue DOCX
</commit_message>
<xml_diff>
--- a/dashboard/static/audit-reports/report_Benowa_ELC_2026-05-09.docx
+++ b/dashboard/static/audit-reports/report_Benowa_ELC_2026-05-09.docx
@@ -10,15 +10,15 @@
       <w:r>
         <w:rPr>
           <w:rFonts w:ascii="Arial" w:hAnsi="Arial"/>
-          <w:color w:val="000000"/>
-          <w:sz w:val="48"/>
+          <w:color w:val="1F497D"/>
+          <w:sz w:val="44"/>
         </w:rPr>
-        <w:t>ASGARDIAN AUDIT REPORT: Benowa ELC</w:t>
+        <w:t>Site Audit Report: Benowa ELC</w:t>
       </w:r>
     </w:p>
     <w:p>
       <w:r>
-        <w:t>Audit Summary Generated on 09 May 2026</w:t>
+        <w:t>Comprehensive Fleet Summary - Generated 09 May 2026</w:t>
       </w:r>
     </w:p>
     <w:p>
@@ -32,7 +32,7 @@
           <w:color w:val="1F497D"/>
           <w:sz w:val="32"/>
         </w:rPr>
-        <w:t>SITE OVERVIEW</w:t>
+        <w:t>FLEET SUMMARY</w:t>
       </w:r>
     </w:p>
     <w:p>
@@ -44,25 +44,10 @@
         <w:rPr>
           <w:b/>
         </w:rPr>
-        <w:t>Total Fleet Count:</w:t>
-      </w:r>
-      <w:r>
-        <w:t xml:space="preserve"> 41 identified assets.</w:t>
-      </w:r>
-    </w:p>
-    <w:p>
-      <w:pPr>
-        <w:pStyle w:val="ListBullet"/>
-      </w:pPr>
-      <w:r/>
-      <w:r>
-        <w:rPr>
-          <w:b/>
-        </w:rPr>
-        <w:t>Audit Status:</w:t>
-      </w:r>
-      <w:r>
-        <w:t xml:space="preserve"> Comprehensive review of all known hardware.</w:t>
+        <w:t>Total Assets Audited:</w:t>
+      </w:r>
+      <w:r>
+        <w:t xml:space="preserve"> 41</w:t>
       </w:r>
     </w:p>
     <w:p>
@@ -76,7 +61,7 @@
           <w:color w:val="1F497D"/>
           <w:sz w:val="32"/>
         </w:rPr>
-        <w:t>COMPLIANCE LOG BY LOCATION</w:t>
+        <w:t>DETAILED DEVICE AUDIT LOGS</w:t>
       </w:r>
     </w:p>
     <w:p>
@@ -86,49 +71,31 @@
       <w:r>
         <w:rPr>
           <w:rFonts w:ascii="Arial" w:hAnsi="Arial"/>
-          <w:color w:val="000000"/>
-          <w:sz w:val="28"/>
+          <w:color w:val="1F497D"/>
+          <w:sz w:val="26"/>
         </w:rPr>
         <w:t>Room: None</w:t>
       </w:r>
     </w:p>
     <w:p>
-      <w:r>
-        <w:rPr>
-          <w:b/>
-          <w:sz w:val="22"/>
-        </w:rPr>
-        <w:t>**Asset:** HP (SN: `1`) | **Last Seen:** 2026-05-04</w:t>
-      </w:r>
-    </w:p>
-    <w:p>
-      <w:pPr>
-        <w:pStyle w:val="ListBullet"/>
-      </w:pPr>
       <w:r/>
       <w:r>
         <w:rPr>
           <w:b/>
         </w:rPr>
-        <w:t>Operating System:</w:t>
-      </w:r>
-      <w:r>
-        <w:t xml:space="preserve"> Windows 11</w:t>
-      </w:r>
-    </w:p>
-    <w:p>
-      <w:pPr>
-        <w:pStyle w:val="ListBullet"/>
-      </w:pPr>
-      <w:r/>
+        <w:t>Asset:</w:t>
+      </w:r>
+      <w:r>
+        <w:t xml:space="preserve"> HP | </w:t>
+      </w:r>
       <w:r>
         <w:rPr>
           <w:b/>
         </w:rPr>
-        <w:t>Security Patching:</w:t>
-      </w:r>
-      <w:r>
-        <w:t xml:space="preserve"> yes</w:t>
+        <w:t>SN:</w:t>
+      </w:r>
+      <w:r>
+        <w:t xml:space="preserve"> 1</w:t>
       </w:r>
     </w:p>
     <w:p>
@@ -140,10 +107,10 @@
         <w:rPr>
           <w:b/>
         </w:rPr>
-        <w:t>Antivirus/Defender:</w:t>
-      </w:r>
-      <w:r>
-        <w:t xml:space="preserve"> yes</w:t>
+        <w:t>OS:</w:t>
+      </w:r>
+      <w:r>
+        <w:t xml:space="preserve"> Windows 11</w:t>
       </w:r>
     </w:p>
     <w:p>
@@ -155,32 +122,10 @@
         <w:rPr>
           <w:b/>
         </w:rPr>
-        <w:t>Engineer Notes:</w:t>
-      </w:r>
-      <w:r>
-        <w:t xml:space="preserve"> notes of issues</w:t>
-      </w:r>
-    </w:p>
-    <w:p>
-      <w:pPr>
-        <w:pStyle w:val="Heading2"/>
-      </w:pPr>
-      <w:r>
-        <w:rPr>
-          <w:rFonts w:ascii="Arial" w:hAnsi="Arial"/>
-          <w:color w:val="000000"/>
-          <w:sz w:val="28"/>
-        </w:rPr>
-        <w:t>Room: BELC Gym Music</w:t>
-      </w:r>
-    </w:p>
-    <w:p>
-      <w:r>
-        <w:rPr>
-          <w:b/>
-          <w:sz w:val="22"/>
-        </w:rPr>
-        <w:t>**Asset:** Apple A16 (SN: `F69YR6WW0L`) | **Last Seen:** 2026-05-04</w:t>
+        <w:t>Compliance:</w:t>
+      </w:r>
+      <w:r>
+        <w:t xml:space="preserve"> Updates: yes | Security: yes</w:t>
       </w:r>
     </w:p>
     <w:p>
@@ -192,40 +137,44 @@
         <w:rPr>
           <w:b/>
         </w:rPr>
-        <w:t>Operating System:</w:t>
-      </w:r>
-      <w:r>
-        <w:t xml:space="preserve"> iOS Latest</w:t>
+        <w:t>Notes:</w:t>
+      </w:r>
+      <w:r>
+        <w:t xml:space="preserve"> notes of issues</w:t>
       </w:r>
     </w:p>
     <w:p>
       <w:pPr>
-        <w:pStyle w:val="ListBullet"/>
-      </w:pPr>
+        <w:pStyle w:val="Heading2"/>
+      </w:pPr>
+      <w:r>
+        <w:rPr>
+          <w:rFonts w:ascii="Arial" w:hAnsi="Arial"/>
+          <w:color w:val="1F497D"/>
+          <w:sz w:val="26"/>
+        </w:rPr>
+        <w:t>Room: Babies One</w:t>
+      </w:r>
+    </w:p>
+    <w:p>
       <w:r/>
       <w:r>
         <w:rPr>
           <w:b/>
         </w:rPr>
-        <w:t>Photos/Media:</w:t>
-      </w:r>
-      <w:r>
-        <w:t xml:space="preserve"> 0 files found.</w:t>
-      </w:r>
-    </w:p>
-    <w:p>
-      <w:pPr>
-        <w:pStyle w:val="ListBullet"/>
-      </w:pPr>
-      <w:r/>
+        <w:t>Asset:</w:t>
+      </w:r>
+      <w:r>
+        <w:t xml:space="preserve"> Apple 9th Gen MK2L3X/A | </w:t>
+      </w:r>
       <w:r>
         <w:rPr>
           <w:b/>
         </w:rPr>
-        <w:t>Cloud Sync:</w:t>
-      </w:r>
-      <w:r>
-        <w:t xml:space="preserve"> Camera Uploads: OFF | OneDrive: ON</w:t>
+        <w:t>SN:</w:t>
+      </w:r>
+      <w:r>
+        <w:t xml:space="preserve"> KYHY9609DG</w:t>
       </w:r>
     </w:p>
     <w:p>
@@ -237,32 +186,10 @@
         <w:rPr>
           <w:b/>
         </w:rPr>
-        <w:t>Engineer Notes:</w:t>
-      </w:r>
-      <w:r>
-        <w:t xml:space="preserve"> REQUIRED ACTION: Locate / verify</w:t>
-      </w:r>
-    </w:p>
-    <w:p>
-      <w:pPr>
-        <w:pStyle w:val="Heading2"/>
-      </w:pPr>
-      <w:r>
-        <w:rPr>
-          <w:rFonts w:ascii="Arial" w:hAnsi="Arial"/>
-          <w:color w:val="000000"/>
-          <w:sz w:val="28"/>
-        </w:rPr>
-        <w:t>Room: BELC-Admin-Main</w:t>
-      </w:r>
-    </w:p>
-    <w:p>
-      <w:r>
-        <w:rPr>
-          <w:b/>
-          <w:sz w:val="22"/>
-        </w:rPr>
-        <w:t>**Asset:** HP Prodesk 500 G4 SFF (SN: `2VG42AV`) | **Last Seen:** 2026-05-04</w:t>
+        <w:t>OS:</w:t>
+      </w:r>
+      <w:r>
+        <w:t xml:space="preserve"> iOS Latest</w:t>
       </w:r>
     </w:p>
     <w:p>
@@ -274,10 +201,10 @@
         <w:rPr>
           <w:b/>
         </w:rPr>
-        <w:t>Operating System:</w:t>
-      </w:r>
-      <w:r>
-        <w:t xml:space="preserve"> Windows 10/11</w:t>
+        <w:t>Media:</w:t>
+      </w:r>
+      <w:r>
+        <w:t xml:space="preserve"> 0 Photos | Date: N/A</w:t>
       </w:r>
     </w:p>
     <w:p>
@@ -289,10 +216,10 @@
         <w:rPr>
           <w:b/>
         </w:rPr>
-        <w:t>Security Patching:</w:t>
-      </w:r>
-      <w:r>
-        <w:t xml:space="preserve"> Current</w:t>
+        <w:t>Sync:</w:t>
+      </w:r>
+      <w:r>
+        <w:t xml:space="preserve"> Camera Sync Off: No | OneDrive: Yes</w:t>
       </w:r>
     </w:p>
     <w:p>
@@ -304,62 +231,44 @@
         <w:rPr>
           <w:b/>
         </w:rPr>
-        <w:t>Antivirus/Defender:</w:t>
-      </w:r>
-      <w:r>
-        <w:t xml:space="preserve"> Passed</w:t>
+        <w:t>Notes:</w:t>
+      </w:r>
+      <w:r>
+        <w:t xml:space="preserve"> test</w:t>
       </w:r>
     </w:p>
     <w:p>
       <w:pPr>
-        <w:pStyle w:val="ListBullet"/>
-      </w:pPr>
+        <w:pStyle w:val="Heading2"/>
+      </w:pPr>
+      <w:r>
+        <w:rPr>
+          <w:rFonts w:ascii="Arial" w:hAnsi="Arial"/>
+          <w:color w:val="1F497D"/>
+          <w:sz w:val="26"/>
+        </w:rPr>
+        <w:t>Room: Babies One</w:t>
+      </w:r>
+    </w:p>
+    <w:p>
       <w:r/>
       <w:r>
         <w:rPr>
           <w:b/>
         </w:rPr>
-        <w:t>Engineer Notes:</w:t>
-      </w:r>
-      <w:r>
-        <w:t xml:space="preserve"> Admin Master</w:t>
-      </w:r>
-    </w:p>
-    <w:p>
-      <w:pPr>
-        <w:pStyle w:val="Heading2"/>
-      </w:pPr>
-      <w:r>
-        <w:rPr>
-          <w:rFonts w:ascii="Arial" w:hAnsi="Arial"/>
-          <w:color w:val="000000"/>
-          <w:sz w:val="28"/>
-        </w:rPr>
-        <w:t>Room: BELC-Admin-Second</w:t>
-      </w:r>
-    </w:p>
-    <w:p>
-      <w:r>
-        <w:rPr>
-          <w:b/>
-          <w:sz w:val="22"/>
-        </w:rPr>
-        <w:t>**Asset:** Generic  I5 (SN: `nil`) | **Last Seen:** 2026-05-04</w:t>
-      </w:r>
-    </w:p>
-    <w:p>
-      <w:pPr>
-        <w:pStyle w:val="ListBullet"/>
-      </w:pPr>
-      <w:r/>
+        <w:t>Asset:</w:t>
+      </w:r>
+      <w:r>
+        <w:t xml:space="preserve"> Samsung  Galaxy Tab A SM-T510 | </w:t>
+      </w:r>
       <w:r>
         <w:rPr>
           <w:b/>
         </w:rPr>
-        <w:t>Operating System:</w:t>
-      </w:r>
-      <w:r>
-        <w:t xml:space="preserve"> Windows N/A</w:t>
+        <w:t>SN:</w:t>
+      </w:r>
+      <w:r>
+        <w:t xml:space="preserve"> R52N61NC5ET</w:t>
       </w:r>
     </w:p>
     <w:p>
@@ -371,10 +280,10 @@
         <w:rPr>
           <w:b/>
         </w:rPr>
-        <w:t>Security Patching:</w:t>
-      </w:r>
-      <w:r>
-        <w:t xml:space="preserve"> Current</w:t>
+        <w:t>OS:</w:t>
+      </w:r>
+      <w:r>
+        <w:t xml:space="preserve"> iOS Latest</w:t>
       </w:r>
     </w:p>
     <w:p>
@@ -386,10 +295,10 @@
         <w:rPr>
           <w:b/>
         </w:rPr>
-        <w:t>Antivirus/Defender:</w:t>
-      </w:r>
-      <w:r>
-        <w:t xml:space="preserve"> Active</w:t>
+        <w:t>Media:</w:t>
+      </w:r>
+      <w:r>
+        <w:t xml:space="preserve"> 0 Photos | Date: N/A</w:t>
       </w:r>
     </w:p>
     <w:p>
@@ -401,32 +310,10 @@
         <w:rPr>
           <w:b/>
         </w:rPr>
-        <w:t>Engineer Notes:</w:t>
-      </w:r>
-      <w:r>
-        <w:t xml:space="preserve"> Bulk Import</w:t>
-      </w:r>
-    </w:p>
-    <w:p>
-      <w:pPr>
-        <w:pStyle w:val="Heading2"/>
-      </w:pPr>
-      <w:r>
-        <w:rPr>
-          <w:rFonts w:ascii="Arial" w:hAnsi="Arial"/>
-          <w:color w:val="000000"/>
-          <w:sz w:val="28"/>
-        </w:rPr>
-        <w:t>Room: Babies One</w:t>
-      </w:r>
-    </w:p>
-    <w:p>
-      <w:r>
-        <w:rPr>
-          <w:b/>
-          <w:sz w:val="22"/>
-        </w:rPr>
-        <w:t>**Asset:** Apple 9th Gen MK2L3X/A (SN: `KYHY9609DG`) | **Last Seen:** 2026-05-09</w:t>
+        <w:t>Sync:</w:t>
+      </w:r>
+      <w:r>
+        <w:t xml:space="preserve"> Camera Sync Off: Yes | OneDrive: Yes</w:t>
       </w:r>
     </w:p>
     <w:p>
@@ -438,40 +325,44 @@
         <w:rPr>
           <w:b/>
         </w:rPr>
-        <w:t>Operating System:</w:t>
-      </w:r>
-      <w:r>
-        <w:t xml:space="preserve"> iOS Latest</w:t>
+        <w:t>Notes:</w:t>
+      </w:r>
+      <w:r>
+        <w:t xml:space="preserve"> Active</w:t>
       </w:r>
     </w:p>
     <w:p>
       <w:pPr>
-        <w:pStyle w:val="ListBullet"/>
-      </w:pPr>
+        <w:pStyle w:val="Heading2"/>
+      </w:pPr>
+      <w:r>
+        <w:rPr>
+          <w:rFonts w:ascii="Arial" w:hAnsi="Arial"/>
+          <w:color w:val="1F497D"/>
+          <w:sz w:val="26"/>
+        </w:rPr>
+        <w:t>Room: Babies One</w:t>
+      </w:r>
+    </w:p>
+    <w:p>
       <w:r/>
       <w:r>
         <w:rPr>
           <w:b/>
         </w:rPr>
-        <w:t>Photos/Media:</w:t>
-      </w:r>
-      <w:r>
-        <w:t xml:space="preserve"> 0 files found.</w:t>
-      </w:r>
-    </w:p>
-    <w:p>
-      <w:pPr>
-        <w:pStyle w:val="ListBullet"/>
-      </w:pPr>
-      <w:r/>
+        <w:t>Asset:</w:t>
+      </w:r>
+      <w:r>
+        <w:t xml:space="preserve"> Hp 15S-fq3xxx | </w:t>
+      </w:r>
       <w:r>
         <w:rPr>
           <w:b/>
         </w:rPr>
-        <w:t>Cloud Sync:</w:t>
-      </w:r>
-      <w:r>
-        <w:t xml:space="preserve"> Camera Uploads: ON | OneDrive: ON</w:t>
+        <w:t>SN:</w:t>
+      </w:r>
+      <w:r>
+        <w:t xml:space="preserve"> 4Z207PA#ABG</w:t>
       </w:r>
     </w:p>
     <w:p>
@@ -483,32 +374,10 @@
         <w:rPr>
           <w:b/>
         </w:rPr>
-        <w:t>Engineer Notes:</w:t>
-      </w:r>
-      <w:r>
-        <w:t xml:space="preserve"> test</w:t>
-      </w:r>
-    </w:p>
-    <w:p>
-      <w:pPr>
-        <w:pStyle w:val="Heading2"/>
-      </w:pPr>
-      <w:r>
-        <w:rPr>
-          <w:rFonts w:ascii="Arial" w:hAnsi="Arial"/>
-          <w:color w:val="000000"/>
-          <w:sz w:val="28"/>
-        </w:rPr>
-        <w:t>Room: Babies One</w:t>
-      </w:r>
-    </w:p>
-    <w:p>
-      <w:r>
-        <w:rPr>
-          <w:b/>
-          <w:sz w:val="22"/>
-        </w:rPr>
-        <w:t>**Asset:** Hp 15S-fq3xxx (SN: `4Z207PA#ABG`) | **Last Seen:** 2026-05-04</w:t>
+        <w:t>OS:</w:t>
+      </w:r>
+      <w:r>
+        <w:t xml:space="preserve"> Windows 11</w:t>
       </w:r>
     </w:p>
     <w:p>
@@ -520,10 +389,10 @@
         <w:rPr>
           <w:b/>
         </w:rPr>
-        <w:t>Operating System:</w:t>
-      </w:r>
-      <w:r>
-        <w:t xml:space="preserve"> Windows 11</w:t>
+        <w:t>Compliance:</w:t>
+      </w:r>
+      <w:r>
+        <w:t xml:space="preserve"> Updates: N/A | Security: Passed</w:t>
       </w:r>
     </w:p>
     <w:p>
@@ -535,62 +404,44 @@
         <w:rPr>
           <w:b/>
         </w:rPr>
-        <w:t>Security Patching:</w:t>
-      </w:r>
-      <w:r>
-        <w:t xml:space="preserve"> Current</w:t>
+        <w:t>Notes:</w:t>
+      </w:r>
+      <w:r>
+        <w:t xml:space="preserve"> Active - Validated</w:t>
       </w:r>
     </w:p>
     <w:p>
       <w:pPr>
-        <w:pStyle w:val="ListBullet"/>
-      </w:pPr>
+        <w:pStyle w:val="Heading2"/>
+      </w:pPr>
+      <w:r>
+        <w:rPr>
+          <w:rFonts w:ascii="Arial" w:hAnsi="Arial"/>
+          <w:color w:val="1F497D"/>
+          <w:sz w:val="26"/>
+        </w:rPr>
+        <w:t>Room: Babies Two</w:t>
+      </w:r>
+    </w:p>
+    <w:p>
       <w:r/>
       <w:r>
         <w:rPr>
           <w:b/>
         </w:rPr>
-        <w:t>Antivirus/Defender:</w:t>
-      </w:r>
-      <w:r>
-        <w:t xml:space="preserve"> Passed</w:t>
-      </w:r>
-    </w:p>
-    <w:p>
-      <w:pPr>
-        <w:pStyle w:val="ListBullet"/>
-      </w:pPr>
-      <w:r/>
+        <w:t>Asset:</w:t>
+      </w:r>
+      <w:r>
+        <w:t xml:space="preserve"> Samsung  Galaxy Tab A7 SM-T500 | </w:t>
+      </w:r>
       <w:r>
         <w:rPr>
           <w:b/>
         </w:rPr>
-        <w:t>Engineer Notes:</w:t>
-      </w:r>
-      <w:r>
-        <w:t xml:space="preserve"> Active - Validated</w:t>
-      </w:r>
-    </w:p>
-    <w:p>
-      <w:pPr>
-        <w:pStyle w:val="Heading2"/>
-      </w:pPr>
-      <w:r>
-        <w:rPr>
-          <w:rFonts w:ascii="Arial" w:hAnsi="Arial"/>
-          <w:color w:val="000000"/>
-          <w:sz w:val="28"/>
-        </w:rPr>
-        <w:t>Room: Babies One</w:t>
-      </w:r>
-    </w:p>
-    <w:p>
-      <w:r>
-        <w:rPr>
-          <w:b/>
-          <w:sz w:val="22"/>
-        </w:rPr>
-        <w:t>**Asset:** Samsung  Galaxy Tab A SM-T510 (SN: `R52N61NC5ET`) | **Last Seen:** 2026-05-04</w:t>
+        <w:t>SN:</w:t>
+      </w:r>
+      <w:r>
+        <w:t xml:space="preserve"> R9TR80A8TBB</w:t>
       </w:r>
     </w:p>
     <w:p>
@@ -602,7 +453,7 @@
         <w:rPr>
           <w:b/>
         </w:rPr>
-        <w:t>Operating System:</w:t>
+        <w:t>OS:</w:t>
       </w:r>
       <w:r>
         <w:t xml:space="preserve"> iOS Latest</w:t>
@@ -617,10 +468,10 @@
         <w:rPr>
           <w:b/>
         </w:rPr>
-        <w:t>Photos/Media:</w:t>
-      </w:r>
-      <w:r>
-        <w:t xml:space="preserve"> 0 files found.</w:t>
+        <w:t>Media:</w:t>
+      </w:r>
+      <w:r>
+        <w:t xml:space="preserve"> 0 Photos | Date: N/A</w:t>
       </w:r>
     </w:p>
     <w:p>
@@ -632,10 +483,10 @@
         <w:rPr>
           <w:b/>
         </w:rPr>
-        <w:t>Cloud Sync:</w:t>
-      </w:r>
-      <w:r>
-        <w:t xml:space="preserve"> Camera Uploads: OFF | OneDrive: ON</w:t>
+        <w:t>Sync:</w:t>
+      </w:r>
+      <w:r>
+        <w:t xml:space="preserve"> Camera Sync Off: Yes | OneDrive: Yes</w:t>
       </w:r>
     </w:p>
     <w:p>
@@ -647,10 +498,10 @@
         <w:rPr>
           <w:b/>
         </w:rPr>
-        <w:t>Engineer Notes:</w:t>
-      </w:r>
-      <w:r>
-        <w:t xml:space="preserve"> Active</w:t>
+        <w:t>Notes:</w:t>
+      </w:r>
+      <w:r>
+        <w:t xml:space="preserve"> REQUIRED ACTION: Locate / verify</w:t>
       </w:r>
     </w:p>
     <w:p>
@@ -660,49 +511,31 @@
       <w:r>
         <w:rPr>
           <w:rFonts w:ascii="Arial" w:hAnsi="Arial"/>
-          <w:color w:val="000000"/>
-          <w:sz w:val="28"/>
+          <w:color w:val="1F497D"/>
+          <w:sz w:val="26"/>
         </w:rPr>
         <w:t>Room: Babies Two</w:t>
       </w:r>
     </w:p>
     <w:p>
-      <w:r>
-        <w:rPr>
-          <w:b/>
-          <w:sz w:val="22"/>
-        </w:rPr>
-        <w:t>**Asset:** Acer Aspire AL15-51M (SN: `NXKS5SA003343022C10X15`) | **Last Seen:** 2026-05-04</w:t>
-      </w:r>
-    </w:p>
-    <w:p>
-      <w:pPr>
-        <w:pStyle w:val="ListBullet"/>
-      </w:pPr>
       <w:r/>
       <w:r>
         <w:rPr>
           <w:b/>
         </w:rPr>
-        <w:t>Operating System:</w:t>
-      </w:r>
-      <w:r>
-        <w:t xml:space="preserve"> Windows 11</w:t>
-      </w:r>
-    </w:p>
-    <w:p>
-      <w:pPr>
-        <w:pStyle w:val="ListBullet"/>
-      </w:pPr>
-      <w:r/>
+        <w:t>Asset:</w:t>
+      </w:r>
+      <w:r>
+        <w:t xml:space="preserve"> Apple 9th Gen MK2K3X/A | </w:t>
+      </w:r>
       <w:r>
         <w:rPr>
           <w:b/>
         </w:rPr>
-        <w:t>Security Patching:</w:t>
-      </w:r>
-      <w:r>
-        <w:t xml:space="preserve"> Current</w:t>
+        <w:t>SN:</w:t>
+      </w:r>
+      <w:r>
+        <w:t xml:space="preserve"> XR7R42YN3H</w:t>
       </w:r>
     </w:p>
     <w:p>
@@ -714,10 +547,10 @@
         <w:rPr>
           <w:b/>
         </w:rPr>
-        <w:t>Antivirus/Defender:</w:t>
-      </w:r>
-      <w:r>
-        <w:t xml:space="preserve"> Passed</w:t>
+        <w:t>OS:</w:t>
+      </w:r>
+      <w:r>
+        <w:t xml:space="preserve"> iOS yes</w:t>
       </w:r>
     </w:p>
     <w:p>
@@ -729,32 +562,10 @@
         <w:rPr>
           <w:b/>
         </w:rPr>
-        <w:t>Engineer Notes:</w:t>
-      </w:r>
-      <w:r>
-        <w:t xml:space="preserve"> Active - Validated</w:t>
-      </w:r>
-    </w:p>
-    <w:p>
-      <w:pPr>
-        <w:pStyle w:val="Heading2"/>
-      </w:pPr>
-      <w:r>
-        <w:rPr>
-          <w:rFonts w:ascii="Arial" w:hAnsi="Arial"/>
-          <w:color w:val="000000"/>
-          <w:sz w:val="28"/>
-        </w:rPr>
-        <w:t>Room: Babies Two</w:t>
-      </w:r>
-    </w:p>
-    <w:p>
-      <w:r>
-        <w:rPr>
-          <w:b/>
-          <w:sz w:val="22"/>
-        </w:rPr>
-        <w:t>**Asset:** Apple 9th Gen MK2K3X/A (SN: `XR7R42YN3H`) | **Last Seen:** 2026-05-04</w:t>
+        <w:t>Media:</w:t>
+      </w:r>
+      <w:r>
+        <w:t xml:space="preserve"> 1394 Photos | Date: 2026-04-01</w:t>
       </w:r>
     </w:p>
     <w:p>
@@ -766,10 +577,10 @@
         <w:rPr>
           <w:b/>
         </w:rPr>
-        <w:t>Operating System:</w:t>
-      </w:r>
-      <w:r>
-        <w:t xml:space="preserve"> iOS yes</w:t>
+        <w:t>Sync:</w:t>
+      </w:r>
+      <w:r>
+        <w:t xml:space="preserve"> Camera Sync Off: Yes | OneDrive: Yes</w:t>
       </w:r>
     </w:p>
     <w:p>
@@ -781,62 +592,44 @@
         <w:rPr>
           <w:b/>
         </w:rPr>
-        <w:t>Photos/Media:</w:t>
-      </w:r>
-      <w:r>
-        <w:t xml:space="preserve"> 1394 files found.</w:t>
+        <w:t>Notes:</w:t>
+      </w:r>
+      <w:r>
+        <w:t xml:space="preserve"> Active / photo reduction required</w:t>
       </w:r>
     </w:p>
     <w:p>
       <w:pPr>
-        <w:pStyle w:val="ListBullet"/>
-      </w:pPr>
+        <w:pStyle w:val="Heading2"/>
+      </w:pPr>
+      <w:r>
+        <w:rPr>
+          <w:rFonts w:ascii="Arial" w:hAnsi="Arial"/>
+          <w:color w:val="1F497D"/>
+          <w:sz w:val="26"/>
+        </w:rPr>
+        <w:t>Room: Babies Two</w:t>
+      </w:r>
+    </w:p>
+    <w:p>
       <w:r/>
       <w:r>
         <w:rPr>
           <w:b/>
         </w:rPr>
-        <w:t>Cloud Sync:</w:t>
-      </w:r>
-      <w:r>
-        <w:t xml:space="preserve"> Camera Uploads: OFF | OneDrive: ON</w:t>
-      </w:r>
-    </w:p>
-    <w:p>
-      <w:pPr>
-        <w:pStyle w:val="ListBullet"/>
-      </w:pPr>
-      <w:r/>
+        <w:t>Asset:</w:t>
+      </w:r>
+      <w:r>
+        <w:t xml:space="preserve"> Acer Aspire AL15-51M | </w:t>
+      </w:r>
       <w:r>
         <w:rPr>
           <w:b/>
         </w:rPr>
-        <w:t>Engineer Notes:</w:t>
-      </w:r>
-      <w:r>
-        <w:t xml:space="preserve"> Active / photo reduction required</w:t>
-      </w:r>
-    </w:p>
-    <w:p>
-      <w:pPr>
-        <w:pStyle w:val="Heading2"/>
-      </w:pPr>
-      <w:r>
-        <w:rPr>
-          <w:rFonts w:ascii="Arial" w:hAnsi="Arial"/>
-          <w:color w:val="000000"/>
-          <w:sz w:val="28"/>
-        </w:rPr>
-        <w:t>Room: Babies Two</w:t>
-      </w:r>
-    </w:p>
-    <w:p>
-      <w:r>
-        <w:rPr>
-          <w:b/>
-          <w:sz w:val="22"/>
-        </w:rPr>
-        <w:t>**Asset:** Samsung  Galaxy Tab A7 SM-T500 (SN: `R9TR80A8TBB`) | **Last Seen:** 2026-05-04</w:t>
+        <w:t>SN:</w:t>
+      </w:r>
+      <w:r>
+        <w:t xml:space="preserve"> NXKS5SA003343022C10X15</w:t>
       </w:r>
     </w:p>
     <w:p>
@@ -848,10 +641,10 @@
         <w:rPr>
           <w:b/>
         </w:rPr>
-        <w:t>Operating System:</w:t>
-      </w:r>
-      <w:r>
-        <w:t xml:space="preserve"> iOS Latest</w:t>
+        <w:t>OS:</w:t>
+      </w:r>
+      <w:r>
+        <w:t xml:space="preserve"> Windows 11</w:t>
       </w:r>
     </w:p>
     <w:p>
@@ -863,10 +656,10 @@
         <w:rPr>
           <w:b/>
         </w:rPr>
-        <w:t>Photos/Media:</w:t>
-      </w:r>
-      <w:r>
-        <w:t xml:space="preserve"> 0 files found.</w:t>
+        <w:t>Compliance:</w:t>
+      </w:r>
+      <w:r>
+        <w:t xml:space="preserve"> Updates: N/A | Security: Passed</w:t>
       </w:r>
     </w:p>
     <w:p>
@@ -878,62 +671,44 @@
         <w:rPr>
           <w:b/>
         </w:rPr>
-        <w:t>Cloud Sync:</w:t>
-      </w:r>
-      <w:r>
-        <w:t xml:space="preserve"> Camera Uploads: OFF | OneDrive: ON</w:t>
+        <w:t>Notes:</w:t>
+      </w:r>
+      <w:r>
+        <w:t xml:space="preserve"> Active - Validated</w:t>
       </w:r>
     </w:p>
     <w:p>
       <w:pPr>
-        <w:pStyle w:val="ListBullet"/>
-      </w:pPr>
+        <w:pStyle w:val="Heading2"/>
+      </w:pPr>
+      <w:r>
+        <w:rPr>
+          <w:rFonts w:ascii="Arial" w:hAnsi="Arial"/>
+          <w:color w:val="1F497D"/>
+          <w:sz w:val="26"/>
+        </w:rPr>
+        <w:t>Room: BELC Gym Music</w:t>
+      </w:r>
+    </w:p>
+    <w:p>
       <w:r/>
       <w:r>
         <w:rPr>
           <w:b/>
         </w:rPr>
-        <w:t>Engineer Notes:</w:t>
-      </w:r>
-      <w:r>
-        <w:t xml:space="preserve"> REQUIRED ACTION: Locate / verify</w:t>
-      </w:r>
-    </w:p>
-    <w:p>
-      <w:pPr>
-        <w:pStyle w:val="Heading2"/>
-      </w:pPr>
-      <w:r>
-        <w:rPr>
-          <w:rFonts w:ascii="Arial" w:hAnsi="Arial"/>
-          <w:color w:val="000000"/>
-          <w:sz w:val="28"/>
-        </w:rPr>
-        <w:t>Room: Kate</w:t>
-      </w:r>
-    </w:p>
-    <w:p>
-      <w:r>
-        <w:rPr>
-          <w:b/>
-          <w:sz w:val="22"/>
-        </w:rPr>
-        <w:t>**Asset:** Inspiron 16 5640 (SN: `C428GB4`) | **Last Seen:** 2026-05-04</w:t>
-      </w:r>
-    </w:p>
-    <w:p>
-      <w:pPr>
-        <w:pStyle w:val="ListBullet"/>
-      </w:pPr>
-      <w:r/>
+        <w:t>Asset:</w:t>
+      </w:r>
+      <w:r>
+        <w:t xml:space="preserve"> Apple A16 | </w:t>
+      </w:r>
       <w:r>
         <w:rPr>
           <w:b/>
         </w:rPr>
-        <w:t>Operating System:</w:t>
-      </w:r>
-      <w:r>
-        <w:t xml:space="preserve"> Windows 11</w:t>
+        <w:t>SN:</w:t>
+      </w:r>
+      <w:r>
+        <w:t xml:space="preserve"> F69YR6WW0L</w:t>
       </w:r>
     </w:p>
     <w:p>
@@ -945,10 +720,10 @@
         <w:rPr>
           <w:b/>
         </w:rPr>
-        <w:t>Security Patching:</w:t>
-      </w:r>
-      <w:r>
-        <w:t xml:space="preserve"> Current</w:t>
+        <w:t>OS:</w:t>
+      </w:r>
+      <w:r>
+        <w:t xml:space="preserve"> iOS Latest</w:t>
       </w:r>
     </w:p>
     <w:p>
@@ -960,10 +735,10 @@
         <w:rPr>
           <w:b/>
         </w:rPr>
-        <w:t>Antivirus/Defender:</w:t>
-      </w:r>
-      <w:r>
-        <w:t xml:space="preserve"> Passed</w:t>
+        <w:t>Media:</w:t>
+      </w:r>
+      <w:r>
+        <w:t xml:space="preserve"> 0 Photos | Date: N/A</w:t>
       </w:r>
     </w:p>
     <w:p>
@@ -975,32 +750,10 @@
         <w:rPr>
           <w:b/>
         </w:rPr>
-        <w:t>Engineer Notes:</w:t>
-      </w:r>
-      <w:r>
-        <w:t xml:space="preserve"> Active - Validated</w:t>
-      </w:r>
-    </w:p>
-    <w:p>
-      <w:pPr>
-        <w:pStyle w:val="Heading2"/>
-      </w:pPr>
-      <w:r>
-        <w:rPr>
-          <w:rFonts w:ascii="Arial" w:hAnsi="Arial"/>
-          <w:color w:val="000000"/>
-          <w:sz w:val="28"/>
-        </w:rPr>
-        <w:t>Room: Kate</w:t>
-      </w:r>
-    </w:p>
-    <w:p>
-      <w:r>
-        <w:rPr>
-          <w:b/>
-          <w:sz w:val="22"/>
-        </w:rPr>
-        <w:t>**Asset:** Iphone 13 MLPF3X/A (SN: `LF2LRW53QW`) | **Last Seen:** 2026-05-04</w:t>
+        <w:t>Sync:</w:t>
+      </w:r>
+      <w:r>
+        <w:t xml:space="preserve"> Camera Sync Off: Yes | OneDrive: Yes</w:t>
       </w:r>
     </w:p>
     <w:p>
@@ -1012,40 +765,44 @@
         <w:rPr>
           <w:b/>
         </w:rPr>
-        <w:t>Operating System:</w:t>
-      </w:r>
-      <w:r>
-        <w:t xml:space="preserve"> iOS Latest</w:t>
+        <w:t>Notes:</w:t>
+      </w:r>
+      <w:r>
+        <w:t xml:space="preserve"> REQUIRED ACTION: Locate / verify</w:t>
       </w:r>
     </w:p>
     <w:p>
       <w:pPr>
-        <w:pStyle w:val="ListBullet"/>
-      </w:pPr>
+        <w:pStyle w:val="Heading2"/>
+      </w:pPr>
+      <w:r>
+        <w:rPr>
+          <w:rFonts w:ascii="Arial" w:hAnsi="Arial"/>
+          <w:color w:val="1F497D"/>
+          <w:sz w:val="26"/>
+        </w:rPr>
+        <w:t>Room: BELC-Admin-Main</w:t>
+      </w:r>
+    </w:p>
+    <w:p>
       <w:r/>
       <w:r>
         <w:rPr>
           <w:b/>
         </w:rPr>
-        <w:t>Photos/Media:</w:t>
-      </w:r>
-      <w:r>
-        <w:t xml:space="preserve"> 0 files found.</w:t>
-      </w:r>
-    </w:p>
-    <w:p>
-      <w:pPr>
-        <w:pStyle w:val="ListBullet"/>
-      </w:pPr>
-      <w:r/>
+        <w:t>Asset:</w:t>
+      </w:r>
+      <w:r>
+        <w:t xml:space="preserve"> HP Prodesk 500 G4 SFF | </w:t>
+      </w:r>
       <w:r>
         <w:rPr>
           <w:b/>
         </w:rPr>
-        <w:t>Cloud Sync:</w:t>
-      </w:r>
-      <w:r>
-        <w:t xml:space="preserve"> Camera Uploads: OFF | OneDrive: ON</w:t>
+        <w:t>SN:</w:t>
+      </w:r>
+      <w:r>
+        <w:t xml:space="preserve"> 2VG42AV</w:t>
       </w:r>
     </w:p>
     <w:p>
@@ -1057,32 +814,10 @@
         <w:rPr>
           <w:b/>
         </w:rPr>
-        <w:t>Engineer Notes:</w:t>
-      </w:r>
-      <w:r>
-        <w:t xml:space="preserve"> REQUIRED ACTION: Locate / verify</w:t>
-      </w:r>
-    </w:p>
-    <w:p>
-      <w:pPr>
-        <w:pStyle w:val="Heading2"/>
-      </w:pPr>
-      <w:r>
-        <w:rPr>
-          <w:rFonts w:ascii="Arial" w:hAnsi="Arial"/>
-          <w:color w:val="000000"/>
-          <w:sz w:val="28"/>
-        </w:rPr>
-        <w:t>Room: Kindy On e</w:t>
-      </w:r>
-    </w:p>
-    <w:p>
-      <w:r>
-        <w:rPr>
-          <w:b/>
-          <w:sz w:val="22"/>
-        </w:rPr>
-        <w:t>**Asset:** Dell 15 DC1520 (SN: `9DVJ4C4`) | **Last Seen:** 2026-05-04</w:t>
+        <w:t>OS:</w:t>
+      </w:r>
+      <w:r>
+        <w:t xml:space="preserve"> Windows 10/11</w:t>
       </w:r>
     </w:p>
     <w:p>
@@ -1094,10 +829,10 @@
         <w:rPr>
           <w:b/>
         </w:rPr>
-        <w:t>Operating System:</w:t>
-      </w:r>
-      <w:r>
-        <w:t xml:space="preserve"> Windows 11</w:t>
+        <w:t>Compliance:</w:t>
+      </w:r>
+      <w:r>
+        <w:t xml:space="preserve"> Updates: N/A | Security: Passed</w:t>
       </w:r>
     </w:p>
     <w:p>
@@ -1109,62 +844,44 @@
         <w:rPr>
           <w:b/>
         </w:rPr>
-        <w:t>Security Patching:</w:t>
-      </w:r>
-      <w:r>
-        <w:t xml:space="preserve"> Current</w:t>
+        <w:t>Notes:</w:t>
+      </w:r>
+      <w:r>
+        <w:t xml:space="preserve"> Admin Master</w:t>
       </w:r>
     </w:p>
     <w:p>
       <w:pPr>
-        <w:pStyle w:val="ListBullet"/>
-      </w:pPr>
+        <w:pStyle w:val="Heading2"/>
+      </w:pPr>
+      <w:r>
+        <w:rPr>
+          <w:rFonts w:ascii="Arial" w:hAnsi="Arial"/>
+          <w:color w:val="1F497D"/>
+          <w:sz w:val="26"/>
+        </w:rPr>
+        <w:t>Room: BELC-Admin-Second</w:t>
+      </w:r>
+    </w:p>
+    <w:p>
       <w:r/>
       <w:r>
         <w:rPr>
           <w:b/>
         </w:rPr>
-        <w:t>Antivirus/Defender:</w:t>
-      </w:r>
-      <w:r>
-        <w:t xml:space="preserve"> Passed</w:t>
-      </w:r>
-    </w:p>
-    <w:p>
-      <w:pPr>
-        <w:pStyle w:val="ListBullet"/>
-      </w:pPr>
-      <w:r/>
+        <w:t>Asset:</w:t>
+      </w:r>
+      <w:r>
+        <w:t xml:space="preserve"> Generic  I5 | </w:t>
+      </w:r>
       <w:r>
         <w:rPr>
           <w:b/>
         </w:rPr>
-        <w:t>Engineer Notes:</w:t>
-      </w:r>
-      <w:r>
-        <w:t xml:space="preserve"> Active - Validated</w:t>
-      </w:r>
-    </w:p>
-    <w:p>
-      <w:pPr>
-        <w:pStyle w:val="Heading2"/>
-      </w:pPr>
-      <w:r>
-        <w:rPr>
-          <w:rFonts w:ascii="Arial" w:hAnsi="Arial"/>
-          <w:color w:val="000000"/>
-          <w:sz w:val="28"/>
-        </w:rPr>
-        <w:t>Room: Kindy One</w:t>
-      </w:r>
-    </w:p>
-    <w:p>
-      <w:r>
-        <w:rPr>
-          <w:b/>
-          <w:sz w:val="22"/>
-        </w:rPr>
-        <w:t>**Asset:** Apple 9th Gen MK2K3X/A (SN: `X9RQGD1QWM`) | **Last Seen:** 2026-05-04</w:t>
+        <w:t>SN:</w:t>
+      </w:r>
+      <w:r>
+        <w:t xml:space="preserve"> nil</w:t>
       </w:r>
     </w:p>
     <w:p>
@@ -1176,10 +893,10 @@
         <w:rPr>
           <w:b/>
         </w:rPr>
-        <w:t>Operating System:</w:t>
-      </w:r>
-      <w:r>
-        <w:t xml:space="preserve"> iOS yes</w:t>
+        <w:t>OS:</w:t>
+      </w:r>
+      <w:r>
+        <w:t xml:space="preserve"> Windows N/A</w:t>
       </w:r>
     </w:p>
     <w:p>
@@ -1191,10 +908,10 @@
         <w:rPr>
           <w:b/>
         </w:rPr>
-        <w:t>Photos/Media:</w:t>
-      </w:r>
-      <w:r>
-        <w:t xml:space="preserve"> 924 files found.</w:t>
+        <w:t>Compliance:</w:t>
+      </w:r>
+      <w:r>
+        <w:t xml:space="preserve"> Updates: N/A | Security: N/A</w:t>
       </w:r>
     </w:p>
     <w:p>
@@ -1206,62 +923,44 @@
         <w:rPr>
           <w:b/>
         </w:rPr>
-        <w:t>Cloud Sync:</w:t>
-      </w:r>
-      <w:r>
-        <w:t xml:space="preserve"> Camera Uploads: OFF | OneDrive: ON</w:t>
+        <w:t>Notes:</w:t>
+      </w:r>
+      <w:r>
+        <w:t xml:space="preserve"> Bulk Import</w:t>
       </w:r>
     </w:p>
     <w:p>
       <w:pPr>
-        <w:pStyle w:val="ListBullet"/>
-      </w:pPr>
+        <w:pStyle w:val="Heading2"/>
+      </w:pPr>
+      <w:r>
+        <w:rPr>
+          <w:rFonts w:ascii="Arial" w:hAnsi="Arial"/>
+          <w:color w:val="1F497D"/>
+          <w:sz w:val="26"/>
+        </w:rPr>
+        <w:t>Room: Kate</w:t>
+      </w:r>
+    </w:p>
+    <w:p>
       <w:r/>
       <w:r>
         <w:rPr>
           <w:b/>
         </w:rPr>
-        <w:t>Engineer Notes:</w:t>
-      </w:r>
-      <w:r>
-        <w:t xml:space="preserve"> Active / photo reduction required</w:t>
-      </w:r>
-    </w:p>
-    <w:p>
-      <w:pPr>
-        <w:pStyle w:val="Heading2"/>
-      </w:pPr>
-      <w:r>
-        <w:rPr>
-          <w:rFonts w:ascii="Arial" w:hAnsi="Arial"/>
-          <w:color w:val="000000"/>
-          <w:sz w:val="28"/>
-        </w:rPr>
-        <w:t>Room: Kindy One</w:t>
-      </w:r>
-    </w:p>
-    <w:p>
-      <w:r>
-        <w:rPr>
-          <w:b/>
-          <w:sz w:val="22"/>
-        </w:rPr>
-        <w:t>**Asset:** Commbox Classic 65 (SN: `2204C6503010022`) | **Last Seen:** 2026-05-04</w:t>
-      </w:r>
-    </w:p>
-    <w:p>
-      <w:pPr>
-        <w:pStyle w:val="ListBullet"/>
-      </w:pPr>
-      <w:r/>
+        <w:t>Asset:</w:t>
+      </w:r>
+      <w:r>
+        <w:t xml:space="preserve"> Iphone 13 MLPF3X/A | </w:t>
+      </w:r>
       <w:r>
         <w:rPr>
           <w:b/>
         </w:rPr>
-        <w:t>Operating System:</w:t>
-      </w:r>
-      <w:r>
-        <w:t xml:space="preserve"> Windows N/A</w:t>
+        <w:t>SN:</w:t>
+      </w:r>
+      <w:r>
+        <w:t xml:space="preserve"> LF2LRW53QW</w:t>
       </w:r>
     </w:p>
     <w:p>
@@ -1273,10 +972,10 @@
         <w:rPr>
           <w:b/>
         </w:rPr>
-        <w:t>Security Patching:</w:t>
-      </w:r>
-      <w:r>
-        <w:t xml:space="preserve"> Current</w:t>
+        <w:t>OS:</w:t>
+      </w:r>
+      <w:r>
+        <w:t xml:space="preserve"> iOS Latest</w:t>
       </w:r>
     </w:p>
     <w:p>
@@ -1288,10 +987,10 @@
         <w:rPr>
           <w:b/>
         </w:rPr>
-        <w:t>Antivirus/Defender:</w:t>
-      </w:r>
-      <w:r>
-        <w:t xml:space="preserve"> Active</w:t>
+        <w:t>Media:</w:t>
+      </w:r>
+      <w:r>
+        <w:t xml:space="preserve"> 0 Photos | Date: N/A</w:t>
       </w:r>
     </w:p>
     <w:p>
@@ -1303,32 +1002,10 @@
         <w:rPr>
           <w:b/>
         </w:rPr>
-        <w:t>Engineer Notes:</w:t>
-      </w:r>
-      <w:r>
-        <w:t xml:space="preserve"> Bulk Import</w:t>
-      </w:r>
-    </w:p>
-    <w:p>
-      <w:pPr>
-        <w:pStyle w:val="Heading2"/>
-      </w:pPr>
-      <w:r>
-        <w:rPr>
-          <w:rFonts w:ascii="Arial" w:hAnsi="Arial"/>
-          <w:color w:val="000000"/>
-          <w:sz w:val="28"/>
-        </w:rPr>
-        <w:t>Room: Kindy Two</w:t>
-      </w:r>
-    </w:p>
-    <w:p>
-      <w:r>
-        <w:rPr>
-          <w:b/>
-          <w:sz w:val="22"/>
-        </w:rPr>
-        <w:t>**Asset:** Apple 9th Gen MK2K3X/A (SN: `MCPF3X11J9`) | **Last Seen:** 2026-05-04</w:t>
+        <w:t>Sync:</w:t>
+      </w:r>
+      <w:r>
+        <w:t xml:space="preserve"> Camera Sync Off: Yes | OneDrive: Yes</w:t>
       </w:r>
     </w:p>
     <w:p>
@@ -1340,40 +1017,44 @@
         <w:rPr>
           <w:b/>
         </w:rPr>
-        <w:t>Operating System:</w:t>
-      </w:r>
-      <w:r>
-        <w:t xml:space="preserve"> iOS Latest</w:t>
+        <w:t>Notes:</w:t>
+      </w:r>
+      <w:r>
+        <w:t xml:space="preserve"> REQUIRED ACTION: Locate / verify</w:t>
       </w:r>
     </w:p>
     <w:p>
       <w:pPr>
-        <w:pStyle w:val="ListBullet"/>
-      </w:pPr>
+        <w:pStyle w:val="Heading2"/>
+      </w:pPr>
+      <w:r>
+        <w:rPr>
+          <w:rFonts w:ascii="Arial" w:hAnsi="Arial"/>
+          <w:color w:val="1F497D"/>
+          <w:sz w:val="26"/>
+        </w:rPr>
+        <w:t>Room: Kate</w:t>
+      </w:r>
+    </w:p>
+    <w:p>
       <w:r/>
       <w:r>
         <w:rPr>
           <w:b/>
         </w:rPr>
-        <w:t>Photos/Media:</w:t>
-      </w:r>
-      <w:r>
-        <w:t xml:space="preserve"> 670 files found.</w:t>
-      </w:r>
-    </w:p>
-    <w:p>
-      <w:pPr>
-        <w:pStyle w:val="ListBullet"/>
-      </w:pPr>
-      <w:r/>
+        <w:t>Asset:</w:t>
+      </w:r>
+      <w:r>
+        <w:t xml:space="preserve"> Inspiron 16 5640 | </w:t>
+      </w:r>
       <w:r>
         <w:rPr>
           <w:b/>
         </w:rPr>
-        <w:t>Cloud Sync:</w:t>
-      </w:r>
-      <w:r>
-        <w:t xml:space="preserve"> Camera Uploads: OFF | OneDrive: ON</w:t>
+        <w:t>SN:</w:t>
+      </w:r>
+      <w:r>
+        <w:t xml:space="preserve"> C428GB4</w:t>
       </w:r>
     </w:p>
     <w:p>
@@ -1385,32 +1066,10 @@
         <w:rPr>
           <w:b/>
         </w:rPr>
-        <w:t>Engineer Notes:</w:t>
-      </w:r>
-      <w:r>
-        <w:t xml:space="preserve"> Active / photo reduction required</w:t>
-      </w:r>
-    </w:p>
-    <w:p>
-      <w:pPr>
-        <w:pStyle w:val="Heading2"/>
-      </w:pPr>
-      <w:r>
-        <w:rPr>
-          <w:rFonts w:ascii="Arial" w:hAnsi="Arial"/>
-          <w:color w:val="000000"/>
-          <w:sz w:val="28"/>
-        </w:rPr>
-        <w:t>Room: Kindy Two</w:t>
-      </w:r>
-    </w:p>
-    <w:p>
-      <w:r>
-        <w:rPr>
-          <w:b/>
-          <w:sz w:val="22"/>
-        </w:rPr>
-        <w:t>**Asset:** Commbox Classic 65 (SN: `2204C6503010020`) | **Last Seen:** 2026-05-04</w:t>
+        <w:t>OS:</w:t>
+      </w:r>
+      <w:r>
+        <w:t xml:space="preserve"> Windows 11</w:t>
       </w:r>
     </w:p>
     <w:p>
@@ -1422,10 +1081,10 @@
         <w:rPr>
           <w:b/>
         </w:rPr>
-        <w:t>Operating System:</w:t>
-      </w:r>
-      <w:r>
-        <w:t xml:space="preserve"> Windows N/A</w:t>
+        <w:t>Compliance:</w:t>
+      </w:r>
+      <w:r>
+        <w:t xml:space="preserve"> Updates: N/A | Security: Passed</w:t>
       </w:r>
     </w:p>
     <w:p>
@@ -1437,62 +1096,44 @@
         <w:rPr>
           <w:b/>
         </w:rPr>
-        <w:t>Security Patching:</w:t>
-      </w:r>
-      <w:r>
-        <w:t xml:space="preserve"> Current</w:t>
+        <w:t>Notes:</w:t>
+      </w:r>
+      <w:r>
+        <w:t xml:space="preserve"> Active - Validated</w:t>
       </w:r>
     </w:p>
     <w:p>
       <w:pPr>
-        <w:pStyle w:val="ListBullet"/>
-      </w:pPr>
+        <w:pStyle w:val="Heading2"/>
+      </w:pPr>
+      <w:r>
+        <w:rPr>
+          <w:rFonts w:ascii="Arial" w:hAnsi="Arial"/>
+          <w:color w:val="1F497D"/>
+          <w:sz w:val="26"/>
+        </w:rPr>
+        <w:t>Room: Kindy On e</w:t>
+      </w:r>
+    </w:p>
+    <w:p>
       <w:r/>
       <w:r>
         <w:rPr>
           <w:b/>
         </w:rPr>
-        <w:t>Antivirus/Defender:</w:t>
-      </w:r>
-      <w:r>
-        <w:t xml:space="preserve"> Active</w:t>
-      </w:r>
-    </w:p>
-    <w:p>
-      <w:pPr>
-        <w:pStyle w:val="ListBullet"/>
-      </w:pPr>
-      <w:r/>
+        <w:t>Asset:</w:t>
+      </w:r>
+      <w:r>
+        <w:t xml:space="preserve"> Dell 15 DC1520 | </w:t>
+      </w:r>
       <w:r>
         <w:rPr>
           <w:b/>
         </w:rPr>
-        <w:t>Engineer Notes:</w:t>
-      </w:r>
-      <w:r>
-        <w:t xml:space="preserve"> Bulk Import</w:t>
-      </w:r>
-    </w:p>
-    <w:p>
-      <w:pPr>
-        <w:pStyle w:val="Heading2"/>
-      </w:pPr>
-      <w:r>
-        <w:rPr>
-          <w:rFonts w:ascii="Arial" w:hAnsi="Arial"/>
-          <w:color w:val="000000"/>
-          <w:sz w:val="28"/>
-        </w:rPr>
-        <w:t>Room: Kindy Two</w:t>
-      </w:r>
-    </w:p>
-    <w:p>
-      <w:r>
-        <w:rPr>
-          <w:b/>
-          <w:sz w:val="22"/>
-        </w:rPr>
-        <w:t>**Asset:** Dell 15 DC1520 (SN: `hbvDPC4`) | **Last Seen:** 2026-05-04</w:t>
+        <w:t>SN:</w:t>
+      </w:r>
+      <w:r>
+        <w:t xml:space="preserve"> 9DVJ4C4</w:t>
       </w:r>
     </w:p>
     <w:p>
@@ -1504,7 +1145,7 @@
         <w:rPr>
           <w:b/>
         </w:rPr>
-        <w:t>Operating System:</w:t>
+        <w:t>OS:</w:t>
       </w:r>
       <w:r>
         <w:t xml:space="preserve"> Windows 11</w:t>
@@ -1519,10 +1160,10 @@
         <w:rPr>
           <w:b/>
         </w:rPr>
-        <w:t>Security Patching:</w:t>
-      </w:r>
-      <w:r>
-        <w:t xml:space="preserve"> Current</w:t>
+        <w:t>Compliance:</w:t>
+      </w:r>
+      <w:r>
+        <w:t xml:space="preserve"> Updates: N/A | Security: Passed</w:t>
       </w:r>
     </w:p>
     <w:p>
@@ -1534,62 +1175,44 @@
         <w:rPr>
           <w:b/>
         </w:rPr>
-        <w:t>Antivirus/Defender:</w:t>
-      </w:r>
-      <w:r>
-        <w:t xml:space="preserve"> Passed</w:t>
+        <w:t>Notes:</w:t>
+      </w:r>
+      <w:r>
+        <w:t xml:space="preserve"> Active - Validated</w:t>
       </w:r>
     </w:p>
     <w:p>
       <w:pPr>
-        <w:pStyle w:val="ListBullet"/>
-      </w:pPr>
+        <w:pStyle w:val="Heading2"/>
+      </w:pPr>
+      <w:r>
+        <w:rPr>
+          <w:rFonts w:ascii="Arial" w:hAnsi="Arial"/>
+          <w:color w:val="1F497D"/>
+          <w:sz w:val="26"/>
+        </w:rPr>
+        <w:t>Room: Kindy One</w:t>
+      </w:r>
+    </w:p>
+    <w:p>
       <w:r/>
       <w:r>
         <w:rPr>
           <w:b/>
         </w:rPr>
-        <w:t>Engineer Notes:</w:t>
-      </w:r>
-      <w:r>
-        <w:t xml:space="preserve"> Active - Validated</w:t>
-      </w:r>
-    </w:p>
-    <w:p>
-      <w:pPr>
-        <w:pStyle w:val="Heading2"/>
-      </w:pPr>
-      <w:r>
-        <w:rPr>
-          <w:rFonts w:ascii="Arial" w:hAnsi="Arial"/>
-          <w:color w:val="000000"/>
-          <w:sz w:val="28"/>
-        </w:rPr>
-        <w:t>Room: Kindy Two</w:t>
-      </w:r>
-    </w:p>
-    <w:p>
-      <w:r>
-        <w:rPr>
-          <w:b/>
-          <w:sz w:val="22"/>
-        </w:rPr>
-        <w:t>**Asset:** Samsung  Galaxy Tab A7 SM-T500 (SN: `R9TR70W810E`) | **Last Seen:** 2026-05-04</w:t>
-      </w:r>
-    </w:p>
-    <w:p>
-      <w:pPr>
-        <w:pStyle w:val="ListBullet"/>
-      </w:pPr>
-      <w:r/>
+        <w:t>Asset:</w:t>
+      </w:r>
+      <w:r>
+        <w:t xml:space="preserve"> Commbox Classic 65 | </w:t>
+      </w:r>
       <w:r>
         <w:rPr>
           <w:b/>
         </w:rPr>
-        <w:t>Operating System:</w:t>
-      </w:r>
-      <w:r>
-        <w:t xml:space="preserve"> iOS Latest</w:t>
+        <w:t>SN:</w:t>
+      </w:r>
+      <w:r>
+        <w:t xml:space="preserve"> 2204C6503010022</w:t>
       </w:r>
     </w:p>
     <w:p>
@@ -1601,10 +1224,10 @@
         <w:rPr>
           <w:b/>
         </w:rPr>
-        <w:t>Photos/Media:</w:t>
-      </w:r>
-      <w:r>
-        <w:t xml:space="preserve"> 0 files found.</w:t>
+        <w:t>OS:</w:t>
+      </w:r>
+      <w:r>
+        <w:t xml:space="preserve"> Windows N/A</w:t>
       </w:r>
     </w:p>
     <w:p>
@@ -1616,10 +1239,10 @@
         <w:rPr>
           <w:b/>
         </w:rPr>
-        <w:t>Cloud Sync:</w:t>
-      </w:r>
-      <w:r>
-        <w:t xml:space="preserve"> Camera Uploads: OFF | OneDrive: ON</w:t>
+        <w:t>Compliance:</w:t>
+      </w:r>
+      <w:r>
+        <w:t xml:space="preserve"> Updates: N/A | Security: N/A</w:t>
       </w:r>
     </w:p>
     <w:p>
@@ -1631,10 +1254,10 @@
         <w:rPr>
           <w:b/>
         </w:rPr>
-        <w:t>Engineer Notes:</w:t>
-      </w:r>
-      <w:r>
-        <w:t xml:space="preserve"> REQUIRED ACTION: Locate / verify</w:t>
+        <w:t>Notes:</w:t>
+      </w:r>
+      <w:r>
+        <w:t xml:space="preserve"> Bulk Import</w:t>
       </w:r>
     </w:p>
     <w:p>
@@ -1644,49 +1267,31 @@
       <w:r>
         <w:rPr>
           <w:rFonts w:ascii="Arial" w:hAnsi="Arial"/>
-          <w:color w:val="000000"/>
-          <w:sz w:val="28"/>
+          <w:color w:val="1F497D"/>
+          <w:sz w:val="26"/>
         </w:rPr>
-        <w:t>Room: Kitchen</w:t>
+        <w:t>Room: Kindy One</w:t>
       </w:r>
     </w:p>
     <w:p>
-      <w:r>
-        <w:rPr>
-          <w:b/>
-          <w:sz w:val="22"/>
-        </w:rPr>
-        <w:t>**Asset:** Samsung  Galaxy Tab A8 SM-X200 (SN: `R9YT10FE&lt;VJ`) | **Last Seen:** 2026-05-04</w:t>
-      </w:r>
-    </w:p>
-    <w:p>
-      <w:pPr>
-        <w:pStyle w:val="ListBullet"/>
-      </w:pPr>
       <w:r/>
       <w:r>
         <w:rPr>
           <w:b/>
         </w:rPr>
-        <w:t>Operating System:</w:t>
-      </w:r>
-      <w:r>
-        <w:t xml:space="preserve"> iOS Latest</w:t>
-      </w:r>
-    </w:p>
-    <w:p>
-      <w:pPr>
-        <w:pStyle w:val="ListBullet"/>
-      </w:pPr>
-      <w:r/>
+        <w:t>Asset:</w:t>
+      </w:r>
+      <w:r>
+        <w:t xml:space="preserve"> Apple 9th Gen MK2K3X/A | </w:t>
+      </w:r>
       <w:r>
         <w:rPr>
           <w:b/>
         </w:rPr>
-        <w:t>Photos/Media:</w:t>
-      </w:r>
-      <w:r>
-        <w:t xml:space="preserve"> 0 files found.</w:t>
+        <w:t>SN:</w:t>
+      </w:r>
+      <w:r>
+        <w:t xml:space="preserve"> X9RQGD1QWM</w:t>
       </w:r>
     </w:p>
     <w:p>
@@ -1698,10 +1303,10 @@
         <w:rPr>
           <w:b/>
         </w:rPr>
-        <w:t>Cloud Sync:</w:t>
-      </w:r>
-      <w:r>
-        <w:t xml:space="preserve"> Camera Uploads: OFF | OneDrive: ON</w:t>
+        <w:t>OS:</w:t>
+      </w:r>
+      <w:r>
+        <w:t xml:space="preserve"> iOS yes</w:t>
       </w:r>
     </w:p>
     <w:p>
@@ -1713,32 +1318,10 @@
         <w:rPr>
           <w:b/>
         </w:rPr>
-        <w:t>Engineer Notes:</w:t>
-      </w:r>
-      <w:r>
-        <w:t xml:space="preserve"> REQUIRED ACTION: Locate / verify</w:t>
-      </w:r>
-    </w:p>
-    <w:p>
-      <w:pPr>
-        <w:pStyle w:val="Heading2"/>
-      </w:pPr>
-      <w:r>
-        <w:rPr>
-          <w:rFonts w:ascii="Arial" w:hAnsi="Arial"/>
-          <w:color w:val="000000"/>
-          <w:sz w:val="28"/>
-        </w:rPr>
-        <w:t>Room: Kylie</w:t>
-      </w:r>
-    </w:p>
-    <w:p>
-      <w:r>
-        <w:rPr>
-          <w:b/>
-          <w:sz w:val="22"/>
-        </w:rPr>
-        <w:t>**Asset:** Dell Inspiron 16 7640 2 in 1 (SN: `CMTF044`) | **Last Seen:** 2026-05-04</w:t>
+        <w:t>Media:</w:t>
+      </w:r>
+      <w:r>
+        <w:t xml:space="preserve"> 924 Photos | Date: 2026-04-01</w:t>
       </w:r>
     </w:p>
     <w:p>
@@ -1750,10 +1333,10 @@
         <w:rPr>
           <w:b/>
         </w:rPr>
-        <w:t>Operating System:</w:t>
-      </w:r>
-      <w:r>
-        <w:t xml:space="preserve"> Windows 11</w:t>
+        <w:t>Sync:</w:t>
+      </w:r>
+      <w:r>
+        <w:t xml:space="preserve"> Camera Sync Off: Yes | OneDrive: Yes</w:t>
       </w:r>
     </w:p>
     <w:p>
@@ -1765,62 +1348,44 @@
         <w:rPr>
           <w:b/>
         </w:rPr>
-        <w:t>Security Patching:</w:t>
-      </w:r>
-      <w:r>
-        <w:t xml:space="preserve"> Current</w:t>
+        <w:t>Notes:</w:t>
+      </w:r>
+      <w:r>
+        <w:t xml:space="preserve"> Active / photo reduction required</w:t>
       </w:r>
     </w:p>
     <w:p>
       <w:pPr>
-        <w:pStyle w:val="ListBullet"/>
-      </w:pPr>
+        <w:pStyle w:val="Heading2"/>
+      </w:pPr>
+      <w:r>
+        <w:rPr>
+          <w:rFonts w:ascii="Arial" w:hAnsi="Arial"/>
+          <w:color w:val="1F497D"/>
+          <w:sz w:val="26"/>
+        </w:rPr>
+        <w:t>Room: Kindy Two</w:t>
+      </w:r>
+    </w:p>
+    <w:p>
       <w:r/>
       <w:r>
         <w:rPr>
           <w:b/>
         </w:rPr>
-        <w:t>Antivirus/Defender:</w:t>
-      </w:r>
-      <w:r>
-        <w:t xml:space="preserve"> Passed</w:t>
-      </w:r>
-    </w:p>
-    <w:p>
-      <w:pPr>
-        <w:pStyle w:val="ListBullet"/>
-      </w:pPr>
-      <w:r/>
+        <w:t>Asset:</w:t>
+      </w:r>
+      <w:r>
+        <w:t xml:space="preserve"> Commbox Classic 65 | </w:t>
+      </w:r>
       <w:r>
         <w:rPr>
           <w:b/>
         </w:rPr>
-        <w:t>Engineer Notes:</w:t>
-      </w:r>
-      <w:r>
-        <w:t xml:space="preserve"> Active - Validated</w:t>
-      </w:r>
-    </w:p>
-    <w:p>
-      <w:pPr>
-        <w:pStyle w:val="Heading2"/>
-      </w:pPr>
-      <w:r>
-        <w:rPr>
-          <w:rFonts w:ascii="Arial" w:hAnsi="Arial"/>
-          <w:color w:val="000000"/>
-          <w:sz w:val="28"/>
-        </w:rPr>
-        <w:t>Room: Kylie</w:t>
-      </w:r>
-    </w:p>
-    <w:p>
-      <w:r>
-        <w:rPr>
-          <w:b/>
-          <w:sz w:val="22"/>
-        </w:rPr>
-        <w:t>**Asset:** IPhone 14 Pro Max (SN: `TV39PR9WI9`) | **Last Seen:** 2026-05-04</w:t>
+        <w:t>SN:</w:t>
+      </w:r>
+      <w:r>
+        <w:t xml:space="preserve"> 2204C6503010020</w:t>
       </w:r>
     </w:p>
     <w:p>
@@ -1832,10 +1397,10 @@
         <w:rPr>
           <w:b/>
         </w:rPr>
-        <w:t>Operating System:</w:t>
-      </w:r>
-      <w:r>
-        <w:t xml:space="preserve"> iOS Latest</w:t>
+        <w:t>OS:</w:t>
+      </w:r>
+      <w:r>
+        <w:t xml:space="preserve"> Windows N/A</w:t>
       </w:r>
     </w:p>
     <w:p>
@@ -1847,10 +1412,10 @@
         <w:rPr>
           <w:b/>
         </w:rPr>
-        <w:t>Photos/Media:</w:t>
-      </w:r>
-      <w:r>
-        <w:t xml:space="preserve"> 0 files found.</w:t>
+        <w:t>Compliance:</w:t>
+      </w:r>
+      <w:r>
+        <w:t xml:space="preserve"> Updates: N/A | Security: N/A</w:t>
       </w:r>
     </w:p>
     <w:p>
@@ -1862,62 +1427,44 @@
         <w:rPr>
           <w:b/>
         </w:rPr>
-        <w:t>Cloud Sync:</w:t>
-      </w:r>
-      <w:r>
-        <w:t xml:space="preserve"> Camera Uploads: OFF | OneDrive: ON</w:t>
+        <w:t>Notes:</w:t>
+      </w:r>
+      <w:r>
+        <w:t xml:space="preserve"> Bulk Import</w:t>
       </w:r>
     </w:p>
     <w:p>
       <w:pPr>
-        <w:pStyle w:val="ListBullet"/>
-      </w:pPr>
+        <w:pStyle w:val="Heading2"/>
+      </w:pPr>
+      <w:r>
+        <w:rPr>
+          <w:rFonts w:ascii="Arial" w:hAnsi="Arial"/>
+          <w:color w:val="1F497D"/>
+          <w:sz w:val="26"/>
+        </w:rPr>
+        <w:t>Room: Kindy Two</w:t>
+      </w:r>
+    </w:p>
+    <w:p>
       <w:r/>
       <w:r>
         <w:rPr>
           <w:b/>
         </w:rPr>
-        <w:t>Engineer Notes:</w:t>
-      </w:r>
-      <w:r>
-        <w:t xml:space="preserve"> REQUIRED ACTION: Locate / verify</w:t>
-      </w:r>
-    </w:p>
-    <w:p>
-      <w:pPr>
-        <w:pStyle w:val="Heading2"/>
-      </w:pPr>
-      <w:r>
-        <w:rPr>
-          <w:rFonts w:ascii="Arial" w:hAnsi="Arial"/>
-          <w:color w:val="000000"/>
-          <w:sz w:val="28"/>
-        </w:rPr>
-        <w:t>Room: Melissa</w:t>
-      </w:r>
-    </w:p>
-    <w:p>
-      <w:r>
-        <w:rPr>
-          <w:b/>
-          <w:sz w:val="22"/>
-        </w:rPr>
-        <w:t>**Asset:** HP 15s-eq2xxx (SN: `5CD2170QH1Y`) | **Last Seen:** 2026-05-09</w:t>
-      </w:r>
-    </w:p>
-    <w:p>
-      <w:pPr>
-        <w:pStyle w:val="ListBullet"/>
-      </w:pPr>
-      <w:r/>
+        <w:t>Asset:</w:t>
+      </w:r>
+      <w:r>
+        <w:t xml:space="preserve"> Apple 9th Gen MK2K3X/A | </w:t>
+      </w:r>
       <w:r>
         <w:rPr>
           <w:b/>
         </w:rPr>
-        <w:t>Operating System:</w:t>
-      </w:r>
-      <w:r>
-        <w:t xml:space="preserve"> Windows N/A</w:t>
+        <w:t>SN:</w:t>
+      </w:r>
+      <w:r>
+        <w:t xml:space="preserve"> MCPF3X11J9</w:t>
       </w:r>
     </w:p>
     <w:p>
@@ -1929,10 +1476,10 @@
         <w:rPr>
           <w:b/>
         </w:rPr>
-        <w:t>Security Patching:</w:t>
-      </w:r>
-      <w:r>
-        <w:t xml:space="preserve"> Current</w:t>
+        <w:t>OS:</w:t>
+      </w:r>
+      <w:r>
+        <w:t xml:space="preserve"> iOS Latest</w:t>
       </w:r>
     </w:p>
     <w:p>
@@ -1944,10 +1491,10 @@
         <w:rPr>
           <w:b/>
         </w:rPr>
-        <w:t>Antivirus/Defender:</w:t>
-      </w:r>
-      <w:r>
-        <w:t xml:space="preserve"> Active</w:t>
+        <w:t>Media:</w:t>
+      </w:r>
+      <w:r>
+        <w:t xml:space="preserve"> 670 Photos | Date: 2026-04-01</w:t>
       </w:r>
     </w:p>
     <w:p>
@@ -1959,32 +1506,10 @@
         <w:rPr>
           <w:b/>
         </w:rPr>
-        <w:t>Engineer Notes:</w:t>
-      </w:r>
-      <w:r>
-        <w:t xml:space="preserve"> test</w:t>
-      </w:r>
-    </w:p>
-    <w:p>
-      <w:pPr>
-        <w:pStyle w:val="Heading2"/>
-      </w:pPr>
-      <w:r>
-        <w:rPr>
-          <w:rFonts w:ascii="Arial" w:hAnsi="Arial"/>
-          <w:color w:val="000000"/>
-          <w:sz w:val="28"/>
-        </w:rPr>
-        <w:t>Room: OSHC</w:t>
-      </w:r>
-    </w:p>
-    <w:p>
-      <w:r>
-        <w:rPr>
-          <w:b/>
-          <w:sz w:val="22"/>
-        </w:rPr>
-        <w:t>**Asset:** Apple 9th Gen MK2K3X/A (SN: `KN2Y3Q2RTY`) | **Last Seen:** 2026-05-04</w:t>
+        <w:t>Sync:</w:t>
+      </w:r>
+      <w:r>
+        <w:t xml:space="preserve"> Camera Sync Off: Yes | OneDrive: Yes</w:t>
       </w:r>
     </w:p>
     <w:p>
@@ -1996,40 +1521,44 @@
         <w:rPr>
           <w:b/>
         </w:rPr>
-        <w:t>Operating System:</w:t>
-      </w:r>
-      <w:r>
-        <w:t xml:space="preserve"> iOS yes</w:t>
+        <w:t>Notes:</w:t>
+      </w:r>
+      <w:r>
+        <w:t xml:space="preserve"> Active / photo reduction required</w:t>
       </w:r>
     </w:p>
     <w:p>
       <w:pPr>
-        <w:pStyle w:val="ListBullet"/>
-      </w:pPr>
+        <w:pStyle w:val="Heading2"/>
+      </w:pPr>
+      <w:r>
+        <w:rPr>
+          <w:rFonts w:ascii="Arial" w:hAnsi="Arial"/>
+          <w:color w:val="1F497D"/>
+          <w:sz w:val="26"/>
+        </w:rPr>
+        <w:t>Room: Kindy Two</w:t>
+      </w:r>
+    </w:p>
+    <w:p>
       <w:r/>
       <w:r>
         <w:rPr>
           <w:b/>
         </w:rPr>
-        <w:t>Photos/Media:</w:t>
-      </w:r>
-      <w:r>
-        <w:t xml:space="preserve"> 256 files found.</w:t>
-      </w:r>
-    </w:p>
-    <w:p>
-      <w:pPr>
-        <w:pStyle w:val="ListBullet"/>
-      </w:pPr>
-      <w:r/>
+        <w:t>Asset:</w:t>
+      </w:r>
+      <w:r>
+        <w:t xml:space="preserve"> Samsung  Galaxy Tab A7 SM-T500 | </w:t>
+      </w:r>
       <w:r>
         <w:rPr>
           <w:b/>
         </w:rPr>
-        <w:t>Cloud Sync:</w:t>
-      </w:r>
-      <w:r>
-        <w:t xml:space="preserve"> Camera Uploads: OFF | OneDrive: ON</w:t>
+        <w:t>SN:</w:t>
+      </w:r>
+      <w:r>
+        <w:t xml:space="preserve"> R9TR70W810E</w:t>
       </w:r>
     </w:p>
     <w:p>
@@ -2041,32 +1570,10 @@
         <w:rPr>
           <w:b/>
         </w:rPr>
-        <w:t>Engineer Notes:</w:t>
-      </w:r>
-      <w:r>
-        <w:t xml:space="preserve"> Active / photo reduction required</w:t>
-      </w:r>
-    </w:p>
-    <w:p>
-      <w:pPr>
-        <w:pStyle w:val="Heading2"/>
-      </w:pPr>
-      <w:r>
-        <w:rPr>
-          <w:rFonts w:ascii="Arial" w:hAnsi="Arial"/>
-          <w:color w:val="000000"/>
-          <w:sz w:val="28"/>
-        </w:rPr>
-        <w:t>Room: OSHC</w:t>
-      </w:r>
-    </w:p>
-    <w:p>
-      <w:r>
-        <w:rPr>
-          <w:b/>
-          <w:sz w:val="22"/>
-        </w:rPr>
-        <w:t>**Asset:** HP 15S-fq3xxx (SN: `4z2007pa#ABG`) | **Last Seen:** 2026-05-04</w:t>
+        <w:t>OS:</w:t>
+      </w:r>
+      <w:r>
+        <w:t xml:space="preserve"> iOS Latest</w:t>
       </w:r>
     </w:p>
     <w:p>
@@ -2078,10 +1585,10 @@
         <w:rPr>
           <w:b/>
         </w:rPr>
-        <w:t>Operating System:</w:t>
-      </w:r>
-      <w:r>
-        <w:t xml:space="preserve"> Windows N/A</w:t>
+        <w:t>Media:</w:t>
+      </w:r>
+      <w:r>
+        <w:t xml:space="preserve"> 0 Photos | Date: N/A</w:t>
       </w:r>
     </w:p>
     <w:p>
@@ -2093,10 +1600,10 @@
         <w:rPr>
           <w:b/>
         </w:rPr>
-        <w:t>Security Patching:</w:t>
-      </w:r>
-      <w:r>
-        <w:t xml:space="preserve"> Current</w:t>
+        <w:t>Sync:</w:t>
+      </w:r>
+      <w:r>
+        <w:t xml:space="preserve"> Camera Sync Off: Yes | OneDrive: Yes</w:t>
       </w:r>
     </w:p>
     <w:p>
@@ -2108,62 +1615,44 @@
         <w:rPr>
           <w:b/>
         </w:rPr>
-        <w:t>Antivirus/Defender:</w:t>
-      </w:r>
-      <w:r>
-        <w:t xml:space="preserve"> Active</w:t>
+        <w:t>Notes:</w:t>
+      </w:r>
+      <w:r>
+        <w:t xml:space="preserve"> REQUIRED ACTION: Locate / verify</w:t>
       </w:r>
     </w:p>
     <w:p>
       <w:pPr>
-        <w:pStyle w:val="ListBullet"/>
-      </w:pPr>
+        <w:pStyle w:val="Heading2"/>
+      </w:pPr>
+      <w:r>
+        <w:rPr>
+          <w:rFonts w:ascii="Arial" w:hAnsi="Arial"/>
+          <w:color w:val="1F497D"/>
+          <w:sz w:val="26"/>
+        </w:rPr>
+        <w:t>Room: Kindy Two</w:t>
+      </w:r>
+    </w:p>
+    <w:p>
       <w:r/>
       <w:r>
         <w:rPr>
           <w:b/>
         </w:rPr>
-        <w:t>Engineer Notes:</w:t>
-      </w:r>
-      <w:r>
-        <w:t xml:space="preserve"> Bulk Import</w:t>
-      </w:r>
-    </w:p>
-    <w:p>
-      <w:pPr>
-        <w:pStyle w:val="Heading2"/>
-      </w:pPr>
-      <w:r>
-        <w:rPr>
-          <w:rFonts w:ascii="Arial" w:hAnsi="Arial"/>
-          <w:color w:val="000000"/>
-          <w:sz w:val="28"/>
-        </w:rPr>
-        <w:t>Room: Pre Kindy</w:t>
-      </w:r>
-    </w:p>
-    <w:p>
-      <w:r>
-        <w:rPr>
-          <w:b/>
-          <w:sz w:val="22"/>
-        </w:rPr>
-        <w:t>**Asset:** Apple 9th Gen MK2K3X/A (SN: `YH4VWHXJ2N`) | **Last Seen:** 2026-05-04</w:t>
-      </w:r>
-    </w:p>
-    <w:p>
-      <w:pPr>
-        <w:pStyle w:val="ListBullet"/>
-      </w:pPr>
-      <w:r/>
+        <w:t>Asset:</w:t>
+      </w:r>
+      <w:r>
+        <w:t xml:space="preserve"> Dell 15 DC1520 | </w:t>
+      </w:r>
       <w:r>
         <w:rPr>
           <w:b/>
         </w:rPr>
-        <w:t>Operating System:</w:t>
-      </w:r>
-      <w:r>
-        <w:t xml:space="preserve"> iOS yes</w:t>
+        <w:t>SN:</w:t>
+      </w:r>
+      <w:r>
+        <w:t xml:space="preserve"> hbvDPC4</w:t>
       </w:r>
     </w:p>
     <w:p>
@@ -2175,10 +1664,10 @@
         <w:rPr>
           <w:b/>
         </w:rPr>
-        <w:t>Photos/Media:</w:t>
-      </w:r>
-      <w:r>
-        <w:t xml:space="preserve"> 477 files found.</w:t>
+        <w:t>OS:</w:t>
+      </w:r>
+      <w:r>
+        <w:t xml:space="preserve"> Windows 11</w:t>
       </w:r>
     </w:p>
     <w:p>
@@ -2190,10 +1679,10 @@
         <w:rPr>
           <w:b/>
         </w:rPr>
-        <w:t>Cloud Sync:</w:t>
-      </w:r>
-      <w:r>
-        <w:t xml:space="preserve"> Camera Uploads: OFF | OneDrive: ON</w:t>
+        <w:t>Compliance:</w:t>
+      </w:r>
+      <w:r>
+        <w:t xml:space="preserve"> Updates: N/A | Security: Passed</w:t>
       </w:r>
     </w:p>
     <w:p>
@@ -2205,10 +1694,10 @@
         <w:rPr>
           <w:b/>
         </w:rPr>
-        <w:t>Engineer Notes:</w:t>
-      </w:r>
-      <w:r>
-        <w:t xml:space="preserve"> Active / photo reduction required</w:t>
+        <w:t>Notes:</w:t>
+      </w:r>
+      <w:r>
+        <w:t xml:space="preserve"> Active - Validated</w:t>
       </w:r>
     </w:p>
     <w:p>
@@ -2218,49 +1707,31 @@
       <w:r>
         <w:rPr>
           <w:rFonts w:ascii="Arial" w:hAnsi="Arial"/>
-          <w:color w:val="000000"/>
-          <w:sz w:val="28"/>
+          <w:color w:val="1F497D"/>
+          <w:sz w:val="26"/>
         </w:rPr>
-        <w:t>Room: Pre Kindy</w:t>
+        <w:t>Room: Kitchen</w:t>
       </w:r>
     </w:p>
     <w:p>
-      <w:r>
-        <w:rPr>
-          <w:b/>
-          <w:sz w:val="22"/>
-        </w:rPr>
-        <w:t>**Asset:** Samsung  Galaxy Tab A SM-T510 (SN: `R52N813V92R`) | **Last Seen:** 2026-05-04</w:t>
-      </w:r>
-    </w:p>
-    <w:p>
-      <w:pPr>
-        <w:pStyle w:val="ListBullet"/>
-      </w:pPr>
       <w:r/>
       <w:r>
         <w:rPr>
           <w:b/>
         </w:rPr>
-        <w:t>Operating System:</w:t>
-      </w:r>
-      <w:r>
-        <w:t xml:space="preserve"> iOS Latest</w:t>
-      </w:r>
-    </w:p>
-    <w:p>
-      <w:pPr>
-        <w:pStyle w:val="ListBullet"/>
-      </w:pPr>
-      <w:r/>
+        <w:t>Asset:</w:t>
+      </w:r>
+      <w:r>
+        <w:t xml:space="preserve"> Samsung  Galaxy Tab A8 SM-X200 | </w:t>
+      </w:r>
       <w:r>
         <w:rPr>
           <w:b/>
         </w:rPr>
-        <w:t>Photos/Media:</w:t>
-      </w:r>
-      <w:r>
-        <w:t xml:space="preserve"> 0 files found.</w:t>
+        <w:t>SN:</w:t>
+      </w:r>
+      <w:r>
+        <w:t xml:space="preserve"> R9YT10FE&lt;VJ</w:t>
       </w:r>
     </w:p>
     <w:p>
@@ -2272,10 +1743,10 @@
         <w:rPr>
           <w:b/>
         </w:rPr>
-        <w:t>Cloud Sync:</w:t>
-      </w:r>
-      <w:r>
-        <w:t xml:space="preserve"> Camera Uploads: OFF | OneDrive: ON</w:t>
+        <w:t>OS:</w:t>
+      </w:r>
+      <w:r>
+        <w:t xml:space="preserve"> iOS Latest</w:t>
       </w:r>
     </w:p>
     <w:p>
@@ -2287,32 +1758,10 @@
         <w:rPr>
           <w:b/>
         </w:rPr>
-        <w:t>Engineer Notes:</w:t>
-      </w:r>
-      <w:r>
-        <w:t xml:space="preserve"> Active</w:t>
-      </w:r>
-    </w:p>
-    <w:p>
-      <w:pPr>
-        <w:pStyle w:val="Heading2"/>
-      </w:pPr>
-      <w:r>
-        <w:rPr>
-          <w:rFonts w:ascii="Arial" w:hAnsi="Arial"/>
-          <w:color w:val="000000"/>
-          <w:sz w:val="28"/>
-        </w:rPr>
-        <w:t>Room: Russell</w:t>
-      </w:r>
-    </w:p>
-    <w:p>
-      <w:r>
-        <w:rPr>
-          <w:b/>
-          <w:sz w:val="22"/>
-        </w:rPr>
-        <w:t>**Asset:** Iphone 15 MTP03ZP/A (SN: `JD9JqDPX4L`) | **Last Seen:** 2026-05-04</w:t>
+        <w:t>Media:</w:t>
+      </w:r>
+      <w:r>
+        <w:t xml:space="preserve"> 0 Photos | Date: N/A</w:t>
       </w:r>
     </w:p>
     <w:p>
@@ -2324,10 +1773,10 @@
         <w:rPr>
           <w:b/>
         </w:rPr>
-        <w:t>Operating System:</w:t>
-      </w:r>
-      <w:r>
-        <w:t xml:space="preserve"> iOS Latest</w:t>
+        <w:t>Sync:</w:t>
+      </w:r>
+      <w:r>
+        <w:t xml:space="preserve"> Camera Sync Off: Yes | OneDrive: Yes</w:t>
       </w:r>
     </w:p>
     <w:p>
@@ -2339,62 +1788,44 @@
         <w:rPr>
           <w:b/>
         </w:rPr>
-        <w:t>Photos/Media:</w:t>
-      </w:r>
-      <w:r>
-        <w:t xml:space="preserve"> 0 files found.</w:t>
+        <w:t>Notes:</w:t>
+      </w:r>
+      <w:r>
+        <w:t xml:space="preserve"> REQUIRED ACTION: Locate / verify</w:t>
       </w:r>
     </w:p>
     <w:p>
       <w:pPr>
-        <w:pStyle w:val="ListBullet"/>
-      </w:pPr>
+        <w:pStyle w:val="Heading2"/>
+      </w:pPr>
+      <w:r>
+        <w:rPr>
+          <w:rFonts w:ascii="Arial" w:hAnsi="Arial"/>
+          <w:color w:val="1F497D"/>
+          <w:sz w:val="26"/>
+        </w:rPr>
+        <w:t>Room: Kylie</w:t>
+      </w:r>
+    </w:p>
+    <w:p>
       <w:r/>
       <w:r>
         <w:rPr>
           <w:b/>
         </w:rPr>
-        <w:t>Cloud Sync:</w:t>
-      </w:r>
-      <w:r>
-        <w:t xml:space="preserve"> Camera Uploads: OFF | OneDrive: ON</w:t>
-      </w:r>
-    </w:p>
-    <w:p>
-      <w:pPr>
-        <w:pStyle w:val="ListBullet"/>
-      </w:pPr>
-      <w:r/>
+        <w:t>Asset:</w:t>
+      </w:r>
+      <w:r>
+        <w:t xml:space="preserve"> IPhone 14 Pro Max | </w:t>
+      </w:r>
       <w:r>
         <w:rPr>
           <w:b/>
         </w:rPr>
-        <w:t>Engineer Notes:</w:t>
-      </w:r>
-      <w:r>
-        <w:t xml:space="preserve"> REQUIRED ACTION: Locate / verify</w:t>
-      </w:r>
-    </w:p>
-    <w:p>
-      <w:pPr>
-        <w:pStyle w:val="Heading2"/>
-      </w:pPr>
-      <w:r>
-        <w:rPr>
-          <w:rFonts w:ascii="Arial" w:hAnsi="Arial"/>
-          <w:color w:val="000000"/>
-          <w:sz w:val="28"/>
-        </w:rPr>
-        <w:t>Room: Senior Kindy</w:t>
-      </w:r>
-    </w:p>
-    <w:p>
-      <w:r>
-        <w:rPr>
-          <w:b/>
-          <w:sz w:val="22"/>
-        </w:rPr>
-        <w:t>**Asset:** Apple 9th Gen MK2K3X/A (SN: `W5VJ6EJF4M`) | **Last Seen:** 2026-05-04</w:t>
+        <w:t>SN:</w:t>
+      </w:r>
+      <w:r>
+        <w:t xml:space="preserve"> TV39PR9WI9</w:t>
       </w:r>
     </w:p>
     <w:p>
@@ -2406,10 +1837,10 @@
         <w:rPr>
           <w:b/>
         </w:rPr>
-        <w:t>Operating System:</w:t>
-      </w:r>
-      <w:r>
-        <w:t xml:space="preserve"> iOS yes</w:t>
+        <w:t>OS:</w:t>
+      </w:r>
+      <w:r>
+        <w:t xml:space="preserve"> iOS Latest</w:t>
       </w:r>
     </w:p>
     <w:p>
@@ -2421,10 +1852,10 @@
         <w:rPr>
           <w:b/>
         </w:rPr>
-        <w:t>Photos/Media:</w:t>
-      </w:r>
-      <w:r>
-        <w:t xml:space="preserve"> 872 files found.</w:t>
+        <w:t>Media:</w:t>
+      </w:r>
+      <w:r>
+        <w:t xml:space="preserve"> 0 Photos | Date: N/A</w:t>
       </w:r>
     </w:p>
     <w:p>
@@ -2436,10 +1867,10 @@
         <w:rPr>
           <w:b/>
         </w:rPr>
-        <w:t>Cloud Sync:</w:t>
-      </w:r>
-      <w:r>
-        <w:t xml:space="preserve"> Camera Uploads: OFF | OneDrive: OFF</w:t>
+        <w:t>Sync:</w:t>
+      </w:r>
+      <w:r>
+        <w:t xml:space="preserve"> Camera Sync Off: Yes | OneDrive: Yes</w:t>
       </w:r>
     </w:p>
     <w:p>
@@ -2451,10 +1882,10 @@
         <w:rPr>
           <w:b/>
         </w:rPr>
-        <w:t>Engineer Notes:</w:t>
-      </w:r>
-      <w:r>
-        <w:t xml:space="preserve"> Active / remediation required - password fail</w:t>
+        <w:t>Notes:</w:t>
+      </w:r>
+      <w:r>
+        <w:t xml:space="preserve"> REQUIRED ACTION: Locate / verify</w:t>
       </w:r>
     </w:p>
     <w:p>
@@ -2464,49 +1895,31 @@
       <w:r>
         <w:rPr>
           <w:rFonts w:ascii="Arial" w:hAnsi="Arial"/>
-          <w:color w:val="000000"/>
-          <w:sz w:val="28"/>
+          <w:color w:val="1F497D"/>
+          <w:sz w:val="26"/>
         </w:rPr>
-        <w:t>Room: Senior Kindy</w:t>
+        <w:t>Room: Kylie</w:t>
       </w:r>
     </w:p>
     <w:p>
-      <w:r>
-        <w:rPr>
-          <w:b/>
-          <w:sz w:val="22"/>
-        </w:rPr>
-        <w:t>**Asset:** HP 15-FD0xxx (SN: `B69K9PA#ABG`) | **Last Seen:** 2026-05-04</w:t>
-      </w:r>
-    </w:p>
-    <w:p>
-      <w:pPr>
-        <w:pStyle w:val="ListBullet"/>
-      </w:pPr>
       <w:r/>
       <w:r>
         <w:rPr>
           <w:b/>
         </w:rPr>
-        <w:t>Operating System:</w:t>
-      </w:r>
-      <w:r>
-        <w:t xml:space="preserve"> Windows 11</w:t>
-      </w:r>
-    </w:p>
-    <w:p>
-      <w:pPr>
-        <w:pStyle w:val="ListBullet"/>
-      </w:pPr>
-      <w:r/>
+        <w:t>Asset:</w:t>
+      </w:r>
+      <w:r>
+        <w:t xml:space="preserve"> Dell Inspiron 16 7640 2 in 1 | </w:t>
+      </w:r>
       <w:r>
         <w:rPr>
           <w:b/>
         </w:rPr>
-        <w:t>Security Patching:</w:t>
-      </w:r>
-      <w:r>
-        <w:t xml:space="preserve"> Current</w:t>
+        <w:t>SN:</w:t>
+      </w:r>
+      <w:r>
+        <w:t xml:space="preserve"> CMTF044</w:t>
       </w:r>
     </w:p>
     <w:p>
@@ -2518,10 +1931,10 @@
         <w:rPr>
           <w:b/>
         </w:rPr>
-        <w:t>Antivirus/Defender:</w:t>
-      </w:r>
-      <w:r>
-        <w:t xml:space="preserve"> Passed</w:t>
+        <w:t>OS:</w:t>
+      </w:r>
+      <w:r>
+        <w:t xml:space="preserve"> Windows 11</w:t>
       </w:r>
     </w:p>
     <w:p>
@@ -2533,32 +1946,10 @@
         <w:rPr>
           <w:b/>
         </w:rPr>
-        <w:t>Engineer Notes:</w:t>
-      </w:r>
-      <w:r>
-        <w:t xml:space="preserve"> Active - Validated</w:t>
-      </w:r>
-    </w:p>
-    <w:p>
-      <w:pPr>
-        <w:pStyle w:val="Heading2"/>
-      </w:pPr>
-      <w:r>
-        <w:rPr>
-          <w:rFonts w:ascii="Arial" w:hAnsi="Arial"/>
-          <w:color w:val="000000"/>
-          <w:sz w:val="28"/>
-        </w:rPr>
-        <w:t>Room: Senior Kindy</w:t>
-      </w:r>
-    </w:p>
-    <w:p>
-      <w:r>
-        <w:rPr>
-          <w:b/>
-          <w:sz w:val="22"/>
-        </w:rPr>
-        <w:t>**Asset:** Samsung  Galaxy Tab A7 SM-T500 (SN: `R9Tr70w8q1y`) | **Last Seen:** 2026-05-04</w:t>
+        <w:t>Compliance:</w:t>
+      </w:r>
+      <w:r>
+        <w:t xml:space="preserve"> Updates: N/A | Security: Passed</w:t>
       </w:r>
     </w:p>
     <w:p>
@@ -2570,40 +1961,44 @@
         <w:rPr>
           <w:b/>
         </w:rPr>
-        <w:t>Operating System:</w:t>
-      </w:r>
-      <w:r>
-        <w:t xml:space="preserve"> iOS Latest</w:t>
+        <w:t>Notes:</w:t>
+      </w:r>
+      <w:r>
+        <w:t xml:space="preserve"> Active - Validated</w:t>
       </w:r>
     </w:p>
     <w:p>
       <w:pPr>
-        <w:pStyle w:val="ListBullet"/>
-      </w:pPr>
+        <w:pStyle w:val="Heading2"/>
+      </w:pPr>
+      <w:r>
+        <w:rPr>
+          <w:rFonts w:ascii="Arial" w:hAnsi="Arial"/>
+          <w:color w:val="1F497D"/>
+          <w:sz w:val="26"/>
+        </w:rPr>
+        <w:t>Room: Melissa</w:t>
+      </w:r>
+    </w:p>
+    <w:p>
       <w:r/>
       <w:r>
         <w:rPr>
           <w:b/>
         </w:rPr>
-        <w:t>Photos/Media:</w:t>
-      </w:r>
-      <w:r>
-        <w:t xml:space="preserve"> 0 files found.</w:t>
-      </w:r>
-    </w:p>
-    <w:p>
-      <w:pPr>
-        <w:pStyle w:val="ListBullet"/>
-      </w:pPr>
-      <w:r/>
+        <w:t>Asset:</w:t>
+      </w:r>
+      <w:r>
+        <w:t xml:space="preserve"> HP 15s-eq2xxx | </w:t>
+      </w:r>
       <w:r>
         <w:rPr>
           <w:b/>
         </w:rPr>
-        <w:t>Cloud Sync:</w:t>
-      </w:r>
-      <w:r>
-        <w:t xml:space="preserve"> Camera Uploads: OFF | OneDrive: ON</w:t>
+        <w:t>SN:</w:t>
+      </w:r>
+      <w:r>
+        <w:t xml:space="preserve"> 5CD2170QH1Y</w:t>
       </w:r>
     </w:p>
     <w:p>
@@ -2615,32 +2010,10 @@
         <w:rPr>
           <w:b/>
         </w:rPr>
-        <w:t>Engineer Notes:</w:t>
-      </w:r>
-      <w:r>
-        <w:t xml:space="preserve"> Active</w:t>
-      </w:r>
-    </w:p>
-    <w:p>
-      <w:pPr>
-        <w:pStyle w:val="Heading2"/>
-      </w:pPr>
-      <w:r>
-        <w:rPr>
-          <w:rFonts w:ascii="Arial" w:hAnsi="Arial"/>
-          <w:color w:val="000000"/>
-          <w:sz w:val="28"/>
-        </w:rPr>
-        <w:t>Room: Simona</w:t>
-      </w:r>
-    </w:p>
-    <w:p>
-      <w:r>
-        <w:rPr>
-          <w:b/>
-          <w:sz w:val="22"/>
-        </w:rPr>
-        <w:t>**Asset:** Dell Inspiron 16 7640 2 in 1 (SN: `JHWW444`) | **Last Seen:** 2026-05-04</w:t>
+        <w:t>OS:</w:t>
+      </w:r>
+      <w:r>
+        <w:t xml:space="preserve"> Windows N/A</w:t>
       </w:r>
     </w:p>
     <w:p>
@@ -2652,10 +2025,10 @@
         <w:rPr>
           <w:b/>
         </w:rPr>
-        <w:t>Operating System:</w:t>
-      </w:r>
-      <w:r>
-        <w:t xml:space="preserve"> Windows 11</w:t>
+        <w:t>Compliance:</w:t>
+      </w:r>
+      <w:r>
+        <w:t xml:space="preserve"> Updates: N/A | Security: N/A</w:t>
       </w:r>
     </w:p>
     <w:p>
@@ -2667,62 +2040,44 @@
         <w:rPr>
           <w:b/>
         </w:rPr>
-        <w:t>Security Patching:</w:t>
-      </w:r>
-      <w:r>
-        <w:t xml:space="preserve"> Current</w:t>
+        <w:t>Notes:</w:t>
+      </w:r>
+      <w:r>
+        <w:t xml:space="preserve"> test</w:t>
       </w:r>
     </w:p>
     <w:p>
       <w:pPr>
-        <w:pStyle w:val="ListBullet"/>
-      </w:pPr>
+        <w:pStyle w:val="Heading2"/>
+      </w:pPr>
+      <w:r>
+        <w:rPr>
+          <w:rFonts w:ascii="Arial" w:hAnsi="Arial"/>
+          <w:color w:val="1F497D"/>
+          <w:sz w:val="26"/>
+        </w:rPr>
+        <w:t>Room: OSHC</w:t>
+      </w:r>
+    </w:p>
+    <w:p>
       <w:r/>
       <w:r>
         <w:rPr>
           <w:b/>
         </w:rPr>
-        <w:t>Antivirus/Defender:</w:t>
-      </w:r>
-      <w:r>
-        <w:t xml:space="preserve"> Passed</w:t>
-      </w:r>
-    </w:p>
-    <w:p>
-      <w:pPr>
-        <w:pStyle w:val="ListBullet"/>
-      </w:pPr>
-      <w:r/>
+        <w:t>Asset:</w:t>
+      </w:r>
+      <w:r>
+        <w:t xml:space="preserve"> Apple 9th Gen MK2K3X/A | </w:t>
+      </w:r>
       <w:r>
         <w:rPr>
           <w:b/>
         </w:rPr>
-        <w:t>Engineer Notes:</w:t>
-      </w:r>
-      <w:r>
-        <w:t xml:space="preserve"> Active - Validated</w:t>
-      </w:r>
-    </w:p>
-    <w:p>
-      <w:pPr>
-        <w:pStyle w:val="Heading2"/>
-      </w:pPr>
-      <w:r>
-        <w:rPr>
-          <w:rFonts w:ascii="Arial" w:hAnsi="Arial"/>
-          <w:color w:val="000000"/>
-          <w:sz w:val="28"/>
-        </w:rPr>
-        <w:t>Room: Simona</w:t>
-      </w:r>
-    </w:p>
-    <w:p>
-      <w:r>
-        <w:rPr>
-          <w:b/>
-          <w:sz w:val="22"/>
-        </w:rPr>
-        <w:t>**Asset:** Iphone 14 Pro Max (SN: `DDP2QXF6H9`) | **Last Seen:** 2026-05-04</w:t>
+        <w:t>SN:</w:t>
+      </w:r>
+      <w:r>
+        <w:t xml:space="preserve"> KN2Y3Q2RTY</w:t>
       </w:r>
     </w:p>
     <w:p>
@@ -2734,10 +2089,10 @@
         <w:rPr>
           <w:b/>
         </w:rPr>
-        <w:t>Operating System:</w:t>
-      </w:r>
-      <w:r>
-        <w:t xml:space="preserve"> iOS Latest</w:t>
+        <w:t>OS:</w:t>
+      </w:r>
+      <w:r>
+        <w:t xml:space="preserve"> iOS yes</w:t>
       </w:r>
     </w:p>
     <w:p>
@@ -2749,10 +2104,10 @@
         <w:rPr>
           <w:b/>
         </w:rPr>
-        <w:t>Photos/Media:</w:t>
-      </w:r>
-      <w:r>
-        <w:t xml:space="preserve"> 0 files found.</w:t>
+        <w:t>Media:</w:t>
+      </w:r>
+      <w:r>
+        <w:t xml:space="preserve"> 256 Photos | Date: 2026-04-01</w:t>
       </w:r>
     </w:p>
     <w:p>
@@ -2764,10 +2119,10 @@
         <w:rPr>
           <w:b/>
         </w:rPr>
-        <w:t>Cloud Sync:</w:t>
-      </w:r>
-      <w:r>
-        <w:t xml:space="preserve"> Camera Uploads: OFF | OneDrive: ON</w:t>
+        <w:t>Sync:</w:t>
+      </w:r>
+      <w:r>
+        <w:t xml:space="preserve"> Camera Sync Off: Yes | OneDrive: Yes</w:t>
       </w:r>
     </w:p>
     <w:p>
@@ -2779,10 +2134,10 @@
         <w:rPr>
           <w:b/>
         </w:rPr>
-        <w:t>Engineer Notes:</w:t>
-      </w:r>
-      <w:r>
-        <w:t xml:space="preserve"> REQUIRED ACTION: Locate / verify</w:t>
+        <w:t>Notes:</w:t>
+      </w:r>
+      <w:r>
+        <w:t xml:space="preserve"> Active / photo reduction required</w:t>
       </w:r>
     </w:p>
     <w:p>
@@ -2792,49 +2147,31 @@
       <w:r>
         <w:rPr>
           <w:rFonts w:ascii="Arial" w:hAnsi="Arial"/>
-          <w:color w:val="000000"/>
-          <w:sz w:val="28"/>
+          <w:color w:val="1F497D"/>
+          <w:sz w:val="26"/>
         </w:rPr>
-        <w:t>Room: Toddlers One</w:t>
+        <w:t>Room: OSHC</w:t>
       </w:r>
     </w:p>
     <w:p>
-      <w:r>
-        <w:rPr>
-          <w:b/>
-          <w:sz w:val="22"/>
-        </w:rPr>
-        <w:t>**Asset:** Acer Aspire AL15-51M (SN: `NXXRSSA00134300fb50x15`) | **Last Seen:** 2026-05-04</w:t>
-      </w:r>
-    </w:p>
-    <w:p>
-      <w:pPr>
-        <w:pStyle w:val="ListBullet"/>
-      </w:pPr>
       <w:r/>
       <w:r>
         <w:rPr>
           <w:b/>
         </w:rPr>
-        <w:t>Operating System:</w:t>
-      </w:r>
-      <w:r>
-        <w:t xml:space="preserve"> Windows 11</w:t>
-      </w:r>
-    </w:p>
-    <w:p>
-      <w:pPr>
-        <w:pStyle w:val="ListBullet"/>
-      </w:pPr>
-      <w:r/>
+        <w:t>Asset:</w:t>
+      </w:r>
+      <w:r>
+        <w:t xml:space="preserve"> HP 15S-fq3xxx | </w:t>
+      </w:r>
       <w:r>
         <w:rPr>
           <w:b/>
         </w:rPr>
-        <w:t>Security Patching:</w:t>
-      </w:r>
-      <w:r>
-        <w:t xml:space="preserve"> Current</w:t>
+        <w:t>SN:</w:t>
+      </w:r>
+      <w:r>
+        <w:t xml:space="preserve"> 4z2007pa#ABG</w:t>
       </w:r>
     </w:p>
     <w:p>
@@ -2846,10 +2183,10 @@
         <w:rPr>
           <w:b/>
         </w:rPr>
-        <w:t>Antivirus/Defender:</w:t>
-      </w:r>
-      <w:r>
-        <w:t xml:space="preserve"> Passed</w:t>
+        <w:t>OS:</w:t>
+      </w:r>
+      <w:r>
+        <w:t xml:space="preserve"> Windows N/A</w:t>
       </w:r>
     </w:p>
     <w:p>
@@ -2861,32 +2198,10 @@
         <w:rPr>
           <w:b/>
         </w:rPr>
-        <w:t>Engineer Notes:</w:t>
-      </w:r>
-      <w:r>
-        <w:t xml:space="preserve"> Active - Validated</w:t>
-      </w:r>
-    </w:p>
-    <w:p>
-      <w:pPr>
-        <w:pStyle w:val="Heading2"/>
-      </w:pPr>
-      <w:r>
-        <w:rPr>
-          <w:rFonts w:ascii="Arial" w:hAnsi="Arial"/>
-          <w:color w:val="000000"/>
-          <w:sz w:val="28"/>
-        </w:rPr>
-        <w:t>Room: Toddlers One</w:t>
-      </w:r>
-    </w:p>
-    <w:p>
-      <w:r>
-        <w:rPr>
-          <w:b/>
-          <w:sz w:val="22"/>
-        </w:rPr>
-        <w:t>**Asset:** Apple 9th Gen MK2K3X/A (SN: `GV3XHHC4CH`) | **Last Seen:** 2026-05-04</w:t>
+        <w:t>Compliance:</w:t>
+      </w:r>
+      <w:r>
+        <w:t xml:space="preserve"> Updates: N/A | Security: N/A</w:t>
       </w:r>
     </w:p>
     <w:p>
@@ -2898,40 +2213,44 @@
         <w:rPr>
           <w:b/>
         </w:rPr>
-        <w:t>Operating System:</w:t>
-      </w:r>
-      <w:r>
-        <w:t xml:space="preserve"> iOS Latest</w:t>
+        <w:t>Notes:</w:t>
+      </w:r>
+      <w:r>
+        <w:t xml:space="preserve"> Bulk Import</w:t>
       </w:r>
     </w:p>
     <w:p>
       <w:pPr>
-        <w:pStyle w:val="ListBullet"/>
-      </w:pPr>
+        <w:pStyle w:val="Heading2"/>
+      </w:pPr>
+      <w:r>
+        <w:rPr>
+          <w:rFonts w:ascii="Arial" w:hAnsi="Arial"/>
+          <w:color w:val="1F497D"/>
+          <w:sz w:val="26"/>
+        </w:rPr>
+        <w:t>Room: Pre Kindy</w:t>
+      </w:r>
+    </w:p>
+    <w:p>
       <w:r/>
       <w:r>
         <w:rPr>
           <w:b/>
         </w:rPr>
-        <w:t>Photos/Media:</w:t>
-      </w:r>
-      <w:r>
-        <w:t xml:space="preserve"> 0 files found.</w:t>
-      </w:r>
-    </w:p>
-    <w:p>
-      <w:pPr>
-        <w:pStyle w:val="ListBullet"/>
-      </w:pPr>
-      <w:r/>
+        <w:t>Asset:</w:t>
+      </w:r>
+      <w:r>
+        <w:t xml:space="preserve"> Samsung  Galaxy Tab A SM-T510 | </w:t>
+      </w:r>
       <w:r>
         <w:rPr>
           <w:b/>
         </w:rPr>
-        <w:t>Cloud Sync:</w:t>
-      </w:r>
-      <w:r>
-        <w:t xml:space="preserve"> Camera Uploads: OFF | OneDrive: ON</w:t>
+        <w:t>SN:</w:t>
+      </w:r>
+      <w:r>
+        <w:t xml:space="preserve"> R52N813V92R</w:t>
       </w:r>
     </w:p>
     <w:p>
@@ -2943,32 +2262,10 @@
         <w:rPr>
           <w:b/>
         </w:rPr>
-        <w:t>Engineer Notes:</w:t>
-      </w:r>
-      <w:r>
-        <w:t xml:space="preserve"> REQUIRED ACTION: Locate / verify / privacy review</w:t>
-      </w:r>
-    </w:p>
-    <w:p>
-      <w:pPr>
-        <w:pStyle w:val="Heading2"/>
-      </w:pPr>
-      <w:r>
-        <w:rPr>
-          <w:rFonts w:ascii="Arial" w:hAnsi="Arial"/>
-          <w:color w:val="000000"/>
-          <w:sz w:val="28"/>
-        </w:rPr>
-        <w:t>Room: Toddlers Two</w:t>
-      </w:r>
-    </w:p>
-    <w:p>
-      <w:r>
-        <w:rPr>
-          <w:b/>
-          <w:sz w:val="22"/>
-        </w:rPr>
-        <w:t>**Asset:** Apple 9th Gen MK2K3X/A (SN: `LJ95R2P759`) | **Last Seen:** 2026-05-04</w:t>
+        <w:t>OS:</w:t>
+      </w:r>
+      <w:r>
+        <w:t xml:space="preserve"> iOS Latest</w:t>
       </w:r>
     </w:p>
     <w:p>
@@ -2980,10 +2277,10 @@
         <w:rPr>
           <w:b/>
         </w:rPr>
-        <w:t>Operating System:</w:t>
-      </w:r>
-      <w:r>
-        <w:t xml:space="preserve"> iOS yes</w:t>
+        <w:t>Media:</w:t>
+      </w:r>
+      <w:r>
+        <w:t xml:space="preserve"> 0 Photos | Date: N/A</w:t>
       </w:r>
     </w:p>
     <w:p>
@@ -2995,10 +2292,10 @@
         <w:rPr>
           <w:b/>
         </w:rPr>
-        <w:t>Photos/Media:</w:t>
-      </w:r>
-      <w:r>
-        <w:t xml:space="preserve"> 237 files found.</w:t>
+        <w:t>Sync:</w:t>
+      </w:r>
+      <w:r>
+        <w:t xml:space="preserve"> Camera Sync Off: Yes | OneDrive: Yes</w:t>
       </w:r>
     </w:p>
     <w:p>
@@ -3010,62 +2307,44 @@
         <w:rPr>
           <w:b/>
         </w:rPr>
-        <w:t>Cloud Sync:</w:t>
-      </w:r>
-      <w:r>
-        <w:t xml:space="preserve"> Camera Uploads: OFF | OneDrive: ON</w:t>
+        <w:t>Notes:</w:t>
+      </w:r>
+      <w:r>
+        <w:t xml:space="preserve"> Active</w:t>
       </w:r>
     </w:p>
     <w:p>
       <w:pPr>
-        <w:pStyle w:val="ListBullet"/>
-      </w:pPr>
+        <w:pStyle w:val="Heading2"/>
+      </w:pPr>
+      <w:r>
+        <w:rPr>
+          <w:rFonts w:ascii="Arial" w:hAnsi="Arial"/>
+          <w:color w:val="1F497D"/>
+          <w:sz w:val="26"/>
+        </w:rPr>
+        <w:t>Room: Pre Kindy</w:t>
+      </w:r>
+    </w:p>
+    <w:p>
       <w:r/>
       <w:r>
         <w:rPr>
           <w:b/>
         </w:rPr>
-        <w:t>Engineer Notes:</w:t>
-      </w:r>
-      <w:r>
-        <w:t xml:space="preserve"> Active / photo reduction required</w:t>
-      </w:r>
-    </w:p>
-    <w:p>
-      <w:pPr>
-        <w:pStyle w:val="Heading2"/>
-      </w:pPr>
-      <w:r>
-        <w:rPr>
-          <w:rFonts w:ascii="Arial" w:hAnsi="Arial"/>
-          <w:color w:val="000000"/>
-          <w:sz w:val="28"/>
-        </w:rPr>
-        <w:t>Room: Toddlers Two</w:t>
-      </w:r>
-    </w:p>
-    <w:p>
-      <w:r>
-        <w:rPr>
-          <w:b/>
-          <w:sz w:val="22"/>
-        </w:rPr>
-        <w:t>**Asset:** Dell Inspiron 14 5440 (SN: `1NWK494`) | **Last Seen:** 2026-05-04</w:t>
-      </w:r>
-    </w:p>
-    <w:p>
-      <w:pPr>
-        <w:pStyle w:val="ListBullet"/>
-      </w:pPr>
-      <w:r/>
+        <w:t>Asset:</w:t>
+      </w:r>
+      <w:r>
+        <w:t xml:space="preserve"> Apple 9th Gen MK2K3X/A | </w:t>
+      </w:r>
       <w:r>
         <w:rPr>
           <w:b/>
         </w:rPr>
-        <w:t>Operating System:</w:t>
-      </w:r>
-      <w:r>
-        <w:t xml:space="preserve"> Windows 11</w:t>
+        <w:t>SN:</w:t>
+      </w:r>
+      <w:r>
+        <w:t xml:space="preserve"> YH4VWHXJ2N</w:t>
       </w:r>
     </w:p>
     <w:p>
@@ -3077,10 +2356,10 @@
         <w:rPr>
           <w:b/>
         </w:rPr>
-        <w:t>Security Patching:</w:t>
-      </w:r>
-      <w:r>
-        <w:t xml:space="preserve"> Current</w:t>
+        <w:t>OS:</w:t>
+      </w:r>
+      <w:r>
+        <w:t xml:space="preserve"> iOS yes</w:t>
       </w:r>
     </w:p>
     <w:p>
@@ -3092,10 +2371,10 @@
         <w:rPr>
           <w:b/>
         </w:rPr>
-        <w:t>Antivirus/Defender:</w:t>
-      </w:r>
-      <w:r>
-        <w:t xml:space="preserve"> Passed</w:t>
+        <w:t>Media:</w:t>
+      </w:r>
+      <w:r>
+        <w:t xml:space="preserve"> 477 Photos | Date: 2026-04-01</w:t>
       </w:r>
     </w:p>
     <w:p>
@@ -3107,32 +2386,10 @@
         <w:rPr>
           <w:b/>
         </w:rPr>
-        <w:t>Engineer Notes:</w:t>
-      </w:r>
-      <w:r>
-        <w:t xml:space="preserve"> Active - Validated</w:t>
-      </w:r>
-    </w:p>
-    <w:p>
-      <w:pPr>
-        <w:pStyle w:val="Heading2"/>
-      </w:pPr>
-      <w:r>
-        <w:rPr>
-          <w:rFonts w:ascii="Arial" w:hAnsi="Arial"/>
-          <w:color w:val="000000"/>
-          <w:sz w:val="28"/>
-        </w:rPr>
-        <w:t>Room: Toddlers Two</w:t>
-      </w:r>
-    </w:p>
-    <w:p>
-      <w:r>
-        <w:rPr>
-          <w:b/>
-          <w:sz w:val="22"/>
-        </w:rPr>
-        <w:t>**Asset:** Samsung  Galaxy Tab A7 SM-T500 (SN: `R9TR70w88cr`) | **Last Seen:** 2026-05-04</w:t>
+        <w:t>Sync:</w:t>
+      </w:r>
+      <w:r>
+        <w:t xml:space="preserve"> Camera Sync Off: Yes | OneDrive: Yes</w:t>
       </w:r>
     </w:p>
     <w:p>
@@ -3144,40 +2401,44 @@
         <w:rPr>
           <w:b/>
         </w:rPr>
-        <w:t>Operating System:</w:t>
-      </w:r>
-      <w:r>
-        <w:t xml:space="preserve"> iOS Latest</w:t>
+        <w:t>Notes:</w:t>
+      </w:r>
+      <w:r>
+        <w:t xml:space="preserve"> Active / photo reduction required</w:t>
       </w:r>
     </w:p>
     <w:p>
       <w:pPr>
-        <w:pStyle w:val="ListBullet"/>
-      </w:pPr>
+        <w:pStyle w:val="Heading2"/>
+      </w:pPr>
+      <w:r>
+        <w:rPr>
+          <w:rFonts w:ascii="Arial" w:hAnsi="Arial"/>
+          <w:color w:val="1F497D"/>
+          <w:sz w:val="26"/>
+        </w:rPr>
+        <w:t>Room: Russell</w:t>
+      </w:r>
+    </w:p>
+    <w:p>
       <w:r/>
       <w:r>
         <w:rPr>
           <w:b/>
         </w:rPr>
-        <w:t>Photos/Media:</w:t>
-      </w:r>
-      <w:r>
-        <w:t xml:space="preserve"> 0 files found.</w:t>
-      </w:r>
-    </w:p>
-    <w:p>
-      <w:pPr>
-        <w:pStyle w:val="ListBullet"/>
-      </w:pPr>
-      <w:r/>
+        <w:t>Asset:</w:t>
+      </w:r>
+      <w:r>
+        <w:t xml:space="preserve"> Iphone 15 MTP03ZP/A | </w:t>
+      </w:r>
       <w:r>
         <w:rPr>
           <w:b/>
         </w:rPr>
-        <w:t>Cloud Sync:</w:t>
-      </w:r>
-      <w:r>
-        <w:t xml:space="preserve"> Camera Uploads: OFF | OneDrive: ON</w:t>
+        <w:t>SN:</w:t>
+      </w:r>
+      <w:r>
+        <w:t xml:space="preserve"> JD9JqDPX4L</w:t>
       </w:r>
     </w:p>
     <w:p>
@@ -3189,32 +2450,10 @@
         <w:rPr>
           <w:b/>
         </w:rPr>
-        <w:t>Engineer Notes:</w:t>
-      </w:r>
-      <w:r>
-        <w:t xml:space="preserve"> REQUIRED ACTION: Locate / verify</w:t>
-      </w:r>
-    </w:p>
-    <w:p>
-      <w:pPr>
-        <w:pStyle w:val="Heading2"/>
-      </w:pPr>
-      <w:r>
-        <w:rPr>
-          <w:rFonts w:ascii="Arial" w:hAnsi="Arial"/>
-          <w:color w:val="000000"/>
-          <w:sz w:val="28"/>
-        </w:rPr>
-        <w:t>Room: Xplor Reception Signin Two</w:t>
-      </w:r>
-    </w:p>
-    <w:p>
-      <w:r>
-        <w:rPr>
-          <w:b/>
-          <w:sz w:val="22"/>
-        </w:rPr>
-        <w:t>**Asset:** Apple 10th Gen MPQ03X/A (SN: `LY6CH9K1V7`) | **Last Seen:** 2026-05-04</w:t>
+        <w:t>OS:</w:t>
+      </w:r>
+      <w:r>
+        <w:t xml:space="preserve"> iOS Latest</w:t>
       </w:r>
     </w:p>
     <w:p>
@@ -3226,10 +2465,10 @@
         <w:rPr>
           <w:b/>
         </w:rPr>
-        <w:t>Operating System:</w:t>
-      </w:r>
-      <w:r>
-        <w:t xml:space="preserve"> iOS Latest</w:t>
+        <w:t>Media:</w:t>
+      </w:r>
+      <w:r>
+        <w:t xml:space="preserve"> 0 Photos | Date: N/A</w:t>
       </w:r>
     </w:p>
     <w:p>
@@ -3241,10 +2480,10 @@
         <w:rPr>
           <w:b/>
         </w:rPr>
-        <w:t>Photos/Media:</w:t>
-      </w:r>
-      <w:r>
-        <w:t xml:space="preserve"> 0 files found.</w:t>
+        <w:t>Sync:</w:t>
+      </w:r>
+      <w:r>
+        <w:t xml:space="preserve"> Camera Sync Off: Yes | OneDrive: Yes</w:t>
       </w:r>
     </w:p>
     <w:p>
@@ -3256,62 +2495,44 @@
         <w:rPr>
           <w:b/>
         </w:rPr>
-        <w:t>Cloud Sync:</w:t>
-      </w:r>
-      <w:r>
-        <w:t xml:space="preserve"> Camera Uploads: OFF | OneDrive: ON</w:t>
+        <w:t>Notes:</w:t>
+      </w:r>
+      <w:r>
+        <w:t xml:space="preserve"> REQUIRED ACTION: Locate / verify</w:t>
       </w:r>
     </w:p>
     <w:p>
       <w:pPr>
-        <w:pStyle w:val="ListBullet"/>
-      </w:pPr>
+        <w:pStyle w:val="Heading2"/>
+      </w:pPr>
+      <w:r>
+        <w:rPr>
+          <w:rFonts w:ascii="Arial" w:hAnsi="Arial"/>
+          <w:color w:val="1F497D"/>
+          <w:sz w:val="26"/>
+        </w:rPr>
+        <w:t>Room: Senior Kindy</w:t>
+      </w:r>
+    </w:p>
+    <w:p>
       <w:r/>
       <w:r>
         <w:rPr>
           <w:b/>
         </w:rPr>
-        <w:t>Engineer Notes:</w:t>
-      </w:r>
-      <w:r>
-        <w:t xml:space="preserve"> Active</w:t>
-      </w:r>
-    </w:p>
-    <w:p>
-      <w:pPr>
-        <w:pStyle w:val="Heading2"/>
-      </w:pPr>
-      <w:r>
-        <w:rPr>
-          <w:rFonts w:ascii="Arial" w:hAnsi="Arial"/>
-          <w:color w:val="000000"/>
-          <w:sz w:val="28"/>
-        </w:rPr>
-        <w:t>Room: Xplor Reception Signin one</w:t>
-      </w:r>
-    </w:p>
-    <w:p>
-      <w:r>
-        <w:rPr>
-          <w:b/>
-          <w:sz w:val="22"/>
-        </w:rPr>
-        <w:t>**Asset:** Apple 10th Gen MPQ03X/A (SN: `LVCPMG6H9J`) | **Last Seen:** 2026-05-04</w:t>
-      </w:r>
-    </w:p>
-    <w:p>
-      <w:pPr>
-        <w:pStyle w:val="ListBullet"/>
-      </w:pPr>
-      <w:r/>
+        <w:t>Asset:</w:t>
+      </w:r>
+      <w:r>
+        <w:t xml:space="preserve"> Samsung  Galaxy Tab A7 SM-T500 | </w:t>
+      </w:r>
       <w:r>
         <w:rPr>
           <w:b/>
         </w:rPr>
-        <w:t>Operating System:</w:t>
-      </w:r>
-      <w:r>
-        <w:t xml:space="preserve"> iOS Latest</w:t>
+        <w:t>SN:</w:t>
+      </w:r>
+      <w:r>
+        <w:t xml:space="preserve"> R9Tr70w8q1y</w:t>
       </w:r>
     </w:p>
     <w:p>
@@ -3323,10 +2544,10 @@
         <w:rPr>
           <w:b/>
         </w:rPr>
-        <w:t>Photos/Media:</w:t>
-      </w:r>
-      <w:r>
-        <w:t xml:space="preserve"> 0 files found.</w:t>
+        <w:t>OS:</w:t>
+      </w:r>
+      <w:r>
+        <w:t xml:space="preserve"> iOS Latest</w:t>
       </w:r>
     </w:p>
     <w:p>
@@ -3338,10 +2559,10 @@
         <w:rPr>
           <w:b/>
         </w:rPr>
-        <w:t>Cloud Sync:</w:t>
-      </w:r>
-      <w:r>
-        <w:t xml:space="preserve"> Camera Uploads: OFF | OneDrive: ON</w:t>
+        <w:t>Media:</w:t>
+      </w:r>
+      <w:r>
+        <w:t xml:space="preserve"> 0 Photos | Date: N/A</w:t>
       </w:r>
     </w:p>
     <w:p>
@@ -3353,32 +2574,10 @@
         <w:rPr>
           <w:b/>
         </w:rPr>
-        <w:t>Engineer Notes:</w:t>
-      </w:r>
-      <w:r>
-        <w:t xml:space="preserve"> Active</w:t>
-      </w:r>
-    </w:p>
-    <w:p>
-      <w:pPr>
-        <w:pStyle w:val="Heading2"/>
-      </w:pPr>
-      <w:r>
-        <w:rPr>
-          <w:rFonts w:ascii="Arial" w:hAnsi="Arial"/>
-          <w:color w:val="000000"/>
-          <w:sz w:val="28"/>
-        </w:rPr>
-        <w:t>Room: Xplor Signin OSHC</w:t>
-      </w:r>
-    </w:p>
-    <w:p>
-      <w:r>
-        <w:rPr>
-          <w:b/>
-          <w:sz w:val="22"/>
-        </w:rPr>
-        <w:t>**Asset:** Apple 9th Gen MK2K3X/A (SN: `MW454V2HDH`) | **Last Seen:** 2026-05-04</w:t>
+        <w:t>Sync:</w:t>
+      </w:r>
+      <w:r>
+        <w:t xml:space="preserve"> Camera Sync Off: Yes | OneDrive: Yes</w:t>
       </w:r>
     </w:p>
     <w:p>
@@ -3390,40 +2589,44 @@
         <w:rPr>
           <w:b/>
         </w:rPr>
-        <w:t>Operating System:</w:t>
-      </w:r>
-      <w:r>
-        <w:t xml:space="preserve"> iOS Latest</w:t>
+        <w:t>Notes:</w:t>
+      </w:r>
+      <w:r>
+        <w:t xml:space="preserve"> Active</w:t>
       </w:r>
     </w:p>
     <w:p>
       <w:pPr>
-        <w:pStyle w:val="ListBullet"/>
-      </w:pPr>
+        <w:pStyle w:val="Heading2"/>
+      </w:pPr>
+      <w:r>
+        <w:rPr>
+          <w:rFonts w:ascii="Arial" w:hAnsi="Arial"/>
+          <w:color w:val="1F497D"/>
+          <w:sz w:val="26"/>
+        </w:rPr>
+        <w:t>Room: Senior Kindy</w:t>
+      </w:r>
+    </w:p>
+    <w:p>
       <w:r/>
       <w:r>
         <w:rPr>
           <w:b/>
         </w:rPr>
-        <w:t>Photos/Media:</w:t>
-      </w:r>
-      <w:r>
-        <w:t xml:space="preserve"> 0 files found.</w:t>
-      </w:r>
-    </w:p>
-    <w:p>
-      <w:pPr>
-        <w:pStyle w:val="ListBullet"/>
-      </w:pPr>
-      <w:r/>
+        <w:t>Asset:</w:t>
+      </w:r>
+      <w:r>
+        <w:t xml:space="preserve"> Apple 9th Gen MK2K3X/A | </w:t>
+      </w:r>
       <w:r>
         <w:rPr>
           <w:b/>
         </w:rPr>
-        <w:t>Cloud Sync:</w:t>
-      </w:r>
-      <w:r>
-        <w:t xml:space="preserve"> Camera Uploads: OFF | OneDrive: ON</w:t>
+        <w:t>SN:</w:t>
+      </w:r>
+      <w:r>
+        <w:t xml:space="preserve"> W5VJ6EJF4M</w:t>
       </w:r>
     </w:p>
     <w:p>
@@ -3435,7 +2638,1026 @@
         <w:rPr>
           <w:b/>
         </w:rPr>
-        <w:t>Engineer Notes:</w:t>
+        <w:t>OS:</w:t>
+      </w:r>
+      <w:r>
+        <w:t xml:space="preserve"> iOS yes</w:t>
+      </w:r>
+    </w:p>
+    <w:p>
+      <w:pPr>
+        <w:pStyle w:val="ListBullet"/>
+      </w:pPr>
+      <w:r/>
+      <w:r>
+        <w:rPr>
+          <w:b/>
+        </w:rPr>
+        <w:t>Media:</w:t>
+      </w:r>
+      <w:r>
+        <w:t xml:space="preserve"> 872 Photos | Date: 2026-04-01</w:t>
+      </w:r>
+    </w:p>
+    <w:p>
+      <w:pPr>
+        <w:pStyle w:val="ListBullet"/>
+      </w:pPr>
+      <w:r/>
+      <w:r>
+        <w:rPr>
+          <w:b/>
+        </w:rPr>
+        <w:t>Sync:</w:t>
+      </w:r>
+      <w:r>
+        <w:t xml:space="preserve"> Camera Sync Off: Yes | OneDrive: No</w:t>
+      </w:r>
+    </w:p>
+    <w:p>
+      <w:pPr>
+        <w:pStyle w:val="ListBullet"/>
+      </w:pPr>
+      <w:r/>
+      <w:r>
+        <w:rPr>
+          <w:b/>
+        </w:rPr>
+        <w:t>Notes:</w:t>
+      </w:r>
+      <w:r>
+        <w:t xml:space="preserve"> Active / remediation required - password fail</w:t>
+      </w:r>
+    </w:p>
+    <w:p>
+      <w:pPr>
+        <w:pStyle w:val="Heading2"/>
+      </w:pPr>
+      <w:r>
+        <w:rPr>
+          <w:rFonts w:ascii="Arial" w:hAnsi="Arial"/>
+          <w:color w:val="1F497D"/>
+          <w:sz w:val="26"/>
+        </w:rPr>
+        <w:t>Room: Senior Kindy</w:t>
+      </w:r>
+    </w:p>
+    <w:p>
+      <w:r/>
+      <w:r>
+        <w:rPr>
+          <w:b/>
+        </w:rPr>
+        <w:t>Asset:</w:t>
+      </w:r>
+      <w:r>
+        <w:t xml:space="preserve"> HP 15-FD0xxx | </w:t>
+      </w:r>
+      <w:r>
+        <w:rPr>
+          <w:b/>
+        </w:rPr>
+        <w:t>SN:</w:t>
+      </w:r>
+      <w:r>
+        <w:t xml:space="preserve"> B69K9PA#ABG</w:t>
+      </w:r>
+    </w:p>
+    <w:p>
+      <w:pPr>
+        <w:pStyle w:val="ListBullet"/>
+      </w:pPr>
+      <w:r/>
+      <w:r>
+        <w:rPr>
+          <w:b/>
+        </w:rPr>
+        <w:t>OS:</w:t>
+      </w:r>
+      <w:r>
+        <w:t xml:space="preserve"> Windows 11</w:t>
+      </w:r>
+    </w:p>
+    <w:p>
+      <w:pPr>
+        <w:pStyle w:val="ListBullet"/>
+      </w:pPr>
+      <w:r/>
+      <w:r>
+        <w:rPr>
+          <w:b/>
+        </w:rPr>
+        <w:t>Compliance:</w:t>
+      </w:r>
+      <w:r>
+        <w:t xml:space="preserve"> Updates: N/A | Security: Passed</w:t>
+      </w:r>
+    </w:p>
+    <w:p>
+      <w:pPr>
+        <w:pStyle w:val="ListBullet"/>
+      </w:pPr>
+      <w:r/>
+      <w:r>
+        <w:rPr>
+          <w:b/>
+        </w:rPr>
+        <w:t>Notes:</w:t>
+      </w:r>
+      <w:r>
+        <w:t xml:space="preserve"> Active - Validated</w:t>
+      </w:r>
+    </w:p>
+    <w:p>
+      <w:pPr>
+        <w:pStyle w:val="Heading2"/>
+      </w:pPr>
+      <w:r>
+        <w:rPr>
+          <w:rFonts w:ascii="Arial" w:hAnsi="Arial"/>
+          <w:color w:val="1F497D"/>
+          <w:sz w:val="26"/>
+        </w:rPr>
+        <w:t>Room: Simona</w:t>
+      </w:r>
+    </w:p>
+    <w:p>
+      <w:r/>
+      <w:r>
+        <w:rPr>
+          <w:b/>
+        </w:rPr>
+        <w:t>Asset:</w:t>
+      </w:r>
+      <w:r>
+        <w:t xml:space="preserve"> Iphone 14 Pro Max | </w:t>
+      </w:r>
+      <w:r>
+        <w:rPr>
+          <w:b/>
+        </w:rPr>
+        <w:t>SN:</w:t>
+      </w:r>
+      <w:r>
+        <w:t xml:space="preserve"> DDP2QXF6H9</w:t>
+      </w:r>
+    </w:p>
+    <w:p>
+      <w:pPr>
+        <w:pStyle w:val="ListBullet"/>
+      </w:pPr>
+      <w:r/>
+      <w:r>
+        <w:rPr>
+          <w:b/>
+        </w:rPr>
+        <w:t>OS:</w:t>
+      </w:r>
+      <w:r>
+        <w:t xml:space="preserve"> iOS Latest</w:t>
+      </w:r>
+    </w:p>
+    <w:p>
+      <w:pPr>
+        <w:pStyle w:val="ListBullet"/>
+      </w:pPr>
+      <w:r/>
+      <w:r>
+        <w:rPr>
+          <w:b/>
+        </w:rPr>
+        <w:t>Media:</w:t>
+      </w:r>
+      <w:r>
+        <w:t xml:space="preserve"> 0 Photos | Date: N/A</w:t>
+      </w:r>
+    </w:p>
+    <w:p>
+      <w:pPr>
+        <w:pStyle w:val="ListBullet"/>
+      </w:pPr>
+      <w:r/>
+      <w:r>
+        <w:rPr>
+          <w:b/>
+        </w:rPr>
+        <w:t>Sync:</w:t>
+      </w:r>
+      <w:r>
+        <w:t xml:space="preserve"> Camera Sync Off: Yes | OneDrive: Yes</w:t>
+      </w:r>
+    </w:p>
+    <w:p>
+      <w:pPr>
+        <w:pStyle w:val="ListBullet"/>
+      </w:pPr>
+      <w:r/>
+      <w:r>
+        <w:rPr>
+          <w:b/>
+        </w:rPr>
+        <w:t>Notes:</w:t>
+      </w:r>
+      <w:r>
+        <w:t xml:space="preserve"> REQUIRED ACTION: Locate / verify</w:t>
+      </w:r>
+    </w:p>
+    <w:p>
+      <w:pPr>
+        <w:pStyle w:val="Heading2"/>
+      </w:pPr>
+      <w:r>
+        <w:rPr>
+          <w:rFonts w:ascii="Arial" w:hAnsi="Arial"/>
+          <w:color w:val="1F497D"/>
+          <w:sz w:val="26"/>
+        </w:rPr>
+        <w:t>Room: Simona</w:t>
+      </w:r>
+    </w:p>
+    <w:p>
+      <w:r/>
+      <w:r>
+        <w:rPr>
+          <w:b/>
+        </w:rPr>
+        <w:t>Asset:</w:t>
+      </w:r>
+      <w:r>
+        <w:t xml:space="preserve"> Dell Inspiron 16 7640 2 in 1 | </w:t>
+      </w:r>
+      <w:r>
+        <w:rPr>
+          <w:b/>
+        </w:rPr>
+        <w:t>SN:</w:t>
+      </w:r>
+      <w:r>
+        <w:t xml:space="preserve"> JHWW444</w:t>
+      </w:r>
+    </w:p>
+    <w:p>
+      <w:pPr>
+        <w:pStyle w:val="ListBullet"/>
+      </w:pPr>
+      <w:r/>
+      <w:r>
+        <w:rPr>
+          <w:b/>
+        </w:rPr>
+        <w:t>OS:</w:t>
+      </w:r>
+      <w:r>
+        <w:t xml:space="preserve"> Windows 11</w:t>
+      </w:r>
+    </w:p>
+    <w:p>
+      <w:pPr>
+        <w:pStyle w:val="ListBullet"/>
+      </w:pPr>
+      <w:r/>
+      <w:r>
+        <w:rPr>
+          <w:b/>
+        </w:rPr>
+        <w:t>Compliance:</w:t>
+      </w:r>
+      <w:r>
+        <w:t xml:space="preserve"> Updates: N/A | Security: Passed</w:t>
+      </w:r>
+    </w:p>
+    <w:p>
+      <w:pPr>
+        <w:pStyle w:val="ListBullet"/>
+      </w:pPr>
+      <w:r/>
+      <w:r>
+        <w:rPr>
+          <w:b/>
+        </w:rPr>
+        <w:t>Notes:</w:t>
+      </w:r>
+      <w:r>
+        <w:t xml:space="preserve"> Active - Validated</w:t>
+      </w:r>
+    </w:p>
+    <w:p>
+      <w:pPr>
+        <w:pStyle w:val="Heading2"/>
+      </w:pPr>
+      <w:r>
+        <w:rPr>
+          <w:rFonts w:ascii="Arial" w:hAnsi="Arial"/>
+          <w:color w:val="1F497D"/>
+          <w:sz w:val="26"/>
+        </w:rPr>
+        <w:t>Room: Toddlers One</w:t>
+      </w:r>
+    </w:p>
+    <w:p>
+      <w:r/>
+      <w:r>
+        <w:rPr>
+          <w:b/>
+        </w:rPr>
+        <w:t>Asset:</w:t>
+      </w:r>
+      <w:r>
+        <w:t xml:space="preserve"> Apple 9th Gen MK2K3X/A | </w:t>
+      </w:r>
+      <w:r>
+        <w:rPr>
+          <w:b/>
+        </w:rPr>
+        <w:t>SN:</w:t>
+      </w:r>
+      <w:r>
+        <w:t xml:space="preserve"> GV3XHHC4CH</w:t>
+      </w:r>
+    </w:p>
+    <w:p>
+      <w:pPr>
+        <w:pStyle w:val="ListBullet"/>
+      </w:pPr>
+      <w:r/>
+      <w:r>
+        <w:rPr>
+          <w:b/>
+        </w:rPr>
+        <w:t>OS:</w:t>
+      </w:r>
+      <w:r>
+        <w:t xml:space="preserve"> iOS Latest</w:t>
+      </w:r>
+    </w:p>
+    <w:p>
+      <w:pPr>
+        <w:pStyle w:val="ListBullet"/>
+      </w:pPr>
+      <w:r/>
+      <w:r>
+        <w:rPr>
+          <w:b/>
+        </w:rPr>
+        <w:t>Media:</w:t>
+      </w:r>
+      <w:r>
+        <w:t xml:space="preserve"> 0 Photos | Date: N/A</w:t>
+      </w:r>
+    </w:p>
+    <w:p>
+      <w:pPr>
+        <w:pStyle w:val="ListBullet"/>
+      </w:pPr>
+      <w:r/>
+      <w:r>
+        <w:rPr>
+          <w:b/>
+        </w:rPr>
+        <w:t>Sync:</w:t>
+      </w:r>
+      <w:r>
+        <w:t xml:space="preserve"> Camera Sync Off: Yes | OneDrive: Yes</w:t>
+      </w:r>
+    </w:p>
+    <w:p>
+      <w:pPr>
+        <w:pStyle w:val="ListBullet"/>
+      </w:pPr>
+      <w:r/>
+      <w:r>
+        <w:rPr>
+          <w:b/>
+        </w:rPr>
+        <w:t>Notes:</w:t>
+      </w:r>
+      <w:r>
+        <w:t xml:space="preserve"> REQUIRED ACTION: Locate / verify / privacy review</w:t>
+      </w:r>
+    </w:p>
+    <w:p>
+      <w:pPr>
+        <w:pStyle w:val="Heading2"/>
+      </w:pPr>
+      <w:r>
+        <w:rPr>
+          <w:rFonts w:ascii="Arial" w:hAnsi="Arial"/>
+          <w:color w:val="1F497D"/>
+          <w:sz w:val="26"/>
+        </w:rPr>
+        <w:t>Room: Toddlers One</w:t>
+      </w:r>
+    </w:p>
+    <w:p>
+      <w:r/>
+      <w:r>
+        <w:rPr>
+          <w:b/>
+        </w:rPr>
+        <w:t>Asset:</w:t>
+      </w:r>
+      <w:r>
+        <w:t xml:space="preserve"> Acer Aspire AL15-51M | </w:t>
+      </w:r>
+      <w:r>
+        <w:rPr>
+          <w:b/>
+        </w:rPr>
+        <w:t>SN:</w:t>
+      </w:r>
+      <w:r>
+        <w:t xml:space="preserve"> NXXRSSA00134300fb50x15</w:t>
+      </w:r>
+    </w:p>
+    <w:p>
+      <w:pPr>
+        <w:pStyle w:val="ListBullet"/>
+      </w:pPr>
+      <w:r/>
+      <w:r>
+        <w:rPr>
+          <w:b/>
+        </w:rPr>
+        <w:t>OS:</w:t>
+      </w:r>
+      <w:r>
+        <w:t xml:space="preserve"> Windows 11</w:t>
+      </w:r>
+    </w:p>
+    <w:p>
+      <w:pPr>
+        <w:pStyle w:val="ListBullet"/>
+      </w:pPr>
+      <w:r/>
+      <w:r>
+        <w:rPr>
+          <w:b/>
+        </w:rPr>
+        <w:t>Compliance:</w:t>
+      </w:r>
+      <w:r>
+        <w:t xml:space="preserve"> Updates: N/A | Security: Passed</w:t>
+      </w:r>
+    </w:p>
+    <w:p>
+      <w:pPr>
+        <w:pStyle w:val="ListBullet"/>
+      </w:pPr>
+      <w:r/>
+      <w:r>
+        <w:rPr>
+          <w:b/>
+        </w:rPr>
+        <w:t>Notes:</w:t>
+      </w:r>
+      <w:r>
+        <w:t xml:space="preserve"> Active - Validated</w:t>
+      </w:r>
+    </w:p>
+    <w:p>
+      <w:pPr>
+        <w:pStyle w:val="Heading2"/>
+      </w:pPr>
+      <w:r>
+        <w:rPr>
+          <w:rFonts w:ascii="Arial" w:hAnsi="Arial"/>
+          <w:color w:val="1F497D"/>
+          <w:sz w:val="26"/>
+        </w:rPr>
+        <w:t>Room: Toddlers Two</w:t>
+      </w:r>
+    </w:p>
+    <w:p>
+      <w:r/>
+      <w:r>
+        <w:rPr>
+          <w:b/>
+        </w:rPr>
+        <w:t>Asset:</w:t>
+      </w:r>
+      <w:r>
+        <w:t xml:space="preserve"> Samsung  Galaxy Tab A7 SM-T500 | </w:t>
+      </w:r>
+      <w:r>
+        <w:rPr>
+          <w:b/>
+        </w:rPr>
+        <w:t>SN:</w:t>
+      </w:r>
+      <w:r>
+        <w:t xml:space="preserve"> R9TR70w88cr</w:t>
+      </w:r>
+    </w:p>
+    <w:p>
+      <w:pPr>
+        <w:pStyle w:val="ListBullet"/>
+      </w:pPr>
+      <w:r/>
+      <w:r>
+        <w:rPr>
+          <w:b/>
+        </w:rPr>
+        <w:t>OS:</w:t>
+      </w:r>
+      <w:r>
+        <w:t xml:space="preserve"> iOS Latest</w:t>
+      </w:r>
+    </w:p>
+    <w:p>
+      <w:pPr>
+        <w:pStyle w:val="ListBullet"/>
+      </w:pPr>
+      <w:r/>
+      <w:r>
+        <w:rPr>
+          <w:b/>
+        </w:rPr>
+        <w:t>Media:</w:t>
+      </w:r>
+      <w:r>
+        <w:t xml:space="preserve"> 0 Photos | Date: N/A</w:t>
+      </w:r>
+    </w:p>
+    <w:p>
+      <w:pPr>
+        <w:pStyle w:val="ListBullet"/>
+      </w:pPr>
+      <w:r/>
+      <w:r>
+        <w:rPr>
+          <w:b/>
+        </w:rPr>
+        <w:t>Sync:</w:t>
+      </w:r>
+      <w:r>
+        <w:t xml:space="preserve"> Camera Sync Off: Yes | OneDrive: Yes</w:t>
+      </w:r>
+    </w:p>
+    <w:p>
+      <w:pPr>
+        <w:pStyle w:val="ListBullet"/>
+      </w:pPr>
+      <w:r/>
+      <w:r>
+        <w:rPr>
+          <w:b/>
+        </w:rPr>
+        <w:t>Notes:</w:t>
+      </w:r>
+      <w:r>
+        <w:t xml:space="preserve"> REQUIRED ACTION: Locate / verify</w:t>
+      </w:r>
+    </w:p>
+    <w:p>
+      <w:pPr>
+        <w:pStyle w:val="Heading2"/>
+      </w:pPr>
+      <w:r>
+        <w:rPr>
+          <w:rFonts w:ascii="Arial" w:hAnsi="Arial"/>
+          <w:color w:val="1F497D"/>
+          <w:sz w:val="26"/>
+        </w:rPr>
+        <w:t>Room: Toddlers Two</w:t>
+      </w:r>
+    </w:p>
+    <w:p>
+      <w:r/>
+      <w:r>
+        <w:rPr>
+          <w:b/>
+        </w:rPr>
+        <w:t>Asset:</w:t>
+      </w:r>
+      <w:r>
+        <w:t xml:space="preserve"> Apple 9th Gen MK2K3X/A | </w:t>
+      </w:r>
+      <w:r>
+        <w:rPr>
+          <w:b/>
+        </w:rPr>
+        <w:t>SN:</w:t>
+      </w:r>
+      <w:r>
+        <w:t xml:space="preserve"> LJ95R2P759</w:t>
+      </w:r>
+    </w:p>
+    <w:p>
+      <w:pPr>
+        <w:pStyle w:val="ListBullet"/>
+      </w:pPr>
+      <w:r/>
+      <w:r>
+        <w:rPr>
+          <w:b/>
+        </w:rPr>
+        <w:t>OS:</w:t>
+      </w:r>
+      <w:r>
+        <w:t xml:space="preserve"> iOS yes</w:t>
+      </w:r>
+    </w:p>
+    <w:p>
+      <w:pPr>
+        <w:pStyle w:val="ListBullet"/>
+      </w:pPr>
+      <w:r/>
+      <w:r>
+        <w:rPr>
+          <w:b/>
+        </w:rPr>
+        <w:t>Media:</w:t>
+      </w:r>
+      <w:r>
+        <w:t xml:space="preserve"> 237 Photos | Date: 2026-04-01</w:t>
+      </w:r>
+    </w:p>
+    <w:p>
+      <w:pPr>
+        <w:pStyle w:val="ListBullet"/>
+      </w:pPr>
+      <w:r/>
+      <w:r>
+        <w:rPr>
+          <w:b/>
+        </w:rPr>
+        <w:t>Sync:</w:t>
+      </w:r>
+      <w:r>
+        <w:t xml:space="preserve"> Camera Sync Off: Yes | OneDrive: Yes</w:t>
+      </w:r>
+    </w:p>
+    <w:p>
+      <w:pPr>
+        <w:pStyle w:val="ListBullet"/>
+      </w:pPr>
+      <w:r/>
+      <w:r>
+        <w:rPr>
+          <w:b/>
+        </w:rPr>
+        <w:t>Notes:</w:t>
+      </w:r>
+      <w:r>
+        <w:t xml:space="preserve"> Active / photo reduction required</w:t>
+      </w:r>
+    </w:p>
+    <w:p>
+      <w:pPr>
+        <w:pStyle w:val="Heading2"/>
+      </w:pPr>
+      <w:r>
+        <w:rPr>
+          <w:rFonts w:ascii="Arial" w:hAnsi="Arial"/>
+          <w:color w:val="1F497D"/>
+          <w:sz w:val="26"/>
+        </w:rPr>
+        <w:t>Room: Toddlers Two</w:t>
+      </w:r>
+    </w:p>
+    <w:p>
+      <w:r/>
+      <w:r>
+        <w:rPr>
+          <w:b/>
+        </w:rPr>
+        <w:t>Asset:</w:t>
+      </w:r>
+      <w:r>
+        <w:t xml:space="preserve"> Dell Inspiron 14 5440 | </w:t>
+      </w:r>
+      <w:r>
+        <w:rPr>
+          <w:b/>
+        </w:rPr>
+        <w:t>SN:</w:t>
+      </w:r>
+      <w:r>
+        <w:t xml:space="preserve"> 1NWK494</w:t>
+      </w:r>
+    </w:p>
+    <w:p>
+      <w:pPr>
+        <w:pStyle w:val="ListBullet"/>
+      </w:pPr>
+      <w:r/>
+      <w:r>
+        <w:rPr>
+          <w:b/>
+        </w:rPr>
+        <w:t>OS:</w:t>
+      </w:r>
+      <w:r>
+        <w:t xml:space="preserve"> Windows 11</w:t>
+      </w:r>
+    </w:p>
+    <w:p>
+      <w:pPr>
+        <w:pStyle w:val="ListBullet"/>
+      </w:pPr>
+      <w:r/>
+      <w:r>
+        <w:rPr>
+          <w:b/>
+        </w:rPr>
+        <w:t>Compliance:</w:t>
+      </w:r>
+      <w:r>
+        <w:t xml:space="preserve"> Updates: N/A | Security: Passed</w:t>
+      </w:r>
+    </w:p>
+    <w:p>
+      <w:pPr>
+        <w:pStyle w:val="ListBullet"/>
+      </w:pPr>
+      <w:r/>
+      <w:r>
+        <w:rPr>
+          <w:b/>
+        </w:rPr>
+        <w:t>Notes:</w:t>
+      </w:r>
+      <w:r>
+        <w:t xml:space="preserve"> Active - Validated</w:t>
+      </w:r>
+    </w:p>
+    <w:p>
+      <w:pPr>
+        <w:pStyle w:val="Heading2"/>
+      </w:pPr>
+      <w:r>
+        <w:rPr>
+          <w:rFonts w:ascii="Arial" w:hAnsi="Arial"/>
+          <w:color w:val="1F497D"/>
+          <w:sz w:val="26"/>
+        </w:rPr>
+        <w:t>Room: Xplor Reception Signin one</w:t>
+      </w:r>
+    </w:p>
+    <w:p>
+      <w:r/>
+      <w:r>
+        <w:rPr>
+          <w:b/>
+        </w:rPr>
+        <w:t>Asset:</w:t>
+      </w:r>
+      <w:r>
+        <w:t xml:space="preserve"> Apple 10th Gen MPQ03X/A | </w:t>
+      </w:r>
+      <w:r>
+        <w:rPr>
+          <w:b/>
+        </w:rPr>
+        <w:t>SN:</w:t>
+      </w:r>
+      <w:r>
+        <w:t xml:space="preserve"> LVCPMG6H9J</w:t>
+      </w:r>
+    </w:p>
+    <w:p>
+      <w:pPr>
+        <w:pStyle w:val="ListBullet"/>
+      </w:pPr>
+      <w:r/>
+      <w:r>
+        <w:rPr>
+          <w:b/>
+        </w:rPr>
+        <w:t>OS:</w:t>
+      </w:r>
+      <w:r>
+        <w:t xml:space="preserve"> iOS Latest</w:t>
+      </w:r>
+    </w:p>
+    <w:p>
+      <w:pPr>
+        <w:pStyle w:val="ListBullet"/>
+      </w:pPr>
+      <w:r/>
+      <w:r>
+        <w:rPr>
+          <w:b/>
+        </w:rPr>
+        <w:t>Media:</w:t>
+      </w:r>
+      <w:r>
+        <w:t xml:space="preserve"> 0 Photos | Date: N/A</w:t>
+      </w:r>
+    </w:p>
+    <w:p>
+      <w:pPr>
+        <w:pStyle w:val="ListBullet"/>
+      </w:pPr>
+      <w:r/>
+      <w:r>
+        <w:rPr>
+          <w:b/>
+        </w:rPr>
+        <w:t>Sync:</w:t>
+      </w:r>
+      <w:r>
+        <w:t xml:space="preserve"> Camera Sync Off: Yes | OneDrive: Yes</w:t>
+      </w:r>
+    </w:p>
+    <w:p>
+      <w:pPr>
+        <w:pStyle w:val="ListBullet"/>
+      </w:pPr>
+      <w:r/>
+      <w:r>
+        <w:rPr>
+          <w:b/>
+        </w:rPr>
+        <w:t>Notes:</w:t>
+      </w:r>
+      <w:r>
+        <w:t xml:space="preserve"> Active</w:t>
+      </w:r>
+    </w:p>
+    <w:p>
+      <w:pPr>
+        <w:pStyle w:val="Heading2"/>
+      </w:pPr>
+      <w:r>
+        <w:rPr>
+          <w:rFonts w:ascii="Arial" w:hAnsi="Arial"/>
+          <w:color w:val="1F497D"/>
+          <w:sz w:val="26"/>
+        </w:rPr>
+        <w:t>Room: Xplor Reception Signin Two</w:t>
+      </w:r>
+    </w:p>
+    <w:p>
+      <w:r/>
+      <w:r>
+        <w:rPr>
+          <w:b/>
+        </w:rPr>
+        <w:t>Asset:</w:t>
+      </w:r>
+      <w:r>
+        <w:t xml:space="preserve"> Apple 10th Gen MPQ03X/A | </w:t>
+      </w:r>
+      <w:r>
+        <w:rPr>
+          <w:b/>
+        </w:rPr>
+        <w:t>SN:</w:t>
+      </w:r>
+      <w:r>
+        <w:t xml:space="preserve"> LY6CH9K1V7</w:t>
+      </w:r>
+    </w:p>
+    <w:p>
+      <w:pPr>
+        <w:pStyle w:val="ListBullet"/>
+      </w:pPr>
+      <w:r/>
+      <w:r>
+        <w:rPr>
+          <w:b/>
+        </w:rPr>
+        <w:t>OS:</w:t>
+      </w:r>
+      <w:r>
+        <w:t xml:space="preserve"> iOS Latest</w:t>
+      </w:r>
+    </w:p>
+    <w:p>
+      <w:pPr>
+        <w:pStyle w:val="ListBullet"/>
+      </w:pPr>
+      <w:r/>
+      <w:r>
+        <w:rPr>
+          <w:b/>
+        </w:rPr>
+        <w:t>Media:</w:t>
+      </w:r>
+      <w:r>
+        <w:t xml:space="preserve"> 0 Photos | Date: N/A</w:t>
+      </w:r>
+    </w:p>
+    <w:p>
+      <w:pPr>
+        <w:pStyle w:val="ListBullet"/>
+      </w:pPr>
+      <w:r/>
+      <w:r>
+        <w:rPr>
+          <w:b/>
+        </w:rPr>
+        <w:t>Sync:</w:t>
+      </w:r>
+      <w:r>
+        <w:t xml:space="preserve"> Camera Sync Off: Yes | OneDrive: Yes</w:t>
+      </w:r>
+    </w:p>
+    <w:p>
+      <w:pPr>
+        <w:pStyle w:val="ListBullet"/>
+      </w:pPr>
+      <w:r/>
+      <w:r>
+        <w:rPr>
+          <w:b/>
+        </w:rPr>
+        <w:t>Notes:</w:t>
+      </w:r>
+      <w:r>
+        <w:t xml:space="preserve"> Active</w:t>
+      </w:r>
+    </w:p>
+    <w:p>
+      <w:pPr>
+        <w:pStyle w:val="Heading2"/>
+      </w:pPr>
+      <w:r>
+        <w:rPr>
+          <w:rFonts w:ascii="Arial" w:hAnsi="Arial"/>
+          <w:color w:val="1F497D"/>
+          <w:sz w:val="26"/>
+        </w:rPr>
+        <w:t>Room: Xplor Signin OSHC</w:t>
+      </w:r>
+    </w:p>
+    <w:p>
+      <w:r/>
+      <w:r>
+        <w:rPr>
+          <w:b/>
+        </w:rPr>
+        <w:t>Asset:</w:t>
+      </w:r>
+      <w:r>
+        <w:t xml:space="preserve"> Apple 9th Gen MK2K3X/A | </w:t>
+      </w:r>
+      <w:r>
+        <w:rPr>
+          <w:b/>
+        </w:rPr>
+        <w:t>SN:</w:t>
+      </w:r>
+      <w:r>
+        <w:t xml:space="preserve"> MW454V2HDH</w:t>
+      </w:r>
+    </w:p>
+    <w:p>
+      <w:pPr>
+        <w:pStyle w:val="ListBullet"/>
+      </w:pPr>
+      <w:r/>
+      <w:r>
+        <w:rPr>
+          <w:b/>
+        </w:rPr>
+        <w:t>OS:</w:t>
+      </w:r>
+      <w:r>
+        <w:t xml:space="preserve"> iOS Latest</w:t>
+      </w:r>
+    </w:p>
+    <w:p>
+      <w:pPr>
+        <w:pStyle w:val="ListBullet"/>
+      </w:pPr>
+      <w:r/>
+      <w:r>
+        <w:rPr>
+          <w:b/>
+        </w:rPr>
+        <w:t>Media:</w:t>
+      </w:r>
+      <w:r>
+        <w:t xml:space="preserve"> 0 Photos | Date: N/A</w:t>
+      </w:r>
+    </w:p>
+    <w:p>
+      <w:pPr>
+        <w:pStyle w:val="ListBullet"/>
+      </w:pPr>
+      <w:r/>
+      <w:r>
+        <w:rPr>
+          <w:b/>
+        </w:rPr>
+        <w:t>Sync:</w:t>
+      </w:r>
+      <w:r>
+        <w:t xml:space="preserve"> Camera Sync Off: Yes | OneDrive: Yes</w:t>
+      </w:r>
+    </w:p>
+    <w:p>
+      <w:pPr>
+        <w:pStyle w:val="ListBullet"/>
+      </w:pPr>
+      <w:r/>
+      <w:r>
+        <w:rPr>
+          <w:b/>
+        </w:rPr>
+        <w:t>Notes:</w:t>
       </w:r>
       <w:r>
         <w:t xml:space="preserve"> REQUIRED ACTION: Locate / verify / disable access</w:t>

</xml_diff>